<commit_message>
docs: make the training deck a practical club user orientation
</commit_message>
<xml_diff>
--- a/docs/platform-documentation/2026-10-21/exports/06-presenter-notes.docx
+++ b/docs/platform-documentation/2026-10-21/exports/06-presenter-notes.docx
@@ -2,22 +2,93 @@
 <file path=word/document.xml><?xml version="1.0" encoding="utf-8"?>
 <w:document xmlns:w="http://schemas.openxmlformats.org/wordprocessingml/2006/main" xmlns:m="http://schemas.openxmlformats.org/officeDocument/2006/math" xmlns:r="http://schemas.openxmlformats.org/officeDocument/2006/relationships" xmlns:o="urn:schemas-microsoft-com:office:office" xmlns:v="urn:schemas-microsoft-com:vml" xmlns:w10="urn:schemas-microsoft-com:office:word" xmlns:a="http://schemas.openxmlformats.org/drawingml/2006/main" xmlns:pic="http://schemas.openxmlformats.org/drawingml/2006/picture" xmlns:wp="http://schemas.openxmlformats.org/drawingml/2006/wordprocessingDrawing">
   <w:body>
-    <w:bookmarkStart w:id="97" w:name="X3437c8a7942596daaf1e81da2ecb4142391c5fb"/>
+    <w:bookmarkStart w:id="184" w:name="Xec765d8cd0da211558871b56b9f4375375340dd"/>
     <w:p>
       <w:pPr>
         <w:pStyle w:val="Heading1"/>
       </w:pPr>
       <w:r>
-        <w:t xml:space="preserve">IMSDA Events platform briefing — presenter notes</w:t>
-      </w:r>
-    </w:p>
-    <w:bookmarkStart w:id="21" w:name="X0182afc3fc0157b0291a0e000d9c3803209e151"/>
+        <w:t xml:space="preserve">IMSDA Events: getting started — presenter notes</w:t>
+      </w:r>
+    </w:p>
+    <w:p>
+      <w:pPr>
+        <w:pStyle w:val="FirstParagraph"/>
+      </w:pPr>
+      <w:r>
+        <w:t xml:space="preserve">Use this spoken guide with the 31-slide presentation for club directors and Area Coordinators. Introduce why the system helps, show how to sign in, then follow the tasks for the audience's role. The technical review, code checks and future planning remain in the separate reports.</w:t>
+      </w:r>
+    </w:p>
+    <w:p>
+      <w:pPr>
+        <w:pStyle w:val="BodyText"/>
+      </w:pPr>
+      <w:r>
+        <w:rPr>
+          <w:b/>
+          <w:bCs/>
+        </w:rPr>
+        <w:t xml:space="preserve">Suggested route:</w:t>
+      </w:r>
+      <w:r>
+        <w:t xml:space="preserve"> </w:t>
+      </w:r>
+      <w:r>
+        <w:t xml:space="preserve">slides 1–10 introduce the system and sign-in; 11–19 cover directors; 20–27 cover Area Coordinators; 28–31 cover routines, help and finishing safely. For a single-role group, use its section after the common introduction.</w:t>
+      </w:r>
+    </w:p>
+    <w:p>
+      <w:pPr>
+        <w:pStyle w:val="BodyText"/>
+      </w:pPr>
+      <w:r>
+        <w:rPr>
+          <w:b/>
+          <w:bCs/>
+        </w:rPr>
+        <w:t xml:space="preserve">Before presenting:</w:t>
+      </w:r>
+      <w:r>
+        <w:t xml:space="preserve"> </w:t>
+      </w:r>
+      <w:r>
+        <w:t xml:space="preserve">check the current website labels and use an approved training account with fictitious records. The numbered task illustrations are teaching aids, not product screenshots or proposed menus. Keep live invitations, setup keys, recovery codes, private links and member information out of the demonstration. Stop before a real submission, erasure or approval unless it is part of an authorized training exercise.</w:t>
+      </w:r>
+    </w:p>
+    <w:p>
+      <w:pPr>
+        <w:pStyle w:val="BodyText"/>
+      </w:pPr>
+      <w:r>
+        <w:rPr>
+          <w:b/>
+          <w:bCs/>
+        </w:rPr>
+        <w:t xml:space="preserve">How to use the notes:</w:t>
+      </w:r>
+      <w:r>
+        <w:t xml:space="preserve"> </w:t>
+      </w:r>
+      <w:r>
+        <w:t xml:space="preserve">read or adapt the Say paragraph. Show or demonstrate gives an optional screen action. Ask the group is an optional check for understanding. Preparation references support the trainer and do not need to be read aloud.</w:t>
+      </w:r>
+    </w:p>
+    <w:bookmarkStart w:id="26" w:name="X979da305e429c81d1c59f30195e4b0fafe40ccc"/>
     <w:p>
       <w:pPr>
         <w:pStyle w:val="Heading2"/>
       </w:pPr>
       <w:r>
-        <w:t xml:space="preserve">1. A clearer guide to IMSDA Events</w:t>
+        <w:t xml:space="preserve">1. IMSDA Events Getting started</w:t>
+      </w:r>
+    </w:p>
+    <w:bookmarkStart w:id="20" w:name="say"/>
+    <w:p>
+      <w:pPr>
+        <w:pStyle w:val="Heading3"/>
+      </w:pPr>
+      <w:r>
+        <w:t xml:space="preserve">Say</w:t>
       </w:r>
     </w:p>
     <w:p>
@@ -25,7 +96,35 @@
         <w:pStyle w:val="FirstParagraph"/>
       </w:pPr>
       <w:r>
-        <w:t xml:space="preserve">Use this deck with the five companion documents. This is a repository-based briefing, not a statement of deployment or production readiness. The source baseline is main 5e367b7c. Existing rehearsals, decision records and sample imports/outputs are referenced rather than recreated.</w:t>
+        <w:t xml:space="preserve">IMSDA Events is our shared place for club records and event participation. Today we will follow the tasks you are most likely to need: signing in, keeping a club's information up to date, registering for an event and reviewing clubs as a coordinator. You do not need to understand the software behind it. Start with your own account and the job you are doing.</w:t>
+      </w:r>
+    </w:p>
+    <w:bookmarkEnd w:id="20"/>
+    <w:bookmarkStart w:id="21" w:name="show-or-demonstrate"/>
+    <w:p>
+      <w:pPr>
+        <w:pStyle w:val="Heading3"/>
+      </w:pPr>
+      <w:r>
+        <w:t xml:space="preserve">Show or demonstrate</w:t>
+      </w:r>
+    </w:p>
+    <w:p>
+      <w:pPr>
+        <w:pStyle w:val="FirstParagraph"/>
+      </w:pPr>
+      <w:r>
+        <w:t xml:space="preserve">Open events.imsda.org. For demonstrations, use an approved training account and fictitious records. The step illustrations in this deck are teaching aids, not screenshots or proposed menus.</w:t>
+      </w:r>
+    </w:p>
+    <w:bookmarkEnd w:id="21"/>
+    <w:bookmarkStart w:id="25" w:name="preparation-references--not-spoken"/>
+    <w:p>
+      <w:pPr>
+        <w:pStyle w:val="Heading3"/>
+      </w:pPr>
+      <w:r>
+        <w:t xml:space="preserve">Preparation references — not spoken</w:t>
       </w:r>
     </w:p>
     <w:p>
@@ -36,23 +135,67 @@
           <w:numId w:val="1001"/>
         </w:numPr>
       </w:pPr>
-      <w:hyperlink r:id="rId20">
+      <w:hyperlink r:id="rId22">
         <w:r>
           <w:rPr>
             <w:rStyle w:val="Hyperlink"/>
           </w:rPr>
-          <w:t xml:space="preserve">Source baseline</w:t>
+          <w:t xml:space="preserve">app/page.tsx</w:t>
         </w:r>
       </w:hyperlink>
     </w:p>
-    <w:bookmarkEnd w:id="21"/>
-    <w:bookmarkStart w:id="24" w:name="X0b4e6c2f95b793c363eda8cdee1627372d7c461"/>
+    <w:p>
+      <w:pPr>
+        <w:pStyle w:val="Compact"/>
+        <w:numPr>
+          <w:ilvl w:val="0"/>
+          <w:numId w:val="1001"/>
+        </w:numPr>
+      </w:pPr>
+      <w:hyperlink r:id="rId23">
+        <w:r>
+          <w:rPr>
+            <w:rStyle w:val="Hyperlink"/>
+          </w:rPr>
+          <w:t xml:space="preserve">modules/club-rosters/portal-nav.ts</w:t>
+        </w:r>
+      </w:hyperlink>
+    </w:p>
+    <w:p>
+      <w:pPr>
+        <w:pStyle w:val="Compact"/>
+        <w:numPr>
+          <w:ilvl w:val="0"/>
+          <w:numId w:val="1001"/>
+        </w:numPr>
+      </w:pPr>
+      <w:hyperlink r:id="rId24">
+        <w:r>
+          <w:rPr>
+            <w:rStyle w:val="Hyperlink"/>
+          </w:rPr>
+          <w:t xml:space="preserve">components/area-clubs-subnav.tsx</w:t>
+        </w:r>
+      </w:hyperlink>
+    </w:p>
+    <w:bookmarkEnd w:id="25"/>
+    <w:bookmarkEnd w:id="26"/>
+    <w:bookmarkStart w:id="31" w:name="Xa9711fb407e202099166234ec206b32ae158073"/>
     <w:p>
       <w:pPr>
         <w:pStyle w:val="Heading2"/>
       </w:pPr>
       <w:r>
-        <w:t xml:space="preserve">2. Read every feature with its status</w:t>
+        <w:t xml:space="preserve">2. Why we use IMSDA Events</w:t>
+      </w:r>
+    </w:p>
+    <w:bookmarkStart w:id="27" w:name="say-1"/>
+    <w:p>
+      <w:pPr>
+        <w:pStyle w:val="Heading3"/>
+      </w:pPr>
+      <w:r>
+        <w:t xml:space="preserve">Say</w:t>
       </w:r>
     </w:p>
     <w:p>
@@ -60,7 +203,35 @@
         <w:pStyle w:val="FirstParagraph"/>
       </w:pPr>
       <w:r>
-        <w:t xml:space="preserve">These labels prevent a common misunderstanding: a merged change, a design sample and a future issue do not have the same meaning. The documents use the same distinctions. No proposed feature in this deck is a new delivery commitment.</w:t>
+        <w:t xml:space="preserve">The purpose is to make ongoing club work and event work easier to connect. A director maintains the club's information. When an event opens, that roster is available for choosing who will attend. Coordinators use the same recorded work to understand progress and offer help. Returning to the saved record is more useful than keeping several different versions of a list.</w:t>
+      </w:r>
+    </w:p>
+    <w:bookmarkEnd w:id="27"/>
+    <w:bookmarkStart w:id="28" w:name="ask-the-group"/>
+    <w:p>
+      <w:pPr>
+        <w:pStyle w:val="Heading3"/>
+      </w:pPr>
+      <w:r>
+        <w:t xml:space="preserve">Ask the group</w:t>
+      </w:r>
+    </w:p>
+    <w:p>
+      <w:pPr>
+        <w:pStyle w:val="FirstParagraph"/>
+      </w:pPr>
+      <w:r>
+        <w:t xml:space="preserve">Which task currently makes you re-enter information or ask for another copy of a record?</w:t>
+      </w:r>
+    </w:p>
+    <w:bookmarkEnd w:id="28"/>
+    <w:bookmarkStart w:id="30" w:name="preparation-references--not-spoken-1"/>
+    <w:p>
+      <w:pPr>
+        <w:pStyle w:val="Heading3"/>
+      </w:pPr>
+      <w:r>
+        <w:t xml:space="preserve">Preparation references — not spoken</w:t>
       </w:r>
     </w:p>
     <w:p>
@@ -76,7 +247,7 @@
           <w:rPr>
             <w:rStyle w:val="Hyperlink"/>
           </w:rPr>
-          <w:t xml:space="preserve">Ordered roadmap</w:t>
+          <w:t xml:space="preserve">app/page.tsx</w:t>
         </w:r>
       </w:hyperlink>
     </w:p>
@@ -88,32 +259,87 @@
           <w:numId w:val="1002"/>
         </w:numPr>
       </w:pPr>
+      <w:hyperlink r:id="rId29">
+        <w:r>
+          <w:rPr>
+            <w:rStyle w:val="Hyperlink"/>
+          </w:rPr>
+          <w:t xml:space="preserve">docs/CLUB-MINISTRY-AND-HONORS-WEEKEND-PLAN.md</w:t>
+        </w:r>
+      </w:hyperlink>
+    </w:p>
+    <w:bookmarkEnd w:id="30"/>
+    <w:bookmarkEnd w:id="31"/>
+    <w:bookmarkStart w:id="36" w:name="Xd23bbbc9e4d9e6f46ac2e09bfcdafbdeb3782c1"/>
+    <w:p>
+      <w:pPr>
+        <w:pStyle w:val="Heading2"/>
+      </w:pPr>
+      <w:r>
+        <w:t xml:space="preserve">3. Know which job you are doing</w:t>
+      </w:r>
+    </w:p>
+    <w:bookmarkStart w:id="32" w:name="say-2"/>
+    <w:p>
+      <w:pPr>
+        <w:pStyle w:val="Heading3"/>
+      </w:pPr>
+      <w:r>
+        <w:t xml:space="preserve">Say</w:t>
+      </w:r>
+    </w:p>
+    <w:p>
+      <w:pPr>
+        <w:pStyle w:val="FirstParagraph"/>
+      </w:pPr>
+      <w:r>
+        <w:t xml:space="preserve">These ideas are related, but they answer different questions. Putting someone on the roster does not register that person for every event. A report being submitted does not mean an event registration is paid or checked in. Your account connects you to the responsibilities assigned to you. If you are both a director and a coordinator, choose the workspace for the task you are doing.</w:t>
+      </w:r>
+    </w:p>
+    <w:bookmarkEnd w:id="32"/>
+    <w:bookmarkStart w:id="33" w:name="ask-the-group-1"/>
+    <w:p>
+      <w:pPr>
+        <w:pStyle w:val="Heading3"/>
+      </w:pPr>
+      <w:r>
+        <w:t xml:space="preserve">Ask the group</w:t>
+      </w:r>
+    </w:p>
+    <w:p>
+      <w:pPr>
+        <w:pStyle w:val="FirstParagraph"/>
+      </w:pPr>
+      <w:r>
+        <w:t xml:space="preserve">If a new member is on the roster, are they automatically registered for Honors Weekend? The answer is no.</w:t>
+      </w:r>
+    </w:p>
+    <w:bookmarkEnd w:id="33"/>
+    <w:bookmarkStart w:id="35" w:name="preparation-references--not-spoken-2"/>
+    <w:p>
+      <w:pPr>
+        <w:pStyle w:val="Heading3"/>
+      </w:pPr>
+      <w:r>
+        <w:t xml:space="preserve">Preparation references — not spoken</w:t>
+      </w:r>
+    </w:p>
+    <w:p>
+      <w:pPr>
+        <w:pStyle w:val="Compact"/>
+        <w:numPr>
+          <w:ilvl w:val="0"/>
+          <w:numId w:val="1003"/>
+        </w:numPr>
+      </w:pPr>
       <w:hyperlink r:id="rId23">
         <w:r>
           <w:rPr>
             <w:rStyle w:val="Hyperlink"/>
           </w:rPr>
-          <w:t xml:space="preserve">Design direction</w:t>
+          <w:t xml:space="preserve">modules/club-rosters/portal-nav.ts</w:t>
         </w:r>
       </w:hyperlink>
-    </w:p>
-    <w:bookmarkEnd w:id="24"/>
-    <w:bookmarkStart w:id="27" w:name="X482c4621e67a79f4476b003602cc3c3a1190fa0"/>
-    <w:p>
-      <w:pPr>
-        <w:pStyle w:val="Heading2"/>
-      </w:pPr>
-      <w:r>
-        <w:t xml:space="preserve">3. A substantial event foundation already exists</w:t>
-      </w:r>
-    </w:p>
-    <w:p>
-      <w:pPr>
-        <w:pStyle w:val="FirstParagraph"/>
-      </w:pPr>
-      <w:r>
-        <w:t xml:space="preserve">These are grouped foundations rather than a promise that every long-term epic is complete. The feature guide gives current limits and source links. The future append-only ledger is distinct from the current payment/refund/adjustment system.</w:t>
-      </w:r>
     </w:p>
     <w:p>
       <w:pPr>
@@ -123,40 +349,33 @@
           <w:numId w:val="1003"/>
         </w:numPr>
       </w:pPr>
-      <w:hyperlink r:id="rId25">
+      <w:hyperlink r:id="rId34">
         <w:r>
           <w:rPr>
             <w:rStyle w:val="Hyperlink"/>
           </w:rPr>
-          <w:t xml:space="preserve">Feature inventory</w:t>
+          <w:t xml:space="preserve">modules/club-reports/area-summary-domain.ts</w:t>
         </w:r>
       </w:hyperlink>
     </w:p>
-    <w:p>
-      <w:pPr>
-        <w:pStyle w:val="Compact"/>
-        <w:numPr>
-          <w:ilvl w:val="0"/>
-          <w:numId w:val="1003"/>
-        </w:numPr>
-      </w:pPr>
-      <w:hyperlink r:id="rId26">
-        <w:r>
-          <w:rPr>
-            <w:rStyle w:val="Hyperlink"/>
-          </w:rPr>
-          <w:t xml:space="preserve">Source modules</w:t>
-        </w:r>
-      </w:hyperlink>
-    </w:p>
-    <w:bookmarkEnd w:id="27"/>
-    <w:bookmarkStart w:id="29" w:name="X54f734ddabb6f14e823bebbe15a9625df2c186f"/>
+    <w:bookmarkEnd w:id="35"/>
+    <w:bookmarkEnd w:id="36"/>
+    <w:bookmarkStart w:id="42" w:name="Xeeea698a1b24691db1c0b8e46d7c4e326c5be4b"/>
     <w:p>
       <w:pPr>
         <w:pStyle w:val="Heading2"/>
       </w:pPr>
       <w:r>
-        <w:t xml:space="preserve">4. One visual language. Four different jobs.</w:t>
+        <w:t xml:space="preserve">4. Begin at the same website</w:t>
+      </w:r>
+    </w:p>
+    <w:bookmarkStart w:id="37" w:name="say-3"/>
+    <w:p>
+      <w:pPr>
+        <w:pStyle w:val="Heading3"/>
+      </w:pPr>
+      <w:r>
+        <w:t xml:space="preserve">Say</w:t>
       </w:r>
     </w:p>
     <w:p>
@@ -164,7 +383,35 @@
         <w:pStyle w:val="FirstParagraph"/>
       </w:pPr>
       <w:r>
-        <w:t xml:space="preserve">Do not turn these personas into four options anyone can select. Workspaces follow real grants and authentication. A multi-person registration does not establish permanent household or guardian authority. Current coordinator source selects all active clubs; ministry-scoped access is a later project.</w:t>
+        <w:t xml:space="preserve">Everyone can start at events dot imsda dot org. Use the Sign in button on the website; it takes you to the sign-in page available on the system. You do not need a special director or coordinator login address. If you are already signed in, the page can show My account instead. Use the account that received your invitation or was assigned your coordinator access.</w:t>
+      </w:r>
+    </w:p>
+    <w:bookmarkEnd w:id="37"/>
+    <w:bookmarkStart w:id="38" w:name="show-or-demonstrate-1"/>
+    <w:p>
+      <w:pPr>
+        <w:pStyle w:val="Heading3"/>
+      </w:pPr>
+      <w:r>
+        <w:t xml:space="preserve">Show or demonstrate</w:t>
+      </w:r>
+    </w:p>
+    <w:p>
+      <w:pPr>
+        <w:pStyle w:val="FirstParagraph"/>
+      </w:pPr>
+      <w:r>
+        <w:t xml:space="preserve">Point to Sign in, My account and My club on the current homepage. A configured passkey may also be offered. Do not teach a fixed /login or /sign-in path.</w:t>
+      </w:r>
+    </w:p>
+    <w:bookmarkEnd w:id="38"/>
+    <w:bookmarkStart w:id="41" w:name="preparation-references--not-spoken-3"/>
+    <w:p>
+      <w:pPr>
+        <w:pStyle w:val="Heading3"/>
+      </w:pPr>
+      <w:r>
+        <w:t xml:space="preserve">Preparation references — not spoken</w:t>
       </w:r>
     </w:p>
     <w:p>
@@ -175,12 +422,12 @@
           <w:numId w:val="1004"/>
         </w:numPr>
       </w:pPr>
-      <w:hyperlink r:id="rId28">
+      <w:hyperlink r:id="rId22">
         <w:r>
           <w:rPr>
             <w:rStyle w:val="Hyperlink"/>
           </w:rPr>
-          <w:t xml:space="preserve">Role contract</w:t>
+          <w:t xml:space="preserve">app/page.tsx</w:t>
         </w:r>
       </w:hyperlink>
     </w:p>
@@ -192,23 +439,680 @@
           <w:numId w:val="1004"/>
         </w:numPr>
       </w:pPr>
+      <w:hyperlink r:id="rId39">
+        <w:r>
+          <w:rPr>
+            <w:rStyle w:val="Hyperlink"/>
+          </w:rPr>
+          <w:t xml:space="preserve">components/public-header-links.tsx</w:t>
+        </w:r>
+      </w:hyperlink>
+    </w:p>
+    <w:p>
+      <w:pPr>
+        <w:pStyle w:val="Compact"/>
+        <w:numPr>
+          <w:ilvl w:val="0"/>
+          <w:numId w:val="1004"/>
+        </w:numPr>
+      </w:pPr>
+      <w:hyperlink r:id="rId40">
+        <w:r>
+          <w:rPr>
+            <w:rStyle w:val="Hyperlink"/>
+          </w:rPr>
+          <w:t xml:space="preserve">components/attendee-sign-in-form.tsx</w:t>
+        </w:r>
+      </w:hyperlink>
+    </w:p>
+    <w:bookmarkEnd w:id="41"/>
+    <w:bookmarkEnd w:id="42"/>
+    <w:bookmarkStart w:id="48" w:name="Xab471f0864d4c91acdc0539b6220237c0c9c2e2"/>
+    <w:p>
+      <w:pPr>
+        <w:pStyle w:val="Heading2"/>
+      </w:pPr>
+      <w:r>
+        <w:t xml:space="preserve">5. New director? Accept the club invitation</w:t>
+      </w:r>
+    </w:p>
+    <w:bookmarkStart w:id="43" w:name="say-4"/>
+    <w:p>
+      <w:pPr>
+        <w:pStyle w:val="Heading3"/>
+      </w:pPr>
+      <w:r>
+        <w:t xml:space="preserve">Say</w:t>
+      </w:r>
+    </w:p>
+    <w:p>
+      <w:pPr>
+        <w:pStyle w:val="FirstParagraph"/>
+      </w:pPr>
+      <w:r>
+        <w:t xml:space="preserve">The invitation is what connects your account to a club. Creating an account by itself does not complete that connection. If you already have an account at the invited address, sign in to it. If you are new, create and verify the account first. On your account page, find You're invited to manage a club, check the club name and role, and choose Accept. If the invitation is missing, ask the office to check the address rather than making another account or applying to create the club again.</w:t>
+      </w:r>
+    </w:p>
+    <w:bookmarkEnd w:id="43"/>
+    <w:bookmarkStart w:id="44" w:name="show-or-demonstrate-2"/>
+    <w:p>
+      <w:pPr>
+        <w:pStyle w:val="Heading3"/>
+      </w:pPr>
+      <w:r>
+        <w:t xml:space="preserve">Show or demonstrate</w:t>
+      </w:r>
+    </w:p>
+    <w:p>
+      <w:pPr>
+        <w:pStyle w:val="FirstParagraph"/>
+      </w:pPr>
+      <w:r>
+        <w:t xml:space="preserve">Point out the invitation card and Accept label using a training example. Do not accept a real invitation as a general demonstration.</w:t>
+      </w:r>
+    </w:p>
+    <w:bookmarkEnd w:id="44"/>
+    <w:bookmarkStart w:id="47" w:name="preparation-references--not-spoken-4"/>
+    <w:p>
+      <w:pPr>
+        <w:pStyle w:val="Heading3"/>
+      </w:pPr>
+      <w:r>
+        <w:t xml:space="preserve">Preparation references — not spoken</w:t>
+      </w:r>
+    </w:p>
+    <w:p>
+      <w:pPr>
+        <w:pStyle w:val="Compact"/>
+        <w:numPr>
+          <w:ilvl w:val="0"/>
+          <w:numId w:val="1005"/>
+        </w:numPr>
+      </w:pPr>
+      <w:hyperlink r:id="rId45">
+        <w:r>
+          <w:rPr>
+            <w:rStyle w:val="Hyperlink"/>
+          </w:rPr>
+          <w:t xml:space="preserve">modules/club-imports/invites.ts</w:t>
+        </w:r>
+      </w:hyperlink>
+    </w:p>
+    <w:p>
+      <w:pPr>
+        <w:pStyle w:val="Compact"/>
+        <w:numPr>
+          <w:ilvl w:val="0"/>
+          <w:numId w:val="1005"/>
+        </w:numPr>
+      </w:pPr>
+      <w:hyperlink r:id="rId46">
+        <w:r>
+          <w:rPr>
+            <w:rStyle w:val="Hyperlink"/>
+          </w:rPr>
+          <w:t xml:space="preserve">components/club-invite-accept.tsx</w:t>
+        </w:r>
+      </w:hyperlink>
+    </w:p>
+    <w:bookmarkEnd w:id="47"/>
+    <w:bookmarkEnd w:id="48"/>
+    <w:bookmarkStart w:id="53" w:name="Xf1f25766d3ee6e570d1bcbbc3855ee99ef81390"/>
+    <w:p>
+      <w:pPr>
+        <w:pStyle w:val="Heading2"/>
+      </w:pPr>
+      <w:r>
+        <w:t xml:space="preserve">6. Creating an account: verify your email</w:t>
+      </w:r>
+    </w:p>
+    <w:bookmarkStart w:id="49" w:name="say-5"/>
+    <w:p>
+      <w:pPr>
+        <w:pStyle w:val="Heading3"/>
+      </w:pPr>
+      <w:r>
+        <w:t xml:space="preserve">Say</w:t>
+      </w:r>
+    </w:p>
+    <w:p>
+      <w:pPr>
+        <w:pStyle w:val="FirstParagraph"/>
+      </w:pPr>
+      <w:r>
+        <w:t xml:space="preserve">Create an account asks for your name, email and a password that meets the checklist. The system emails a six-digit code. Keep the same browser open, then return to enter that code and choose Verify and continue. The current email code expires after twenty minutes. This confirms that you control the address. It is not the authenticator code we will use for the club's extra sign-in protection.</w:t>
+      </w:r>
+    </w:p>
+    <w:bookmarkEnd w:id="49"/>
+    <w:bookmarkStart w:id="50" w:name="show-or-demonstrate-3"/>
+    <w:p>
+      <w:pPr>
+        <w:pStyle w:val="Heading3"/>
+      </w:pPr>
+      <w:r>
+        <w:t xml:space="preserve">Show or demonstrate</w:t>
+      </w:r>
+    </w:p>
+    <w:p>
+      <w:pPr>
+        <w:pStyle w:val="FirstParagraph"/>
+      </w:pPr>
+      <w:r>
+        <w:t xml:space="preserve">Explain the same-browser verification step without displaying a real code or inbox. After verification, return to the club invitation and accept it.</w:t>
+      </w:r>
+    </w:p>
+    <w:bookmarkEnd w:id="50"/>
+    <w:bookmarkStart w:id="52" w:name="preparation-references--not-spoken-5"/>
+    <w:p>
+      <w:pPr>
+        <w:pStyle w:val="Heading3"/>
+      </w:pPr>
+      <w:r>
+        <w:t xml:space="preserve">Preparation references — not spoken</w:t>
+      </w:r>
+    </w:p>
+    <w:p>
+      <w:pPr>
+        <w:pStyle w:val="Compact"/>
+        <w:numPr>
+          <w:ilvl w:val="0"/>
+          <w:numId w:val="1006"/>
+        </w:numPr>
+      </w:pPr>
+      <w:hyperlink r:id="rId51">
+        <w:r>
+          <w:rPr>
+            <w:rStyle w:val="Hyperlink"/>
+          </w:rPr>
+          <w:t xml:space="preserve">components/attendee-sign-up-form.tsx</w:t>
+        </w:r>
+      </w:hyperlink>
+    </w:p>
+    <w:bookmarkEnd w:id="52"/>
+    <w:bookmarkEnd w:id="53"/>
+    <w:bookmarkStart w:id="58" w:name="X014b7b8961569a6e081efe455106b0257518242"/>
+    <w:p>
+      <w:pPr>
+        <w:pStyle w:val="Heading2"/>
+      </w:pPr>
+      <w:r>
+        <w:t xml:space="preserve">7. Returning users: sign in and continue</w:t>
+      </w:r>
+    </w:p>
+    <w:bookmarkStart w:id="54" w:name="say-6"/>
+    <w:p>
+      <w:pPr>
+        <w:pStyle w:val="Heading3"/>
+      </w:pPr>
+      <w:r>
+        <w:t xml:space="preserve">Say</w:t>
+      </w:r>
+    </w:p>
+    <w:p>
+      <w:pPr>
+        <w:pStyle w:val="FirstParagraph"/>
+      </w:pPr>
+      <w:r>
+        <w:t xml:space="preserve">When you return, use the account you already set up. Sign in, then complete Confirm it's you if asked. That might be your authenticator code or a supported passkey. An unused recovery code can help if you cannot use the authenticator. Once the system has confirmed you, open the club or coordinator tools for the work you need to do.</w:t>
+      </w:r>
+    </w:p>
+    <w:bookmarkEnd w:id="54"/>
+    <w:bookmarkStart w:id="55" w:name="show-or-demonstrate-4"/>
+    <w:p>
+      <w:pPr>
+        <w:pStyle w:val="Heading3"/>
+      </w:pPr>
+      <w:r>
+        <w:t xml:space="preserve">Show or demonstrate</w:t>
+      </w:r>
+    </w:p>
+    <w:p>
+      <w:pPr>
+        <w:pStyle w:val="FirstParagraph"/>
+      </w:pPr>
+      <w:r>
+        <w:t xml:space="preserve">Point to the actual sign-in labels. Explain a passkey as the device fingerprint, face or PIN prompt when the system offers that option.</w:t>
+      </w:r>
+    </w:p>
+    <w:bookmarkEnd w:id="55"/>
+    <w:bookmarkStart w:id="57" w:name="preparation-references--not-spoken-6"/>
+    <w:p>
+      <w:pPr>
+        <w:pStyle w:val="Heading3"/>
+      </w:pPr>
+      <w:r>
+        <w:t xml:space="preserve">Preparation references — not spoken</w:t>
+      </w:r>
+    </w:p>
+    <w:p>
+      <w:pPr>
+        <w:pStyle w:val="Compact"/>
+        <w:numPr>
+          <w:ilvl w:val="0"/>
+          <w:numId w:val="1007"/>
+        </w:numPr>
+      </w:pPr>
+      <w:hyperlink r:id="rId40">
+        <w:r>
+          <w:rPr>
+            <w:rStyle w:val="Hyperlink"/>
+          </w:rPr>
+          <w:t xml:space="preserve">components/attendee-sign-in-form.tsx</w:t>
+        </w:r>
+      </w:hyperlink>
+    </w:p>
+    <w:p>
+      <w:pPr>
+        <w:pStyle w:val="Compact"/>
+        <w:numPr>
+          <w:ilvl w:val="0"/>
+          <w:numId w:val="1007"/>
+        </w:numPr>
+      </w:pPr>
+      <w:hyperlink r:id="rId56">
+        <w:r>
+          <w:rPr>
+            <w:rStyle w:val="Hyperlink"/>
+          </w:rPr>
+          <w:t xml:space="preserve">app/(public)/account/two-step/page.tsx</w:t>
+        </w:r>
+      </w:hyperlink>
+    </w:p>
+    <w:bookmarkEnd w:id="57"/>
+    <w:bookmarkEnd w:id="58"/>
+    <w:bookmarkStart w:id="63" w:name="X7aba8039b94bfd777902408414b587a51289f9c"/>
+    <w:p>
+      <w:pPr>
+        <w:pStyle w:val="Heading2"/>
+      </w:pPr>
+      <w:r>
+        <w:t xml:space="preserve">8. Why the extra sign-in step matters</w:t>
+      </w:r>
+    </w:p>
+    <w:bookmarkStart w:id="59" w:name="say-7"/>
+    <w:p>
+      <w:pPr>
+        <w:pStyle w:val="Heading3"/>
+      </w:pPr>
+      <w:r>
+        <w:t xml:space="preserve">Say</w:t>
+      </w:r>
+    </w:p>
+    <w:p>
+      <w:pPr>
+        <w:pStyle w:val="FirstParagraph"/>
+      </w:pPr>
+      <w:r>
+        <w:t xml:space="preserve">The extra step protects club information if someone learns a password. You only need one supported method. An authenticator app generates a short code. A passkey asks your device for a fingerprint, face or PIN. The email verification code confirms the email address; the authenticator or passkey protects access to the club and coordinator tools. Saving recovery codes now can prevent a lost phone from becoming a long interruption later.</w:t>
+      </w:r>
+    </w:p>
+    <w:bookmarkEnd w:id="59"/>
+    <w:bookmarkStart w:id="60" w:name="ask-the-group-2"/>
+    <w:p>
+      <w:pPr>
+        <w:pStyle w:val="Heading3"/>
+      </w:pPr>
+      <w:r>
+        <w:t xml:space="preserve">Ask the group</w:t>
+      </w:r>
+    </w:p>
+    <w:p>
+      <w:pPr>
+        <w:pStyle w:val="FirstParagraph"/>
+      </w:pPr>
+      <w:r>
+        <w:t xml:space="preserve">Which code comes from your email, and which comes from your authenticator app?</w:t>
+      </w:r>
+    </w:p>
+    <w:bookmarkEnd w:id="60"/>
+    <w:bookmarkStart w:id="62" w:name="preparation-references--not-spoken-7"/>
+    <w:p>
+      <w:pPr>
+        <w:pStyle w:val="Heading3"/>
+      </w:pPr>
+      <w:r>
+        <w:t xml:space="preserve">Preparation references — not spoken</w:t>
+      </w:r>
+    </w:p>
+    <w:p>
+      <w:pPr>
+        <w:pStyle w:val="Compact"/>
+        <w:numPr>
+          <w:ilvl w:val="0"/>
+          <w:numId w:val="1008"/>
+        </w:numPr>
+      </w:pPr>
+      <w:hyperlink r:id="rId56">
+        <w:r>
+          <w:rPr>
+            <w:rStyle w:val="Hyperlink"/>
+          </w:rPr>
+          <w:t xml:space="preserve">app/(public)/account/two-step/page.tsx</w:t>
+        </w:r>
+      </w:hyperlink>
+    </w:p>
+    <w:p>
+      <w:pPr>
+        <w:pStyle w:val="Compact"/>
+        <w:numPr>
+          <w:ilvl w:val="0"/>
+          <w:numId w:val="1008"/>
+        </w:numPr>
+      </w:pPr>
+      <w:hyperlink r:id="rId61">
+        <w:r>
+          <w:rPr>
+            <w:rStyle w:val="Hyperlink"/>
+          </w:rPr>
+          <w:t xml:space="preserve">components/two-step-setup.tsx</w:t>
+        </w:r>
+      </w:hyperlink>
+    </w:p>
+    <w:bookmarkEnd w:id="62"/>
+    <w:bookmarkEnd w:id="63"/>
+    <w:bookmarkStart w:id="69" w:name="Xc0da2a008dc6629e7c4077511e102a0a8720be3"/>
+    <w:p>
+      <w:pPr>
+        <w:pStyle w:val="Heading2"/>
+      </w:pPr>
+      <w:r>
+        <w:t xml:space="preserve">9. Set up an authenticator when prompted</w:t>
+      </w:r>
+    </w:p>
+    <w:bookmarkStart w:id="64" w:name="say-8"/>
+    <w:p>
+      <w:pPr>
+        <w:pStyle w:val="Heading3"/>
+      </w:pPr>
+      <w:r>
+        <w:t xml:space="preserve">Say</w:t>
+      </w:r>
+    </w:p>
+    <w:p>
+      <w:pPr>
+        <w:pStyle w:val="FirstParagraph"/>
+      </w:pPr>
+      <w:r>
+        <w:t xml:space="preserve">Choose Set up an authenticator. The help link explains suitable apps, including Google Authenticator and Microsoft Authenticator. Follow the screen to add the account to your app using the setup information shown. Then enter the code from the app and choose Confirm and turn on. Save the recovery codes somewhere private and choose I've saved these codes. Continue when setup is complete. A passkey is another method if the site offers it; you do not have to set up both.</w:t>
+      </w:r>
+    </w:p>
+    <w:bookmarkEnd w:id="64"/>
+    <w:bookmarkStart w:id="65" w:name="show-or-demonstrate-5"/>
+    <w:p>
+      <w:pPr>
+        <w:pStyle w:val="Heading3"/>
+      </w:pPr>
+      <w:r>
+        <w:t xml:space="preserve">Show or demonstrate</w:t>
+      </w:r>
+    </w:p>
+    <w:p>
+      <w:pPr>
+        <w:pStyle w:val="FirstParagraph"/>
+      </w:pPr>
+      <w:r>
+        <w:t xml:space="preserve">Use the help page to explain adding an account. The current setup component shows a text key; do not promise a QR image on every setup screen. Never display a usable setup key or recovery code in a presentation.</w:t>
+      </w:r>
+    </w:p>
+    <w:bookmarkEnd w:id="65"/>
+    <w:bookmarkStart w:id="68" w:name="preparation-references--not-spoken-8"/>
+    <w:p>
+      <w:pPr>
+        <w:pStyle w:val="Heading3"/>
+      </w:pPr>
+      <w:r>
+        <w:t xml:space="preserve">Preparation references — not spoken</w:t>
+      </w:r>
+    </w:p>
+    <w:p>
+      <w:pPr>
+        <w:pStyle w:val="Compact"/>
+        <w:numPr>
+          <w:ilvl w:val="0"/>
+          <w:numId w:val="1009"/>
+        </w:numPr>
+      </w:pPr>
+      <w:hyperlink r:id="rId66">
+        <w:r>
+          <w:rPr>
+            <w:rStyle w:val="Hyperlink"/>
+          </w:rPr>
+          <w:t xml:space="preserve">components/mfa-manager.tsx</w:t>
+        </w:r>
+      </w:hyperlink>
+    </w:p>
+    <w:p>
+      <w:pPr>
+        <w:pStyle w:val="Compact"/>
+        <w:numPr>
+          <w:ilvl w:val="0"/>
+          <w:numId w:val="1009"/>
+        </w:numPr>
+      </w:pPr>
+      <w:hyperlink r:id="rId61">
+        <w:r>
+          <w:rPr>
+            <w:rStyle w:val="Hyperlink"/>
+          </w:rPr>
+          <w:t xml:space="preserve">components/two-step-setup.tsx</w:t>
+        </w:r>
+      </w:hyperlink>
+    </w:p>
+    <w:p>
+      <w:pPr>
+        <w:pStyle w:val="Compact"/>
+        <w:numPr>
+          <w:ilvl w:val="0"/>
+          <w:numId w:val="1009"/>
+        </w:numPr>
+      </w:pPr>
+      <w:hyperlink r:id="rId67">
+        <w:r>
+          <w:rPr>
+            <w:rStyle w:val="Hyperlink"/>
+          </w:rPr>
+          <w:t xml:space="preserve">app/(public)/account/help/authenticator/page.tsx</w:t>
+        </w:r>
+      </w:hyperlink>
+    </w:p>
+    <w:bookmarkEnd w:id="68"/>
+    <w:bookmarkEnd w:id="69"/>
+    <w:bookmarkStart w:id="75" w:name="X0b44b1e5853ac54a3e788d0c45f67c1c135647a"/>
+    <w:p>
+      <w:pPr>
+        <w:pStyle w:val="Heading2"/>
+      </w:pPr>
+      <w:r>
+        <w:t xml:space="preserve">10. Open the workspace for your responsibility</w:t>
+      </w:r>
+    </w:p>
+    <w:bookmarkStart w:id="70" w:name="say-9"/>
+    <w:p>
+      <w:pPr>
+        <w:pStyle w:val="Heading3"/>
+      </w:pPr>
+      <w:r>
+        <w:t xml:space="preserve">Say</w:t>
+      </w:r>
+    </w:p>
+    <w:p>
+      <w:pPr>
+        <w:pStyle w:val="FirstParagraph"/>
+      </w:pPr>
+      <w:r>
+        <w:t xml:space="preserve">The tools follow your actual responsibilities. A director works inside the club. An Area Coordinator has a Clubs section and a Clubs overview link on the account card. Your personal registrations are separate from running a club. Someone with both responsibilities may see both sets of tools. If the expected option is missing, check which email is signed in and ask the office about access; making a duplicate account is unlikely to solve it.</w:t>
+      </w:r>
+    </w:p>
+    <w:bookmarkEnd w:id="70"/>
+    <w:bookmarkStart w:id="71" w:name="show-or-demonstrate-6"/>
+    <w:p>
+      <w:pPr>
+        <w:pStyle w:val="Heading3"/>
+      </w:pPr>
+      <w:r>
+        <w:t xml:space="preserve">Show or demonstrate</w:t>
+      </w:r>
+    </w:p>
+    <w:p>
+      <w:pPr>
+        <w:pStyle w:val="FirstParagraph"/>
+      </w:pPr>
+      <w:r>
+        <w:t xml:space="preserve">Explain My club/My clubs versus the coordinator Clubs navigation. Current club and coordinator headings show the working year; do not invent a year dropdown.</w:t>
+      </w:r>
+    </w:p>
+    <w:bookmarkEnd w:id="71"/>
+    <w:bookmarkStart w:id="74" w:name="preparation-references--not-spoken-9"/>
+    <w:p>
+      <w:pPr>
+        <w:pStyle w:val="Heading3"/>
+      </w:pPr>
+      <w:r>
+        <w:t xml:space="preserve">Preparation references — not spoken</w:t>
+      </w:r>
+    </w:p>
+    <w:p>
+      <w:pPr>
+        <w:pStyle w:val="Compact"/>
+        <w:numPr>
+          <w:ilvl w:val="0"/>
+          <w:numId w:val="1010"/>
+        </w:numPr>
+      </w:pPr>
+      <w:hyperlink r:id="rId72">
+        <w:r>
+          <w:rPr>
+            <w:rStyle w:val="Hyperlink"/>
+          </w:rPr>
+          <w:t xml:space="preserve">app/(public)/account/(portal)/layout.tsx</w:t>
+        </w:r>
+      </w:hyperlink>
+    </w:p>
+    <w:p>
+      <w:pPr>
+        <w:pStyle w:val="Compact"/>
+        <w:numPr>
+          <w:ilvl w:val="0"/>
+          <w:numId w:val="1010"/>
+        </w:numPr>
+      </w:pPr>
+      <w:hyperlink r:id="rId73">
+        <w:r>
+          <w:rPr>
+            <w:rStyle w:val="Hyperlink"/>
+          </w:rPr>
+          <w:t xml:space="preserve">modules/club-reports/area-card-domain.ts</w:t>
+        </w:r>
+      </w:hyperlink>
+    </w:p>
+    <w:bookmarkEnd w:id="74"/>
+    <w:bookmarkEnd w:id="75"/>
+    <w:bookmarkStart w:id="80" w:name="Xf3de38a2a1ad0ecbe0568fb58398ba475efb55b"/>
+    <w:p>
+      <w:pPr>
+        <w:pStyle w:val="Heading2"/>
+      </w:pPr>
+      <w:r>
+        <w:t xml:space="preserve">11. Directors: start at your club Home</w:t>
+      </w:r>
+    </w:p>
+    <w:bookmarkStart w:id="76" w:name="say-10"/>
+    <w:p>
+      <w:pPr>
+        <w:pStyle w:val="Heading3"/>
+      </w:pPr>
+      <w:r>
+        <w:t xml:space="preserve">Say</w:t>
+      </w:r>
+    </w:p>
+    <w:p>
+      <w:pPr>
+        <w:pStyle w:val="FirstParagraph"/>
+      </w:pPr>
+      <w:r>
+        <w:t xml:space="preserve">Home is the starting point for the club's work. It is not another form to complete. Check the club name and year at the top, especially if you manage more than one club. The next-task card and summaries help you decide where to go. Our example club is Riverton Pathfinders. A deputy has the director's capabilities; registrar and reporter roles are narrower, so their menus can correctly look different.</w:t>
+      </w:r>
+    </w:p>
+    <w:bookmarkEnd w:id="76"/>
+    <w:bookmarkStart w:id="77" w:name="show-or-demonstrate-7"/>
+    <w:p>
+      <w:pPr>
+        <w:pStyle w:val="Heading3"/>
+      </w:pPr>
+      <w:r>
+        <w:t xml:space="preserve">Show or demonstrate</w:t>
+      </w:r>
+    </w:p>
+    <w:p>
+      <w:pPr>
+        <w:pStyle w:val="FirstParagraph"/>
+      </w:pPr>
+      <w:r>
+        <w:t xml:space="preserve">Point to the current club header, next task and Open roster/Open Monthly Records links. These are current labels, not the separate accepted redesign.</w:t>
+      </w:r>
+    </w:p>
+    <w:bookmarkEnd w:id="77"/>
+    <w:bookmarkStart w:id="79" w:name="preparation-references--not-spoken-10"/>
+    <w:p>
+      <w:pPr>
+        <w:pStyle w:val="Heading3"/>
+      </w:pPr>
+      <w:r>
+        <w:t xml:space="preserve">Preparation references — not spoken</w:t>
+      </w:r>
+    </w:p>
+    <w:p>
+      <w:pPr>
+        <w:pStyle w:val="Compact"/>
+        <w:numPr>
+          <w:ilvl w:val="0"/>
+          <w:numId w:val="1011"/>
+        </w:numPr>
+      </w:pPr>
+      <w:hyperlink r:id="rId78">
+        <w:r>
+          <w:rPr>
+            <w:rStyle w:val="Hyperlink"/>
+          </w:rPr>
+          <w:t xml:space="preserve">app/(public)/account/(portal)/clubs/[organizationId]/page.tsx</w:t>
+        </w:r>
+      </w:hyperlink>
+    </w:p>
+    <w:p>
+      <w:pPr>
+        <w:pStyle w:val="Compact"/>
+        <w:numPr>
+          <w:ilvl w:val="0"/>
+          <w:numId w:val="1011"/>
+        </w:numPr>
+      </w:pPr>
       <w:hyperlink r:id="rId23">
         <w:r>
           <w:rPr>
             <w:rStyle w:val="Hyperlink"/>
           </w:rPr>
-          <w:t xml:space="preserve">Accepted roles</w:t>
+          <w:t xml:space="preserve">modules/club-rosters/portal-nav.ts</w:t>
         </w:r>
       </w:hyperlink>
     </w:p>
-    <w:bookmarkEnd w:id="29"/>
-    <w:bookmarkStart w:id="33" w:name="X49f2ffed5278cd6583a5de15522644db77f1397"/>
+    <w:bookmarkEnd w:id="79"/>
+    <w:bookmarkEnd w:id="80"/>
+    <w:bookmarkStart w:id="85" w:name="X3a809c57b2854ef8112a7159579208ed4ab658b"/>
     <w:p>
       <w:pPr>
         <w:pStyle w:val="Heading2"/>
       </w:pPr>
       <w:r>
-        <w:t xml:space="preserve">5. Attendee help starts with the next action</w:t>
+        <w:t xml:space="preserve">12. Add a member to the roster</w:t>
+      </w:r>
+    </w:p>
+    <w:bookmarkStart w:id="81" w:name="say-11"/>
+    <w:p>
+      <w:pPr>
+        <w:pStyle w:val="Heading3"/>
+      </w:pPr>
+      <w:r>
+        <w:t xml:space="preserve">Say</w:t>
       </w:r>
     </w:p>
     <w:p>
@@ -216,7 +1120,35 @@
         <w:pStyle w:val="FirstParagraph"/>
       </w:pPr>
       <w:r>
-        <w:t xml:space="preserve">Use the actual event and registration state before suggesting Pay now or Change registration. #1100 is the open lifecycle display defect. Private management links carry access: help users recover access through the intended path rather than forwarding tokens or posting them in support channels.</w:t>
+        <w:t xml:space="preserve">Add regular members to the roster so they are available for future event choices. For a demonstration, use a fictitious member such as Morgan Reed. First check that Morgan is not already there. Enter the requested details, choose Add to roster and check the saved row. This has put Morgan on the club's list; it has not registered Morgan for an event. If Morgan is already listed, correct the existing record instead of adding a duplicate.</w:t>
+      </w:r>
+    </w:p>
+    <w:bookmarkEnd w:id="81"/>
+    <w:bookmarkStart w:id="82" w:name="show-or-demonstrate-8"/>
+    <w:p>
+      <w:pPr>
+        <w:pStyle w:val="Heading3"/>
+      </w:pPr>
+      <w:r>
+        <w:t xml:space="preserve">Show or demonstrate</w:t>
+      </w:r>
+    </w:p>
+    <w:p>
+      <w:pPr>
+        <w:pStyle w:val="FirstParagraph"/>
+      </w:pPr>
+      <w:r>
+        <w:t xml:space="preserve">Use an approved training roster only. Explain that age and birth-date fields follow the viewer’s permitted access; no real birth date is needed for the teaching example.</w:t>
+      </w:r>
+    </w:p>
+    <w:bookmarkEnd w:id="82"/>
+    <w:bookmarkStart w:id="84" w:name="preparation-references--not-spoken-11"/>
+    <w:p>
+      <w:pPr>
+        <w:pStyle w:val="Heading3"/>
+      </w:pPr>
+      <w:r>
+        <w:t xml:space="preserve">Preparation references — not spoken</w:t>
       </w:r>
     </w:p>
     <w:p>
@@ -224,32 +1156,88 @@
         <w:pStyle w:val="Compact"/>
         <w:numPr>
           <w:ilvl w:val="0"/>
-          <w:numId w:val="1005"/>
+          <w:numId w:val="1012"/>
         </w:numPr>
       </w:pPr>
-      <w:hyperlink r:id="rId30">
+      <w:hyperlink r:id="rId83">
         <w:r>
           <w:rPr>
             <w:rStyle w:val="Hyperlink"/>
           </w:rPr>
-          <w:t xml:space="preserve">Private access</w:t>
+          <w:t xml:space="preserve">components/club-roster-workspace.tsx</w:t>
         </w:r>
       </w:hyperlink>
+    </w:p>
+    <w:bookmarkEnd w:id="84"/>
+    <w:bookmarkEnd w:id="85"/>
+    <w:bookmarkStart w:id="90" w:name="X56f998f902cec947036c2664049b340b8f4011d"/>
+    <w:p>
+      <w:pPr>
+        <w:pStyle w:val="Heading2"/>
+      </w:pPr>
+      <w:r>
+        <w:t xml:space="preserve">13. Update a member without losing their history</w:t>
+      </w:r>
+    </w:p>
+    <w:bookmarkStart w:id="86" w:name="say-12"/>
+    <w:p>
+      <w:pPr>
+        <w:pStyle w:val="Heading3"/>
+      </w:pPr>
+      <w:r>
+        <w:t xml:space="preserve">Say</w:t>
+      </w:r>
+    </w:p>
+    <w:p>
+      <w:pPr>
+        <w:pStyle w:val="FirstParagraph"/>
+      </w:pPr>
+      <w:r>
+        <w:t xml:space="preserve">These actions have different purposes. Edit corrects the existing person. Deactivate keeps the person in your records but stops them being selected for new registrations. Show inactive lets you find that person, and Reactivate can bring them back. Remove is an erasure action. If someone may return, keeping the record is generally the useful path. Read the explanation before any removal and ask the office if you are unsure what should be retained.</w:t>
+      </w:r>
+    </w:p>
+    <w:bookmarkEnd w:id="86"/>
+    <w:bookmarkStart w:id="87" w:name="show-or-demonstrate-9"/>
+    <w:p>
+      <w:pPr>
+        <w:pStyle w:val="Heading3"/>
+      </w:pPr>
+      <w:r>
+        <w:t xml:space="preserve">Show or demonstrate</w:t>
+      </w:r>
+    </w:p>
+    <w:p>
+      <w:pPr>
+        <w:pStyle w:val="FirstParagraph"/>
+      </w:pPr>
+      <w:r>
+        <w:t xml:space="preserve">Point out the pencil/Edit action, Save and Deactivate inside the editor. If showing Remove, stop at its explanation and cancel; do not erase a real person for training.</w:t>
+      </w:r>
+    </w:p>
+    <w:bookmarkEnd w:id="87"/>
+    <w:bookmarkStart w:id="89" w:name="preparation-references--not-spoken-12"/>
+    <w:p>
+      <w:pPr>
+        <w:pStyle w:val="Heading3"/>
+      </w:pPr>
+      <w:r>
+        <w:t xml:space="preserve">Preparation references — not spoken</w:t>
+      </w:r>
     </w:p>
     <w:p>
       <w:pPr>
         <w:pStyle w:val="Compact"/>
         <w:numPr>
           <w:ilvl w:val="0"/>
-          <w:numId w:val="1005"/>
+          <w:numId w:val="1013"/>
         </w:numPr>
       </w:pPr>
-      <w:hyperlink r:id="rId31">
+      <w:hyperlink r:id="rId83">
         <w:r>
           <w:rPr>
             <w:rStyle w:val="Hyperlink"/>
           </w:rPr>
-          <w:t xml:space="preserve">Lifecycle display correction</w:t>
+          <w:t xml:space="preserve">components/club-roster-workspace.tsx</w:t>
         </w:r>
       </w:hyperlink>
     </w:p>
@@ -258,26 +1246,36 @@
         <w:pStyle w:val="Compact"/>
         <w:numPr>
           <w:ilvl w:val="0"/>
-          <w:numId w:val="1005"/>
+          <w:numId w:val="1013"/>
         </w:numPr>
       </w:pPr>
-      <w:hyperlink r:id="rId32">
+      <w:hyperlink r:id="rId88">
         <w:r>
           <w:rPr>
             <w:rStyle w:val="Hyperlink"/>
           </w:rPr>
-          <w:t xml:space="preserve">Attendee design</w:t>
+          <w:t xml:space="preserve">modules/club-rosters/repository.ts</w:t>
         </w:r>
       </w:hyperlink>
     </w:p>
-    <w:bookmarkEnd w:id="33"/>
-    <w:bookmarkStart w:id="37" w:name="Xd90f6aad990fccce49b934f922fc7ad1d2f71f9"/>
+    <w:bookmarkEnd w:id="89"/>
+    <w:bookmarkEnd w:id="90"/>
+    <w:bookmarkStart w:id="96" w:name="Xc52b5f8371aa6c4e1c39c48b4c313bee18ce7b1"/>
     <w:p>
       <w:pPr>
         <w:pStyle w:val="Heading2"/>
       </w:pPr>
       <w:r>
-        <w:t xml:space="preserve">6. Directors work from club and year</w:t>
+        <w:t xml:space="preserve">14. Collect and find club forms</w:t>
+      </w:r>
+    </w:p>
+    <w:bookmarkStart w:id="91" w:name="say-13"/>
+    <w:p>
+      <w:pPr>
+        <w:pStyle w:val="Heading3"/>
+      </w:pPr>
+      <w:r>
+        <w:t xml:space="preserve">Say</w:t>
       </w:r>
     </w:p>
     <w:p>
@@ -285,7 +1283,35 @@
         <w:pStyle w:val="FirstParagraph"/>
       </w:pPr>
       <w:r>
-        <w:t xml:space="preserve">Current director work already exists; #1112 is the accepted shell/roster usability follow-up. A registrar is not a director with a different label, and a reporter does not gain roster access. Do not teach the future Help &amp; learning page as a current destination.</w:t>
+        <w:t xml:space="preserve">Forms keeps the club's enabled forms together. A director or deputy can fill in for a member from an appropriate approved source or use the available private-link process. Return to Filled forms to see what came back. Open continues a draft; View and print opens a submitted form. A link can be waiting, expired or submitted, and an email saying sent does not mean the form has been completed.</w:t>
+      </w:r>
+    </w:p>
+    <w:bookmarkEnd w:id="91"/>
+    <w:bookmarkStart w:id="92" w:name="show-or-demonstrate-10"/>
+    <w:p>
+      <w:pPr>
+        <w:pStyle w:val="Heading3"/>
+      </w:pPr>
+      <w:r>
+        <w:t xml:space="preserve">Show or demonstrate</w:t>
+      </w:r>
+    </w:p>
+    <w:p>
+      <w:pPr>
+        <w:pStyle w:val="FirstParagraph"/>
+      </w:pPr>
+      <w:r>
+        <w:t xml:space="preserve">Use an empty or fictitious example without health content. Explain the link option without sending a real request during the presentation.</w:t>
+      </w:r>
+    </w:p>
+    <w:bookmarkEnd w:id="92"/>
+    <w:bookmarkStart w:id="95" w:name="preparation-references--not-spoken-13"/>
+    <w:p>
+      <w:pPr>
+        <w:pStyle w:val="Heading3"/>
+      </w:pPr>
+      <w:r>
+        <w:t xml:space="preserve">Preparation references — not spoken</w:t>
       </w:r>
     </w:p>
     <w:p>
@@ -293,7 +1319,834 @@
         <w:pStyle w:val="Compact"/>
         <w:numPr>
           <w:ilvl w:val="0"/>
-          <w:numId w:val="1006"/>
+          <w:numId w:val="1014"/>
+        </w:numPr>
+      </w:pPr>
+      <w:hyperlink r:id="rId93">
+        <w:r>
+          <w:rPr>
+            <w:rStyle w:val="Hyperlink"/>
+          </w:rPr>
+          <w:t xml:space="preserve">app/(public)/account/(portal)/clubs/[organizationId]/forms/page.tsx</w:t>
+        </w:r>
+      </w:hyperlink>
+    </w:p>
+    <w:p>
+      <w:pPr>
+        <w:pStyle w:val="Compact"/>
+        <w:numPr>
+          <w:ilvl w:val="0"/>
+          <w:numId w:val="1014"/>
+        </w:numPr>
+      </w:pPr>
+      <w:hyperlink r:id="rId94">
+        <w:r>
+          <w:rPr>
+            <w:rStyle w:val="Hyperlink"/>
+          </w:rPr>
+          <w:t xml:space="preserve">modules/club-forms/domain.ts</w:t>
+        </w:r>
+      </w:hyperlink>
+    </w:p>
+    <w:bookmarkEnd w:id="95"/>
+    <w:bookmarkEnd w:id="96"/>
+    <w:bookmarkStart w:id="101" w:name="X528f661813f995f493d06cf5ab7baf3b1e7d69e"/>
+    <w:p>
+      <w:pPr>
+        <w:pStyle w:val="Heading2"/>
+      </w:pPr>
+      <w:r>
+        <w:t xml:space="preserve">15. After a meeting: record it while it is fresh</w:t>
+      </w:r>
+    </w:p>
+    <w:bookmarkStart w:id="97" w:name="say-14"/>
+    <w:p>
+      <w:pPr>
+        <w:pStyle w:val="Heading3"/>
+      </w:pPr>
+      <w:r>
+        <w:t xml:space="preserve">Say</w:t>
+      </w:r>
+    </w:p>
+    <w:p>
+      <w:pPr>
+        <w:pStyle w:val="FirstParagraph"/>
+      </w:pPr>
+      <w:r>
+        <w:t xml:space="preserve">Short notes after a meeting are easier than rebuilding the whole month from memory. Open Monthly Records, choose the month and add a meeting note. Record the date and counts you know. People with roster access may also take name-by-name attendance; that is optional and is not promised to a reporter who cannot open the roster. Save the note so the information is there when you prepare the monthly report.</w:t>
+      </w:r>
+    </w:p>
+    <w:bookmarkEnd w:id="97"/>
+    <w:bookmarkStart w:id="98" w:name="show-or-demonstrate-11"/>
+    <w:p>
+      <w:pPr>
+        <w:pStyle w:val="Heading3"/>
+      </w:pPr>
+      <w:r>
+        <w:t xml:space="preserve">Show or demonstrate</w:t>
+      </w:r>
+    </w:p>
+    <w:p>
+      <w:pPr>
+        <w:pStyle w:val="FirstParagraph"/>
+      </w:pPr>
+      <w:r>
+        <w:t xml:space="preserve">Show Add meeting note and the optional Take attendance control. Keep the distinction between head counts and a named attendance list clear.</w:t>
+      </w:r>
+    </w:p>
+    <w:bookmarkEnd w:id="98"/>
+    <w:bookmarkStart w:id="100" w:name="preparation-references--not-spoken-14"/>
+    <w:p>
+      <w:pPr>
+        <w:pStyle w:val="Heading3"/>
+      </w:pPr>
+      <w:r>
+        <w:t xml:space="preserve">Preparation references — not spoken</w:t>
+      </w:r>
+    </w:p>
+    <w:p>
+      <w:pPr>
+        <w:pStyle w:val="Compact"/>
+        <w:numPr>
+          <w:ilvl w:val="0"/>
+          <w:numId w:val="1015"/>
+        </w:numPr>
+      </w:pPr>
+      <w:hyperlink r:id="rId99">
+        <w:r>
+          <w:rPr>
+            <w:rStyle w:val="Hyperlink"/>
+          </w:rPr>
+          <w:t xml:space="preserve">app/(public)/account/(portal)/clubs/[organizationId]/records/page.tsx</w:t>
+        </w:r>
+      </w:hyperlink>
+    </w:p>
+    <w:bookmarkEnd w:id="100"/>
+    <w:bookmarkEnd w:id="101"/>
+    <w:bookmarkStart w:id="106" w:name="X8d11d05ce30b2503e63d0169b289c59f2866432"/>
+    <w:p>
+      <w:pPr>
+        <w:pStyle w:val="Heading2"/>
+      </w:pPr>
+      <w:r>
+        <w:t xml:space="preserve">16. Finish and submit the Monthly Record</w:t>
+      </w:r>
+    </w:p>
+    <w:bookmarkStart w:id="102" w:name="say-15"/>
+    <w:p>
+      <w:pPr>
+        <w:pStyle w:val="Heading3"/>
+      </w:pPr>
+      <w:r>
+        <w:t xml:space="preserve">Say</w:t>
+      </w:r>
+    </w:p>
+    <w:p>
+      <w:pPr>
+        <w:pStyle w:val="FirstParagraph"/>
+      </w:pPr>
+      <w:r>
+        <w:t xml:space="preserve">Saving a draft and submitting are different actions. Open or continue the Monthly Record, review its details and check the month and due date. The current rule is the tenth of the following month. Meeting notes can help fill the record. If you have already saved the report, changing a note does not silently replace that saved report; use Refresh from meeting notes deliberately if offered. Once you are ready, Submit report and confirm the submitted result. Contact the office if a closed report needs attention.</w:t>
+      </w:r>
+    </w:p>
+    <w:bookmarkEnd w:id="102"/>
+    <w:bookmarkStart w:id="103" w:name="show-or-demonstrate-12"/>
+    <w:p>
+      <w:pPr>
+        <w:pStyle w:val="Heading3"/>
+      </w:pPr>
+      <w:r>
+        <w:t xml:space="preserve">Show or demonstrate</w:t>
+      </w:r>
+    </w:p>
+    <w:p>
+      <w:pPr>
+        <w:pStyle w:val="FirstParagraph"/>
+      </w:pPr>
+      <w:r>
+        <w:t xml:space="preserve">Point out Save draft versus Submit report, and the displayed status. Do not submit a real report as a demonstration.</w:t>
+      </w:r>
+    </w:p>
+    <w:bookmarkEnd w:id="103"/>
+    <w:bookmarkStart w:id="105" w:name="preparation-references--not-spoken-15"/>
+    <w:p>
+      <w:pPr>
+        <w:pStyle w:val="Heading3"/>
+      </w:pPr>
+      <w:r>
+        <w:t xml:space="preserve">Preparation references — not spoken</w:t>
+      </w:r>
+    </w:p>
+    <w:p>
+      <w:pPr>
+        <w:pStyle w:val="Compact"/>
+        <w:numPr>
+          <w:ilvl w:val="0"/>
+          <w:numId w:val="1016"/>
+        </w:numPr>
+      </w:pPr>
+      <w:hyperlink r:id="rId99">
+        <w:r>
+          <w:rPr>
+            <w:rStyle w:val="Hyperlink"/>
+          </w:rPr>
+          <w:t xml:space="preserve">app/(public)/account/(portal)/clubs/[organizationId]/records/page.tsx</w:t>
+        </w:r>
+      </w:hyperlink>
+    </w:p>
+    <w:p>
+      <w:pPr>
+        <w:pStyle w:val="Compact"/>
+        <w:numPr>
+          <w:ilvl w:val="0"/>
+          <w:numId w:val="1016"/>
+        </w:numPr>
+      </w:pPr>
+      <w:hyperlink r:id="rId104">
+        <w:r>
+          <w:rPr>
+            <w:rStyle w:val="Hyperlink"/>
+          </w:rPr>
+          <w:t xml:space="preserve">components/club-report-form.tsx</w:t>
+        </w:r>
+      </w:hyperlink>
+    </w:p>
+    <w:bookmarkEnd w:id="105"/>
+    <w:bookmarkEnd w:id="106"/>
+    <w:bookmarkStart w:id="112" w:name="Xd0eee3d8ce66220a1579c6b6286f5d2a9b8cf64"/>
+    <w:p>
+      <w:pPr>
+        <w:pStyle w:val="Heading2"/>
+      </w:pPr>
+      <w:r>
+        <w:t xml:space="preserve">17. Register the people who are going</w:t>
+      </w:r>
+    </w:p>
+    <w:bookmarkStart w:id="107" w:name="say-16"/>
+    <w:p>
+      <w:pPr>
+        <w:pStyle w:val="Heading3"/>
+      </w:pPr>
+      <w:r>
+        <w:t xml:space="preserve">Say</w:t>
+      </w:r>
+    </w:p>
+    <w:p>
+      <w:pPr>
+        <w:pStyle w:val="FirstParagraph"/>
+      </w:pPr>
+      <w:r>
+        <w:t xml:space="preserve">This is where the roster saves time. Open Club events and use Register or Continue for the event. Choose the people attending rather than assuming everyone on the roster is going. The flow is Who's going, Each person's details and Review. Some draft choices save as you work, but the draft is not a confirmed registration. Review the final state and any full or waitlist explanation. Team events may use Your teams and an additional team form.</w:t>
+      </w:r>
+    </w:p>
+    <w:bookmarkEnd w:id="107"/>
+    <w:bookmarkStart w:id="108" w:name="show-or-demonstrate-13"/>
+    <w:p>
+      <w:pPr>
+        <w:pStyle w:val="Heading3"/>
+      </w:pPr>
+      <w:r>
+        <w:t xml:space="preserve">Show or demonstrate</w:t>
+      </w:r>
+    </w:p>
+    <w:p>
+      <w:pPr>
+        <w:pStyle w:val="FirstParagraph"/>
+      </w:pPr>
+      <w:r>
+        <w:t xml:space="preserve">Use a fictitious training event. Stop at Review unless a training submission has been authorized. Point to the three current step labels.</w:t>
+      </w:r>
+    </w:p>
+    <w:bookmarkEnd w:id="108"/>
+    <w:bookmarkStart w:id="111" w:name="preparation-references--not-spoken-16"/>
+    <w:p>
+      <w:pPr>
+        <w:pStyle w:val="Heading3"/>
+      </w:pPr>
+      <w:r>
+        <w:t xml:space="preserve">Preparation references — not spoken</w:t>
+      </w:r>
+    </w:p>
+    <w:p>
+      <w:pPr>
+        <w:pStyle w:val="Compact"/>
+        <w:numPr>
+          <w:ilvl w:val="0"/>
+          <w:numId w:val="1017"/>
+        </w:numPr>
+      </w:pPr>
+      <w:hyperlink r:id="rId109">
+        <w:r>
+          <w:rPr>
+            <w:rStyle w:val="Hyperlink"/>
+          </w:rPr>
+          <w:t xml:space="preserve">app/(public)/account/(portal)/clubs/[organizationId]/events/page.tsx</w:t>
+        </w:r>
+      </w:hyperlink>
+    </w:p>
+    <w:p>
+      <w:pPr>
+        <w:pStyle w:val="Compact"/>
+        <w:numPr>
+          <w:ilvl w:val="0"/>
+          <w:numId w:val="1017"/>
+        </w:numPr>
+      </w:pPr>
+      <w:hyperlink r:id="rId110">
+        <w:r>
+          <w:rPr>
+            <w:rStyle w:val="Hyperlink"/>
+          </w:rPr>
+          <w:t xml:space="preserve">app/(public)/account/(portal)/clubs/[organizationId]/events/[eventId]/page.tsx</w:t>
+        </w:r>
+      </w:hyperlink>
+    </w:p>
+    <w:bookmarkEnd w:id="111"/>
+    <w:bookmarkEnd w:id="112"/>
+    <w:bookmarkStart w:id="117" w:name="X066482f875196269b5b157e76bc9cef7f338293"/>
+    <w:p>
+      <w:pPr>
+        <w:pStyle w:val="Heading2"/>
+      </w:pPr>
+      <w:r>
+        <w:t xml:space="preserve">18. Return to a registration you already made</w:t>
+      </w:r>
+    </w:p>
+    <w:bookmarkStart w:id="113" w:name="say-17"/>
+    <w:p>
+      <w:pPr>
+        <w:pStyle w:val="Heading3"/>
+      </w:pPr>
+      <w:r>
+        <w:t xml:space="preserve">Say</w:t>
+      </w:r>
+    </w:p>
+    <w:p>
+      <w:pPr>
+        <w:pStyle w:val="FirstParagraph"/>
+      </w:pPr>
+      <w:r>
+        <w:t xml:space="preserve">Return to the saved registration instead of starting another one just to check it. The page shows what was recorded and whether changes are still permitted. If Save changes is offered, use it and check the result. If the edit window is closed, contact the event team. Church-billed events use the sponsoring church's office billing process; submitting as director does not make the director personally responsible for an online balance. The packet and PDF are useful authorized working copies; keep them within the intended audience.</w:t>
+      </w:r>
+    </w:p>
+    <w:bookmarkEnd w:id="113"/>
+    <w:bookmarkStart w:id="114" w:name="show-or-demonstrate-14"/>
+    <w:p>
+      <w:pPr>
+        <w:pStyle w:val="Heading3"/>
+      </w:pPr>
+      <w:r>
+        <w:t xml:space="preserve">Show or demonstrate</w:t>
+      </w:r>
+    </w:p>
+    <w:p>
+      <w:pPr>
+        <w:pStyle w:val="FirstParagraph"/>
+      </w:pPr>
+      <w:r>
+        <w:t xml:space="preserve">Point out View, Save changes if available, Print club packet and Download registration PDF on a fictitious record.</w:t>
+      </w:r>
+    </w:p>
+    <w:bookmarkEnd w:id="114"/>
+    <w:bookmarkStart w:id="116" w:name="preparation-references--not-spoken-17"/>
+    <w:p>
+      <w:pPr>
+        <w:pStyle w:val="Heading3"/>
+      </w:pPr>
+      <w:r>
+        <w:t xml:space="preserve">Preparation references — not spoken</w:t>
+      </w:r>
+    </w:p>
+    <w:p>
+      <w:pPr>
+        <w:pStyle w:val="Compact"/>
+        <w:numPr>
+          <w:ilvl w:val="0"/>
+          <w:numId w:val="1018"/>
+        </w:numPr>
+      </w:pPr>
+      <w:hyperlink r:id="rId110">
+        <w:r>
+          <w:rPr>
+            <w:rStyle w:val="Hyperlink"/>
+          </w:rPr>
+          <w:t xml:space="preserve">app/(public)/account/(portal)/clubs/[organizationId]/events/[eventId]/page.tsx</w:t>
+        </w:r>
+      </w:hyperlink>
+    </w:p>
+    <w:p>
+      <w:pPr>
+        <w:pStyle w:val="Compact"/>
+        <w:numPr>
+          <w:ilvl w:val="0"/>
+          <w:numId w:val="1018"/>
+        </w:numPr>
+      </w:pPr>
+      <w:hyperlink r:id="rId115">
+        <w:r>
+          <w:rPr>
+            <w:rStyle w:val="Hyperlink"/>
+          </w:rPr>
+          <w:t xml:space="preserve">docs/INVOICES.md</w:t>
+        </w:r>
+      </w:hyperlink>
+    </w:p>
+    <w:bookmarkEnd w:id="116"/>
+    <w:bookmarkEnd w:id="117"/>
+    <w:bookmarkStart w:id="124" w:name="X2a53602192278e3afbb6cb54ba9edd206b6dde1"/>
+    <w:p>
+      <w:pPr>
+        <w:pStyle w:val="Heading2"/>
+      </w:pPr>
+      <w:r>
+        <w:t xml:space="preserve">19. Use achievements and supply tools when needed</w:t>
+      </w:r>
+    </w:p>
+    <w:bookmarkStart w:id="118" w:name="say-18"/>
+    <w:p>
+      <w:pPr>
+        <w:pStyle w:val="Heading3"/>
+      </w:pPr>
+      <w:r>
+        <w:t xml:space="preserve">Say</w:t>
+      </w:r>
+    </w:p>
+    <w:p>
+      <w:pPr>
+        <w:pStyle w:val="FirstParagraph"/>
+      </w:pPr>
+      <w:r>
+        <w:t xml:space="preserve">These tools help turn the club's records into useful follow-up. Honors records supported earned honors. Class tracking covers the current class and award items, not a generic checklist of every possible curriculum requirement. Orders is a supply helper and stock/hand-out workflow, not an online store checkout. When you need a roster file, build the export, preview the selected columns and download only the information needed for the task. The options depend on the helper's actual role.</w:t>
+      </w:r>
+    </w:p>
+    <w:bookmarkEnd w:id="118"/>
+    <w:bookmarkStart w:id="119" w:name="show-or-demonstrate-15"/>
+    <w:p>
+      <w:pPr>
+        <w:pStyle w:val="Heading3"/>
+      </w:pPr>
+      <w:r>
+        <w:t xml:space="preserve">Show or demonstrate</w:t>
+      </w:r>
+    </w:p>
+    <w:p>
+      <w:pPr>
+        <w:pStyle w:val="FirstParagraph"/>
+      </w:pPr>
+      <w:r>
+        <w:t xml:space="preserve">Point to Honors → Export CSV or Print report, Orders → Export list (CSV) or Printable list, and Roster → Build a roster export.</w:t>
+      </w:r>
+    </w:p>
+    <w:bookmarkEnd w:id="119"/>
+    <w:bookmarkStart w:id="123" w:name="preparation-references--not-spoken-18"/>
+    <w:p>
+      <w:pPr>
+        <w:pStyle w:val="Heading3"/>
+      </w:pPr>
+      <w:r>
+        <w:t xml:space="preserve">Preparation references — not spoken</w:t>
+      </w:r>
+    </w:p>
+    <w:p>
+      <w:pPr>
+        <w:pStyle w:val="Compact"/>
+        <w:numPr>
+          <w:ilvl w:val="0"/>
+          <w:numId w:val="1019"/>
+        </w:numPr>
+      </w:pPr>
+      <w:hyperlink r:id="rId120">
+        <w:r>
+          <w:rPr>
+            <w:rStyle w:val="Hyperlink"/>
+          </w:rPr>
+          <w:t xml:space="preserve">app/(public)/account/(portal)/clubs/[organizationId]/honors/page.tsx</w:t>
+        </w:r>
+      </w:hyperlink>
+    </w:p>
+    <w:p>
+      <w:pPr>
+        <w:pStyle w:val="Compact"/>
+        <w:numPr>
+          <w:ilvl w:val="0"/>
+          <w:numId w:val="1019"/>
+        </w:numPr>
+      </w:pPr>
+      <w:hyperlink r:id="rId121">
+        <w:r>
+          <w:rPr>
+            <w:rStyle w:val="Hyperlink"/>
+          </w:rPr>
+          <w:t xml:space="preserve">app/(public)/account/(portal)/clubs/[organizationId]/class-tracking/page.tsx</w:t>
+        </w:r>
+      </w:hyperlink>
+    </w:p>
+    <w:p>
+      <w:pPr>
+        <w:pStyle w:val="Compact"/>
+        <w:numPr>
+          <w:ilvl w:val="0"/>
+          <w:numId w:val="1019"/>
+        </w:numPr>
+      </w:pPr>
+      <w:hyperlink r:id="rId122">
+        <w:r>
+          <w:rPr>
+            <w:rStyle w:val="Hyperlink"/>
+          </w:rPr>
+          <w:t xml:space="preserve">app/(public)/account/(portal)/clubs/[organizationId]/orders/page.tsx</w:t>
+        </w:r>
+      </w:hyperlink>
+    </w:p>
+    <w:bookmarkEnd w:id="123"/>
+    <w:bookmarkEnd w:id="124"/>
+    <w:bookmarkStart w:id="128" w:name="X0ffc36b887a07d930830852064e8c973b86bc11"/>
+    <w:p>
+      <w:pPr>
+        <w:pStyle w:val="Heading2"/>
+      </w:pPr>
+      <w:r>
+        <w:t xml:space="preserve">20. Area Coordinators: see progress and offer help</w:t>
+      </w:r>
+    </w:p>
+    <w:bookmarkStart w:id="125" w:name="say-19"/>
+    <w:p>
+      <w:pPr>
+        <w:pStyle w:val="Heading3"/>
+      </w:pPr>
+      <w:r>
+        <w:t xml:space="preserve">Say</w:t>
+      </w:r>
+    </w:p>
+    <w:p>
+      <w:pPr>
+        <w:pStyle w:val="FirstParagraph"/>
+      </w:pPr>
+      <w:r>
+        <w:t xml:space="preserve">The coordinator side helps you understand how clubs are doing and where a director may need support. You use the recorded information rather than requesting another copy of every spreadsheet. Most club detail is view-only. The director maintains their own club records; you review the work, understand the status and follow up on the specific item. Your coordinator tools are not the director's editing menu.</w:t>
+      </w:r>
+    </w:p>
+    <w:bookmarkEnd w:id="125"/>
+    <w:bookmarkStart w:id="126" w:name="show-or-demonstrate-16"/>
+    <w:p>
+      <w:pPr>
+        <w:pStyle w:val="Heading3"/>
+      </w:pPr>
+      <w:r>
+        <w:t xml:space="preserve">Show or demonstrate</w:t>
+      </w:r>
+    </w:p>
+    <w:p>
+      <w:pPr>
+        <w:pStyle w:val="FirstParagraph"/>
+      </w:pPr>
+      <w:r>
+        <w:t xml:space="preserve">From the Area coordinator card choose Clubs overview. Health information is a separate restricted workflow and is not required for this introductory tour.</w:t>
+      </w:r>
+    </w:p>
+    <w:bookmarkEnd w:id="126"/>
+    <w:bookmarkStart w:id="127" w:name="preparation-references--not-spoken-19"/>
+    <w:p>
+      <w:pPr>
+        <w:pStyle w:val="Heading3"/>
+      </w:pPr>
+      <w:r>
+        <w:t xml:space="preserve">Preparation references — not spoken</w:t>
+      </w:r>
+    </w:p>
+    <w:p>
+      <w:pPr>
+        <w:pStyle w:val="Compact"/>
+        <w:numPr>
+          <w:ilvl w:val="0"/>
+          <w:numId w:val="1020"/>
+        </w:numPr>
+      </w:pPr>
+      <w:hyperlink r:id="rId73">
+        <w:r>
+          <w:rPr>
+            <w:rStyle w:val="Hyperlink"/>
+          </w:rPr>
+          <w:t xml:space="preserve">modules/club-reports/area-card-domain.ts</w:t>
+        </w:r>
+      </w:hyperlink>
+    </w:p>
+    <w:p>
+      <w:pPr>
+        <w:pStyle w:val="Compact"/>
+        <w:numPr>
+          <w:ilvl w:val="0"/>
+          <w:numId w:val="1020"/>
+        </w:numPr>
+      </w:pPr>
+      <w:hyperlink r:id="rId24">
+        <w:r>
+          <w:rPr>
+            <w:rStyle w:val="Hyperlink"/>
+          </w:rPr>
+          <w:t xml:space="preserve">components/area-clubs-subnav.tsx</w:t>
+        </w:r>
+      </w:hyperlink>
+    </w:p>
+    <w:bookmarkEnd w:id="127"/>
+    <w:bookmarkEnd w:id="128"/>
+    <w:bookmarkStart w:id="133" w:name="Xd3f08ee959361a0d68d2dc7044dc90e9360125c"/>
+    <w:p>
+      <w:pPr>
+        <w:pStyle w:val="Heading2"/>
+      </w:pPr>
+      <w:r>
+        <w:t xml:space="preserve">21. Find a club and open its information</w:t>
+      </w:r>
+    </w:p>
+    <w:bookmarkStart w:id="129" w:name="say-20"/>
+    <w:p>
+      <w:pPr>
+        <w:pStyle w:val="Heading3"/>
+      </w:pPr>
+      <w:r>
+        <w:t xml:space="preserve">Say</w:t>
+      </w:r>
+    </w:p>
+    <w:p>
+      <w:pPr>
+        <w:pStyle w:val="FirstParagraph"/>
+      </w:pPr>
+      <w:r>
+        <w:t xml:space="preserve">All clubs is useful when you know the club you want. Search by the club name, church or city and choose Open. When you are reviewing another club, the page tells you it is view-only. It shows permitted information such as ages rather than full birth dates. If you are also a director of your own club, that separate director assignment can provide editing there; coordinator access by itself does not provide it. The current list contains active clubs rather than an enforced area-only filter.</w:t>
+      </w:r>
+    </w:p>
+    <w:bookmarkEnd w:id="129"/>
+    <w:bookmarkStart w:id="130" w:name="show-or-demonstrate-17"/>
+    <w:p>
+      <w:pPr>
+        <w:pStyle w:val="Heading3"/>
+      </w:pPr>
+      <w:r>
+        <w:t xml:space="preserve">Show or demonstrate</w:t>
+      </w:r>
+    </w:p>
+    <w:p>
+      <w:pPr>
+        <w:pStyle w:val="FirstParagraph"/>
+      </w:pPr>
+      <w:r>
+        <w:t xml:space="preserve">Search for the fictitious Riverton Pathfinders. Do not show Orders, Club settings or other director-only tools as coordinator options.</w:t>
+      </w:r>
+    </w:p>
+    <w:bookmarkEnd w:id="130"/>
+    <w:bookmarkStart w:id="132" w:name="preparation-references--not-spoken-20"/>
+    <w:p>
+      <w:pPr>
+        <w:pStyle w:val="Heading3"/>
+      </w:pPr>
+      <w:r>
+        <w:t xml:space="preserve">Preparation references — not spoken</w:t>
+      </w:r>
+    </w:p>
+    <w:p>
+      <w:pPr>
+        <w:pStyle w:val="Compact"/>
+        <w:numPr>
+          <w:ilvl w:val="0"/>
+          <w:numId w:val="1021"/>
+        </w:numPr>
+      </w:pPr>
+      <w:hyperlink r:id="rId131">
+        <w:r>
+          <w:rPr>
+            <w:rStyle w:val="Hyperlink"/>
+          </w:rPr>
+          <w:t xml:space="preserve">app/(public)/account/(portal)/clubs/page.tsx</w:t>
+        </w:r>
+      </w:hyperlink>
+    </w:p>
+    <w:p>
+      <w:pPr>
+        <w:pStyle w:val="Compact"/>
+        <w:numPr>
+          <w:ilvl w:val="0"/>
+          <w:numId w:val="1021"/>
+        </w:numPr>
+      </w:pPr>
+      <w:hyperlink r:id="rId23">
+        <w:r>
+          <w:rPr>
+            <w:rStyle w:val="Hyperlink"/>
+          </w:rPr>
+          <w:t xml:space="preserve">modules/club-rosters/portal-nav.ts</w:t>
+        </w:r>
+      </w:hyperlink>
+    </w:p>
+    <w:bookmarkEnd w:id="132"/>
+    <w:bookmarkEnd w:id="133"/>
+    <w:bookmarkStart w:id="139" w:name="Xcfb34107bda2e7a53d36b61768eed28a3cd2cb1"/>
+    <w:p>
+      <w:pPr>
+        <w:pStyle w:val="Heading2"/>
+      </w:pPr>
+      <w:r>
+        <w:t xml:space="preserve">22. Use Overview to choose your follow-up</w:t>
+      </w:r>
+    </w:p>
+    <w:bookmarkStart w:id="134" w:name="say-21"/>
+    <w:p>
+      <w:pPr>
+        <w:pStyle w:val="Heading3"/>
+      </w:pPr>
+      <w:r>
+        <w:t xml:space="preserve">Say</w:t>
+      </w:r>
+    </w:p>
+    <w:p>
+      <w:pPr>
+        <w:pStyle w:val="FirstParagraph"/>
+      </w:pPr>
+      <w:r>
+        <w:t xml:space="preserve">Overview is a starting point, not a list you have to clear by clicking. Check the year in the heading. Review submitted reports, points and the other summaries. Sterling Volunteers is shown as counts here; open the club to understand the permitted adult information. Follow up after you know which month, record or event needs attention. There is no visible year dropdown on these pages, so use the year shown or ask for the appropriate link if it is not the year you need.</w:t>
+      </w:r>
+    </w:p>
+    <w:bookmarkEnd w:id="134"/>
+    <w:bookmarkStart w:id="135" w:name="show-or-demonstrate-18"/>
+    <w:p>
+      <w:pPr>
+        <w:pStyle w:val="Heading3"/>
+      </w:pPr>
+      <w:r>
+        <w:t xml:space="preserve">Show or demonstrate</w:t>
+      </w:r>
+    </w:p>
+    <w:p>
+      <w:pPr>
+        <w:pStyle w:val="FirstParagraph"/>
+      </w:pPr>
+      <w:r>
+        <w:t xml:space="preserve">Point to the year heading, a report count, last report and a club link. Do not invent a Send reminder button or area filter.</w:t>
+      </w:r>
+    </w:p>
+    <w:bookmarkEnd w:id="135"/>
+    <w:bookmarkStart w:id="138" w:name="preparation-references--not-spoken-21"/>
+    <w:p>
+      <w:pPr>
+        <w:pStyle w:val="Heading3"/>
+      </w:pPr>
+      <w:r>
+        <w:t xml:space="preserve">Preparation references — not spoken</w:t>
+      </w:r>
+    </w:p>
+    <w:p>
+      <w:pPr>
+        <w:pStyle w:val="Compact"/>
+        <w:numPr>
+          <w:ilvl w:val="0"/>
+          <w:numId w:val="1022"/>
+        </w:numPr>
+      </w:pPr>
+      <w:hyperlink r:id="rId136">
+        <w:r>
+          <w:rPr>
+            <w:rStyle w:val="Hyperlink"/>
+          </w:rPr>
+          <w:t xml:space="preserve">app/(public)/account/(portal)/area-clubs/overview/page.tsx</w:t>
+        </w:r>
+      </w:hyperlink>
+    </w:p>
+    <w:p>
+      <w:pPr>
+        <w:pStyle w:val="Compact"/>
+        <w:numPr>
+          <w:ilvl w:val="0"/>
+          <w:numId w:val="1022"/>
+        </w:numPr>
+      </w:pPr>
+      <w:hyperlink r:id="rId137">
+        <w:r>
+          <w:rPr>
+            <w:rStyle w:val="Hyperlink"/>
+          </w:rPr>
+          <w:t xml:space="preserve">components/area-clubs-views.tsx</w:t>
+        </w:r>
+      </w:hyperlink>
+    </w:p>
+    <w:bookmarkEnd w:id="138"/>
+    <w:bookmarkEnd w:id="139"/>
+    <w:bookmarkStart w:id="144" w:name="X292aa3a3b26cbedd13b80a79092e187c04d65fa"/>
+    <w:p>
+      <w:pPr>
+        <w:pStyle w:val="Heading2"/>
+      </w:pPr>
+      <w:r>
+        <w:t xml:space="preserve">23. Read Monthly Records and spot unfinished work</w:t>
+      </w:r>
+    </w:p>
+    <w:bookmarkStart w:id="140" w:name="say-22"/>
+    <w:p>
+      <w:pPr>
+        <w:pStyle w:val="Heading3"/>
+      </w:pPr>
+      <w:r>
+        <w:t xml:space="preserve">Say</w:t>
+      </w:r>
+    </w:p>
+    <w:p>
+      <w:pPr>
+        <w:pStyle w:val="FirstParagraph"/>
+      </w:pPr>
+      <w:r>
+        <w:t xml:space="preserve">The monthly grid shows what is on file. A points value links to a submitted report, and a late submission is labelled late. Draft means started but not submitted. Due is not the same as Missing: Missing means the due date has passed without a submitted record. A draft can still display Draft after that date. Future months are not yet due. Read a submitted record when you need the detail, and ask the director about the specific unfinished month rather than entering their report for them.</w:t>
+      </w:r>
+    </w:p>
+    <w:bookmarkEnd w:id="140"/>
+    <w:bookmarkStart w:id="141" w:name="show-or-demonstrate-19"/>
+    <w:p>
+      <w:pPr>
+        <w:pStyle w:val="Heading3"/>
+      </w:pPr>
+      <w:r>
+        <w:t xml:space="preserve">Show or demonstrate</w:t>
+      </w:r>
+    </w:p>
+    <w:p>
+      <w:pPr>
+        <w:pStyle w:val="FirstParagraph"/>
+      </w:pPr>
+      <w:r>
+        <w:t xml:space="preserve">Use a fictitious club/month and contrast Draft with a submitted points link. Explain that the current due date is the tenth of the next month.</w:t>
+      </w:r>
+    </w:p>
+    <w:bookmarkEnd w:id="141"/>
+    <w:bookmarkStart w:id="143" w:name="preparation-references--not-spoken-22"/>
+    <w:p>
+      <w:pPr>
+        <w:pStyle w:val="Heading3"/>
+      </w:pPr>
+      <w:r>
+        <w:t xml:space="preserve">Preparation references — not spoken</w:t>
+      </w:r>
+    </w:p>
+    <w:p>
+      <w:pPr>
+        <w:pStyle w:val="Compact"/>
+        <w:numPr>
+          <w:ilvl w:val="0"/>
+          <w:numId w:val="1023"/>
+        </w:numPr>
+      </w:pPr>
+      <w:hyperlink r:id="rId142">
+        <w:r>
+          <w:rPr>
+            <w:rStyle w:val="Hyperlink"/>
+          </w:rPr>
+          <w:t xml:space="preserve">app/(public)/account/(portal)/area-clubs/reports/page.tsx</w:t>
+        </w:r>
+      </w:hyperlink>
+    </w:p>
+    <w:p>
+      <w:pPr>
+        <w:pStyle w:val="Compact"/>
+        <w:numPr>
+          <w:ilvl w:val="0"/>
+          <w:numId w:val="1023"/>
         </w:numPr>
       </w:pPr>
       <w:hyperlink r:id="rId34">
@@ -301,24 +2154,80 @@
           <w:rPr>
             <w:rStyle w:val="Hyperlink"/>
           </w:rPr>
-          <w:t xml:space="preserve">Club capabilities</w:t>
+          <w:t xml:space="preserve">modules/club-reports/area-summary-domain.ts</w:t>
         </w:r>
       </w:hyperlink>
+    </w:p>
+    <w:bookmarkEnd w:id="143"/>
+    <w:bookmarkEnd w:id="144"/>
+    <w:bookmarkStart w:id="150" w:name="Xb8015f9a0ea1c5e0467d502c128f8ff18f6c7a6"/>
+    <w:p>
+      <w:pPr>
+        <w:pStyle w:val="Heading2"/>
+      </w:pPr>
+      <w:r>
+        <w:t xml:space="preserve">24. Understand points and the downloaded file</w:t>
+      </w:r>
+    </w:p>
+    <w:bookmarkStart w:id="145" w:name="say-23"/>
+    <w:p>
+      <w:pPr>
+        <w:pStyle w:val="Heading3"/>
+      </w:pPr>
+      <w:r>
+        <w:t xml:space="preserve">Say</w:t>
+      </w:r>
+    </w:p>
+    <w:p>
+      <w:pPr>
+        <w:pStyle w:val="FirstParagraph"/>
+      </w:pPr>
+      <w:r>
+        <w:t xml:space="preserve">Points gives you a chart and a table. Submitted report points and the yearly registration points are shown separately so a total can be explained. Under the current rule, an on-time yearly registration contributes fifteen hundred points. Search can narrow what you see, while the rank is based on the full list. Download points CSV includes the whole year's authorized clubs. Do not send that file expecting it to contain only the name search shown on your screen.</w:t>
+      </w:r>
+    </w:p>
+    <w:bookmarkEnd w:id="145"/>
+    <w:bookmarkStart w:id="146" w:name="show-or-demonstrate-20"/>
+    <w:p>
+      <w:pPr>
+        <w:pStyle w:val="Heading3"/>
+      </w:pPr>
+      <w:r>
+        <w:t xml:space="preserve">Show or demonstrate</w:t>
+      </w:r>
+    </w:p>
+    <w:p>
+      <w:pPr>
+        <w:pStyle w:val="FirstParagraph"/>
+      </w:pPr>
+      <w:r>
+        <w:t xml:space="preserve">Point out the separate points components, sort controls and Download points CSV. Overview also offers the summary and points downloads.</w:t>
+      </w:r>
+    </w:p>
+    <w:bookmarkEnd w:id="146"/>
+    <w:bookmarkStart w:id="149" w:name="preparation-references--not-spoken-23"/>
+    <w:p>
+      <w:pPr>
+        <w:pStyle w:val="Heading3"/>
+      </w:pPr>
+      <w:r>
+        <w:t xml:space="preserve">Preparation references — not spoken</w:t>
+      </w:r>
     </w:p>
     <w:p>
       <w:pPr>
         <w:pStyle w:val="Compact"/>
         <w:numPr>
           <w:ilvl w:val="0"/>
-          <w:numId w:val="1006"/>
+          <w:numId w:val="1024"/>
         </w:numPr>
       </w:pPr>
-      <w:hyperlink r:id="rId35">
+      <w:hyperlink r:id="rId147">
         <w:r>
           <w:rPr>
             <w:rStyle w:val="Hyperlink"/>
           </w:rPr>
-          <w:t xml:space="preserve">Director design</w:t>
+          <w:t xml:space="preserve">app/(public)/account/(portal)/area-clubs/points/page.tsx</w:t>
         </w:r>
       </w:hyperlink>
     </w:p>
@@ -327,26 +2236,36 @@
         <w:pStyle w:val="Compact"/>
         <w:numPr>
           <w:ilvl w:val="0"/>
-          <w:numId w:val="1006"/>
+          <w:numId w:val="1024"/>
         </w:numPr>
       </w:pPr>
-      <w:hyperlink r:id="rId36">
+      <w:hyperlink r:id="rId148">
         <w:r>
           <w:rPr>
             <w:rStyle w:val="Hyperlink"/>
           </w:rPr>
-          <w:t xml:space="preserve">Invoicing</w:t>
+          <w:t xml:space="preserve">modules/club-reports/area-export.ts</w:t>
         </w:r>
       </w:hyperlink>
     </w:p>
-    <w:bookmarkEnd w:id="37"/>
-    <w:bookmarkStart w:id="41" w:name="X03bf34be927cb9421de1e056c6cb99e94a1133c"/>
+    <w:bookmarkEnd w:id="149"/>
+    <w:bookmarkEnd w:id="150"/>
+    <w:bookmarkStart w:id="155" w:name="Xf6af70e0f73be9708d5693dbadd0f0fae14a70d"/>
     <w:p>
       <w:pPr>
         <w:pStyle w:val="Heading2"/>
       </w:pPr>
       <w:r>
-        <w:t xml:space="preserve">7. Coordinators need oversight, not a director clone</w:t>
+        <w:t xml:space="preserve">25. Check which clubs are going to an event</w:t>
+      </w:r>
+    </w:p>
+    <w:bookmarkStart w:id="151" w:name="say-24"/>
+    <w:p>
+      <w:pPr>
+        <w:pStyle w:val="Heading3"/>
+      </w:pPr>
+      <w:r>
+        <w:t xml:space="preserve">Say</w:t>
       </w:r>
     </w:p>
     <w:p>
@@ -354,7 +2273,35 @@
         <w:pStyle w:val="FirstParagraph"/>
       </w:pPr>
       <w:r>
-        <w:t xml:space="preserve">#840/#843 describe the later ministry scope. The accepted future direction is whole-ministry visibility for now, but it is not the current enforced predicate. Current health sheets and the encrypted Pathfinder Health Record are different sources with different guards.</w:t>
+        <w:t xml:space="preserve">Club events helps you see participation. The roster tells you who belongs to a club; this view tells you whether a club is registered for an event and the number included. Read the actual state. A draft is not a completed registration, a waitlist is not a confirmed place and a cancelled record is history. If you search the club rows, the event total can still describe the whole event. This is oversight of participation, not permission to submit every club's registration.</w:t>
+      </w:r>
+    </w:p>
+    <w:bookmarkEnd w:id="151"/>
+    <w:bookmarkStart w:id="152" w:name="show-or-demonstrate-21"/>
+    <w:p>
+      <w:pPr>
+        <w:pStyle w:val="Heading3"/>
+      </w:pPr>
+      <w:r>
+        <w:t xml:space="preserve">Show or demonstrate</w:t>
+      </w:r>
+    </w:p>
+    <w:p>
+      <w:pPr>
+        <w:pStyle w:val="FirstParagraph"/>
+      </w:pPr>
+      <w:r>
+        <w:t xml:space="preserve">Point out status, headcount and event total using fictitious records. Use the director’s normal process for corrections.</w:t>
+      </w:r>
+    </w:p>
+    <w:bookmarkEnd w:id="152"/>
+    <w:bookmarkStart w:id="154" w:name="preparation-references--not-spoken-24"/>
+    <w:p>
+      <w:pPr>
+        <w:pStyle w:val="Heading3"/>
+      </w:pPr>
+      <w:r>
+        <w:t xml:space="preserve">Preparation references — not spoken</w:t>
       </w:r>
     </w:p>
     <w:p>
@@ -362,15 +2309,15 @@
         <w:pStyle w:val="Compact"/>
         <w:numPr>
           <w:ilvl w:val="0"/>
-          <w:numId w:val="1007"/>
+          <w:numId w:val="1025"/>
         </w:numPr>
       </w:pPr>
-      <w:hyperlink r:id="rId38">
+      <w:hyperlink r:id="rId153">
         <w:r>
           <w:rPr>
             <w:rStyle w:val="Hyperlink"/>
           </w:rPr>
-          <w:t xml:space="preserve">Coordinator design</w:t>
+          <w:t xml:space="preserve">app/(public)/account/(portal)/area-clubs/events/page.tsx</w:t>
         </w:r>
       </w:hyperlink>
     </w:p>
@@ -379,84 +2326,178 @@
         <w:pStyle w:val="Compact"/>
         <w:numPr>
           <w:ilvl w:val="0"/>
-          <w:numId w:val="1007"/>
+          <w:numId w:val="1025"/>
         </w:numPr>
       </w:pPr>
-      <w:hyperlink r:id="rId39">
+      <w:hyperlink r:id="rId137">
         <w:r>
           <w:rPr>
             <w:rStyle w:val="Hyperlink"/>
           </w:rPr>
-          <w:t xml:space="preserve">Future ministry scope</w:t>
+          <w:t xml:space="preserve">components/area-clubs-views.tsx</w:t>
         </w:r>
       </w:hyperlink>
+    </w:p>
+    <w:bookmarkEnd w:id="154"/>
+    <w:bookmarkEnd w:id="155"/>
+    <w:bookmarkStart w:id="161" w:name="Xc9ad2f1f4b96e424f4a5c568344b7ebd2709f58"/>
+    <w:p>
+      <w:pPr>
+        <w:pStyle w:val="Heading2"/>
+      </w:pPr>
+      <w:r>
+        <w:t xml:space="preserve">26. Know the two special review pages</w:t>
+      </w:r>
+    </w:p>
+    <w:bookmarkStart w:id="156" w:name="say-25"/>
+    <w:p>
+      <w:pPr>
+        <w:pStyle w:val="Heading3"/>
+      </w:pPr>
+      <w:r>
+        <w:t xml:space="preserve">Say</w:t>
+      </w:r>
+    </w:p>
+    <w:p>
+      <w:pPr>
+        <w:pStyle w:val="FirstParagraph"/>
+      </w:pPr>
+      <w:r>
+        <w:t xml:space="preserve">Most coordinator work is view-only. Team approvals is a specific exception. It concerns the team-member requests for your event locations, with the current event's age and eligibility rules shown on the page. Read the request before approving or declining. A decline tells the director what needs correction; it does not automatically remove the person. New clubs is a different review page. You may read the application, but the conference administrator approves or declines it.</w:t>
+      </w:r>
+    </w:p>
+    <w:bookmarkEnd w:id="156"/>
+    <w:bookmarkStart w:id="157" w:name="show-or-demonstrate-22"/>
+    <w:p>
+      <w:pPr>
+        <w:pStyle w:val="Heading3"/>
+      </w:pPr>
+      <w:r>
+        <w:t xml:space="preserve">Show or demonstrate</w:t>
+      </w:r>
+    </w:p>
+    <w:p>
+      <w:pPr>
+        <w:pStyle w:val="FirstParagraph"/>
+      </w:pPr>
+      <w:r>
+        <w:t xml:space="preserve">Use a fictitious team request and stop before a real decision. A staff support act-as view cannot substitute for the real coordinator’s decision authority.</w:t>
+      </w:r>
+    </w:p>
+    <w:bookmarkEnd w:id="157"/>
+    <w:bookmarkStart w:id="160" w:name="preparation-references--not-spoken-25"/>
+    <w:p>
+      <w:pPr>
+        <w:pStyle w:val="Heading3"/>
+      </w:pPr>
+      <w:r>
+        <w:t xml:space="preserve">Preparation references — not spoken</w:t>
+      </w:r>
     </w:p>
     <w:p>
       <w:pPr>
         <w:pStyle w:val="Compact"/>
         <w:numPr>
           <w:ilvl w:val="0"/>
-          <w:numId w:val="1007"/>
+          <w:numId w:val="1026"/>
         </w:numPr>
       </w:pPr>
-      <w:hyperlink r:id="rId40">
+      <w:hyperlink r:id="rId158">
         <w:r>
           <w:rPr>
             <w:rStyle w:val="Hyperlink"/>
           </w:rPr>
-          <w:t xml:space="preserve">Health policy</w:t>
+          <w:t xml:space="preserve">app/(public)/account/(portal)/area-clubs/team-permissions/page.tsx</w:t>
         </w:r>
       </w:hyperlink>
-    </w:p>
-    <w:bookmarkEnd w:id="41"/>
-    <w:bookmarkStart w:id="45" w:name="X2ebaf2dbd4eb38e57ddb5818c543578997da3f5"/>
-    <w:p>
-      <w:pPr>
-        <w:pStyle w:val="Heading2"/>
-      </w:pPr>
-      <w:r>
-        <w:t xml:space="preserve">8. Administrator training should follow real work</w:t>
-      </w:r>
-    </w:p>
-    <w:p>
-      <w:pPr>
-        <w:pStyle w:val="FirstParagraph"/>
-      </w:pPr>
-      <w:r>
-        <w:t xml:space="preserve">The left column names existing responsibilities. The right column summarizes accepted design direction in #1073–#1077 and should not be presented as fully shipped. These documents preserve the agreed administrator menu; later page mockup sidebars do not redefine it.</w:t>
-      </w:r>
     </w:p>
     <w:p>
       <w:pPr>
         <w:pStyle w:val="Compact"/>
         <w:numPr>
           <w:ilvl w:val="0"/>
-          <w:numId w:val="1008"/>
+          <w:numId w:val="1026"/>
         </w:numPr>
       </w:pPr>
-      <w:hyperlink r:id="rId42">
+      <w:hyperlink r:id="rId159">
         <w:r>
           <w:rPr>
             <w:rStyle w:val="Hyperlink"/>
           </w:rPr>
-          <w:t xml:space="preserve">Admin design owner</w:t>
+          <w:t xml:space="preserve">app/(public)/account/(portal)/area-clubs/applications/page.tsx</w:t>
         </w:r>
       </w:hyperlink>
+    </w:p>
+    <w:bookmarkEnd w:id="160"/>
+    <w:bookmarkEnd w:id="161"/>
+    <w:bookmarkStart w:id="165" w:name="Xd3afaa29dec5382063592397f9692313620943d"/>
+    <w:p>
+      <w:pPr>
+        <w:pStyle w:val="Heading2"/>
+      </w:pPr>
+      <w:r>
+        <w:t xml:space="preserve">27. A coordinator example: follow one missing item</w:t>
+      </w:r>
+    </w:p>
+    <w:bookmarkStart w:id="162" w:name="say-26"/>
+    <w:p>
+      <w:pPr>
+        <w:pStyle w:val="Heading3"/>
+      </w:pPr>
+      <w:r>
+        <w:t xml:space="preserve">Say</w:t>
+      </w:r>
+    </w:p>
+    <w:p>
+      <w:pPr>
+        <w:pStyle w:val="FirstParagraph"/>
+      </w:pPr>
+      <w:r>
+        <w:t xml:space="preserve">Imagine Overview suggests that Riverton needs attention. I open Monthly Records and find October. I check whether it is a draft, missing, or a submitted report I can read. Then I contact the director about that particular record and ask what help is needed. Before an event, I can use the same habit in Club events. This follow-up is a conversation through the normal conference process; the overview has not automatically sent a reminder or completed the report.</w:t>
+      </w:r>
+    </w:p>
+    <w:bookmarkEnd w:id="162"/>
+    <w:bookmarkStart w:id="163" w:name="ask-the-group-3"/>
+    <w:p>
+      <w:pPr>
+        <w:pStyle w:val="Heading3"/>
+      </w:pPr>
+      <w:r>
+        <w:t xml:space="preserve">Ask the group</w:t>
+      </w:r>
+    </w:p>
+    <w:p>
+      <w:pPr>
+        <w:pStyle w:val="FirstParagraph"/>
+      </w:pPr>
+      <w:r>
+        <w:t xml:space="preserve">If the record says Draft, what is the useful next question for the director?</w:t>
+      </w:r>
+    </w:p>
+    <w:bookmarkEnd w:id="163"/>
+    <w:bookmarkStart w:id="164" w:name="preparation-references--not-spoken-26"/>
+    <w:p>
+      <w:pPr>
+        <w:pStyle w:val="Heading3"/>
+      </w:pPr>
+      <w:r>
+        <w:t xml:space="preserve">Preparation references — not spoken</w:t>
+      </w:r>
     </w:p>
     <w:p>
       <w:pPr>
         <w:pStyle w:val="Compact"/>
         <w:numPr>
           <w:ilvl w:val="0"/>
-          <w:numId w:val="1008"/>
+          <w:numId w:val="1027"/>
         </w:numPr>
       </w:pPr>
-      <w:hyperlink r:id="rId43">
+      <w:hyperlink r:id="rId137">
         <w:r>
           <w:rPr>
             <w:rStyle w:val="Hyperlink"/>
           </w:rPr>
-          <w:t xml:space="preserve">Navigation owner</w:t>
+          <w:t xml:space="preserve">components/area-clubs-views.tsx</w:t>
         </w:r>
       </w:hyperlink>
     </w:p>
@@ -465,26 +2506,36 @@
         <w:pStyle w:val="Compact"/>
         <w:numPr>
           <w:ilvl w:val="0"/>
-          <w:numId w:val="1008"/>
+          <w:numId w:val="1027"/>
         </w:numPr>
       </w:pPr>
-      <w:hyperlink r:id="rId44">
+      <w:hyperlink r:id="rId34">
         <w:r>
           <w:rPr>
             <w:rStyle w:val="Hyperlink"/>
           </w:rPr>
-          <w:t xml:space="preserve">Dashboard owner</w:t>
+          <w:t xml:space="preserve">modules/club-reports/area-summary-domain.ts</w:t>
         </w:r>
       </w:hyperlink>
     </w:p>
-    <w:bookmarkEnd w:id="45"/>
-    <w:bookmarkStart w:id="50" w:name="Xc72fb8e7be21cae560736cc3f6b2f50ed7f122a"/>
+    <w:bookmarkEnd w:id="164"/>
+    <w:bookmarkEnd w:id="165"/>
+    <w:bookmarkStart w:id="169" w:name="X53f8c90db63dcf6bba06359d007f2178b63e4dc"/>
     <w:p>
       <w:pPr>
         <w:pStyle w:val="Heading2"/>
       </w:pPr>
       <w:r>
-        <w:t xml:space="preserve">9. Form reuse has several distinct meanings</w:t>
+        <w:t xml:space="preserve">28. Build a simple working rhythm</w:t>
+      </w:r>
+    </w:p>
+    <w:bookmarkStart w:id="166" w:name="say-27"/>
+    <w:p>
+      <w:pPr>
+        <w:pStyle w:val="Heading3"/>
+      </w:pPr>
+      <w:r>
+        <w:t xml:space="preserve">Say</w:t>
       </w:r>
     </w:p>
     <w:p>
@@ -492,7 +2543,35 @@
         <w:pStyle w:val="FirstParagraph"/>
       </w:pPr>
       <w:r>
-        <w:t xml:space="preserve">The form-builder foundation sequence is #1063, then #1064, then #1065. The latest October 20 decision permits those foundation slices before the separate visual review for steps 3–6. First-publish-only builder testing and draft replacement from a template are delivered. Do not confuse a form configuration copy with copying reservations, people or health records.</w:t>
+        <w:t xml:space="preserve">You do not need to explore every page every day. A director can keep the roster current, add notes while meetings are fresh and make time to finish the Monthly Record. Before an event, review who is going. A coordinator can begin with the summaries, open the item that needs attention and make a focused follow-up. These are suggested working habits, not a new reporting policy or an automatic schedule.</w:t>
+      </w:r>
+    </w:p>
+    <w:bookmarkEnd w:id="166"/>
+    <w:bookmarkStart w:id="167" w:name="ask-the-group-4"/>
+    <w:p>
+      <w:pPr>
+        <w:pStyle w:val="Heading3"/>
+      </w:pPr>
+      <w:r>
+        <w:t xml:space="preserve">Ask the group</w:t>
+      </w:r>
+    </w:p>
+    <w:p>
+      <w:pPr>
+        <w:pStyle w:val="FirstParagraph"/>
+      </w:pPr>
+      <w:r>
+        <w:t xml:space="preserve">Which part of this routine would be easiest to build into your normal club work?</w:t>
+      </w:r>
+    </w:p>
+    <w:bookmarkEnd w:id="167"/>
+    <w:bookmarkStart w:id="168" w:name="preparation-references--not-spoken-27"/>
+    <w:p>
+      <w:pPr>
+        <w:pStyle w:val="Heading3"/>
+      </w:pPr>
+      <w:r>
+        <w:t xml:space="preserve">Preparation references — not spoken</w:t>
       </w:r>
     </w:p>
     <w:p>
@@ -500,15 +2579,15 @@
         <w:pStyle w:val="Compact"/>
         <w:numPr>
           <w:ilvl w:val="0"/>
-          <w:numId w:val="1009"/>
+          <w:numId w:val="1028"/>
         </w:numPr>
       </w:pPr>
-      <w:hyperlink r:id="rId46">
+      <w:hyperlink r:id="rId23">
         <w:r>
           <w:rPr>
             <w:rStyle w:val="Hyperlink"/>
           </w:rPr>
-          <w:t xml:space="preserve">Builder epic</w:t>
+          <w:t xml:space="preserve">modules/club-rosters/portal-nav.ts</w:t>
         </w:r>
       </w:hyperlink>
     </w:p>
@@ -517,32 +2596,88 @@
         <w:pStyle w:val="Compact"/>
         <w:numPr>
           <w:ilvl w:val="0"/>
-          <w:numId w:val="1009"/>
+          <w:numId w:val="1028"/>
         </w:numPr>
       </w:pPr>
-      <w:hyperlink r:id="rId47">
+      <w:hyperlink r:id="rId24">
         <w:r>
           <w:rPr>
             <w:rStyle w:val="Hyperlink"/>
           </w:rPr>
-          <w:t xml:space="preserve">Editable templates</w:t>
+          <w:t xml:space="preserve">components/area-clubs-subnav.tsx</w:t>
         </w:r>
       </w:hyperlink>
+    </w:p>
+    <w:bookmarkEnd w:id="168"/>
+    <w:bookmarkEnd w:id="169"/>
+    <w:bookmarkStart w:id="174" w:name="X5a5c2bf307e7661d93740e8ed1592def6a8c817"/>
+    <w:p>
+      <w:pPr>
+        <w:pStyle w:val="Heading2"/>
+      </w:pPr>
+      <w:r>
+        <w:t xml:space="preserve">29. If something is missing or not working</w:t>
+      </w:r>
+    </w:p>
+    <w:bookmarkStart w:id="170" w:name="say-28"/>
+    <w:p>
+      <w:pPr>
+        <w:pStyle w:val="Heading3"/>
+      </w:pPr>
+      <w:r>
+        <w:t xml:space="preserve">Say</w:t>
+      </w:r>
+    </w:p>
+    <w:p>
+      <w:pPr>
+        <w:pStyle w:val="FirstParagraph"/>
+      </w:pPr>
+      <w:r>
+        <w:t xml:space="preserve">If you cannot remember the password, use Forgot password and request the email code. Return in the same browser, enter the code and new password, then Set new password. If sign-in works but your club is missing, check the email shown and ask the office about the invitation or assignment; do not create another account. If you need support for a page, describe the task and visible error. Leave passwords, codes, private links and member health details out of screenshots and messages.</w:t>
+      </w:r>
+    </w:p>
+    <w:bookmarkEnd w:id="170"/>
+    <w:bookmarkStart w:id="171" w:name="show-or-demonstrate-23"/>
+    <w:p>
+      <w:pPr>
+        <w:pStyle w:val="Heading3"/>
+      </w:pPr>
+      <w:r>
+        <w:t xml:space="preserve">Show or demonstrate</w:t>
+      </w:r>
+    </w:p>
+    <w:p>
+      <w:pPr>
+        <w:pStyle w:val="FirstParagraph"/>
+      </w:pPr>
+      <w:r>
+        <w:t xml:space="preserve">Point to Forgot password? and the authenticator help link. Use the conference’s existing support route; no new support address is introduced by this deck.</w:t>
+      </w:r>
+    </w:p>
+    <w:bookmarkEnd w:id="171"/>
+    <w:bookmarkStart w:id="173" w:name="preparation-references--not-spoken-28"/>
+    <w:p>
+      <w:pPr>
+        <w:pStyle w:val="Heading3"/>
+      </w:pPr>
+      <w:r>
+        <w:t xml:space="preserve">Preparation references — not spoken</w:t>
+      </w:r>
     </w:p>
     <w:p>
       <w:pPr>
         <w:pStyle w:val="Compact"/>
         <w:numPr>
           <w:ilvl w:val="0"/>
-          <w:numId w:val="1009"/>
+          <w:numId w:val="1029"/>
         </w:numPr>
       </w:pPr>
-      <w:hyperlink r:id="rId48">
+      <w:hyperlink r:id="rId172">
         <w:r>
           <w:rPr>
             <w:rStyle w:val="Hyperlink"/>
           </w:rPr>
-          <w:t xml:space="preserve">Template provenance</w:t>
+          <w:t xml:space="preserve">components/attendee-password-reset-form.tsx</w:t>
         </w:r>
       </w:hyperlink>
     </w:p>
@@ -551,369 +2686,7 @@
         <w:pStyle w:val="Compact"/>
         <w:numPr>
           <w:ilvl w:val="0"/>
-          <w:numId w:val="1009"/>
-        </w:numPr>
-      </w:pPr>
-      <w:hyperlink r:id="rId49">
-        <w:r>
-          <w:rPr>
-            <w:rStyle w:val="Hyperlink"/>
-          </w:rPr>
-          <w:t xml:space="preserve">Saved questions</w:t>
-        </w:r>
-      </w:hyperlink>
-    </w:p>
-    <w:bookmarkEnd w:id="50"/>
-    <w:bookmarkStart w:id="55" w:name="Xf53856c978d1404f8a4827bf3590a5df1fe77bb"/>
-    <w:p>
-      <w:pPr>
-        <w:pStyle w:val="Heading2"/>
-      </w:pPr>
-      <w:r>
-        <w:t xml:space="preserve">10. Operations depend on distinct records and states</w:t>
-      </w:r>
-    </w:p>
-    <w:p>
-      <w:pPr>
-        <w:pStyle w:val="FirstParagraph"/>
-      </w:pPr>
-      <w:r>
-        <w:t xml:space="preserve">Kitchen scanner import1028 and count entry1029 are delivered;212 now retains money closeout and exceptions. The current Sterling policy keeps registration/login/roster available while gating applicable adult/staff check-in at youth/children events, with an audited override and adult-event clarification.</w:t>
-      </w:r>
-    </w:p>
-    <w:p>
-      <w:pPr>
-        <w:pStyle w:val="Compact"/>
-        <w:numPr>
-          <w:ilvl w:val="0"/>
-          <w:numId w:val="1010"/>
-        </w:numPr>
-      </w:pPr>
-      <w:hyperlink r:id="rId51">
-        <w:r>
-          <w:rPr>
-            <w:rStyle w:val="Hyperlink"/>
-          </w:rPr>
-          <w:t xml:space="preserve">Meals</w:t>
-        </w:r>
-      </w:hyperlink>
-    </w:p>
-    <w:p>
-      <w:pPr>
-        <w:pStyle w:val="Compact"/>
-        <w:numPr>
-          <w:ilvl w:val="0"/>
-          <w:numId w:val="1010"/>
-        </w:numPr>
-      </w:pPr>
-      <w:hyperlink r:id="rId52">
-        <w:r>
-          <w:rPr>
-            <w:rStyle w:val="Hyperlink"/>
-          </w:rPr>
-          <w:t xml:space="preserve">Kitchen residual</w:t>
-        </w:r>
-      </w:hyperlink>
-    </w:p>
-    <w:p>
-      <w:pPr>
-        <w:pStyle w:val="Compact"/>
-        <w:numPr>
-          <w:ilvl w:val="0"/>
-          <w:numId w:val="1010"/>
-        </w:numPr>
-      </w:pPr>
-      <w:hyperlink r:id="rId53">
-        <w:r>
-          <w:rPr>
-            <w:rStyle w:val="Hyperlink"/>
-          </w:rPr>
-          <w:t xml:space="preserve">Screening rule</w:t>
-        </w:r>
-      </w:hyperlink>
-    </w:p>
-    <w:p>
-      <w:pPr>
-        <w:pStyle w:val="Compact"/>
-        <w:numPr>
-          <w:ilvl w:val="0"/>
-          <w:numId w:val="1010"/>
-        </w:numPr>
-      </w:pPr>
-      <w:hyperlink r:id="rId54">
-        <w:r>
-          <w:rPr>
-            <w:rStyle w:val="Hyperlink"/>
-          </w:rPr>
-          <w:t xml:space="preserve">Future ledger</w:t>
-        </w:r>
-      </w:hyperlink>
-    </w:p>
-    <w:bookmarkEnd w:id="55"/>
-    <w:bookmarkStart w:id="59" w:name="X88d38c0d627658b82f92b4e97f9b308238b0c16"/>
-    <w:p>
-      <w:pPr>
-        <w:pStyle w:val="Heading2"/>
-      </w:pPr>
-      <w:r>
-        <w:t xml:space="preserve">11. Accessibility has a useful existing foundation</w:t>
-      </w:r>
-    </w:p>
-    <w:p>
-      <w:pPr>
-        <w:pStyle w:val="FirstParagraph"/>
-      </w:pPr>
-      <w:r>
-        <w:t xml:space="preserve">The review is a source/specification synthesis with clearly identified historical visual references. Read the usability document for concrete findings, related WCAG guidance and verification limits. A successful layout test is useful evidence but not a screen-reader or production usability session.</w:t>
-      </w:r>
-    </w:p>
-    <w:p>
-      <w:pPr>
-        <w:pStyle w:val="Compact"/>
-        <w:numPr>
-          <w:ilvl w:val="0"/>
-          <w:numId w:val="1011"/>
-        </w:numPr>
-      </w:pPr>
-      <w:hyperlink r:id="rId56">
-        <w:r>
-          <w:rPr>
-            <w:rStyle w:val="Hyperlink"/>
-          </w:rPr>
-          <w:t xml:space="preserve">Responsive conventions</w:t>
-        </w:r>
-      </w:hyperlink>
-    </w:p>
-    <w:p>
-      <w:pPr>
-        <w:pStyle w:val="Compact"/>
-        <w:numPr>
-          <w:ilvl w:val="0"/>
-          <w:numId w:val="1011"/>
-        </w:numPr>
-      </w:pPr>
-      <w:hyperlink r:id="rId57">
-        <w:r>
-          <w:rPr>
-            <w:rStyle w:val="Hyperlink"/>
-          </w:rPr>
-          <w:t xml:space="preserve">Current design review</w:t>
-        </w:r>
-      </w:hyperlink>
-    </w:p>
-    <w:p>
-      <w:pPr>
-        <w:pStyle w:val="Compact"/>
-        <w:numPr>
-          <w:ilvl w:val="0"/>
-          <w:numId w:val="1011"/>
-        </w:numPr>
-      </w:pPr>
-      <w:hyperlink r:id="rId58">
-        <w:r>
-          <w:rPr>
-            <w:rStyle w:val="Hyperlink"/>
-          </w:rPr>
-          <w:t xml:space="preserve">Open test resilience work</w:t>
-        </w:r>
-      </w:hyperlink>
-    </w:p>
-    <w:bookmarkEnd w:id="59"/>
-    <w:bookmarkStart w:id="63" w:name="X9525a3648aa0333ad2b186c6377e3ce67f5e157"/>
-    <w:p>
-      <w:pPr>
-        <w:pStyle w:val="Heading2"/>
-      </w:pPr>
-      <w:r>
-        <w:t xml:space="preserve">12. Fix confusing behavior before adding more surface</w:t>
-      </w:r>
-    </w:p>
-    <w:p>
-      <w:pPr>
-        <w:pStyle w:val="FirstParagraph"/>
-      </w:pPr>
-      <w:r>
-        <w:t xml:space="preserve">These are existing open issues, not newly discovered production incidents. The companion review explains reproducible source behavior, user impact and acceptance examples. This slide does not reprioritize the canonical queue.</w:t>
-      </w:r>
-    </w:p>
-    <w:p>
-      <w:pPr>
-        <w:pStyle w:val="Compact"/>
-        <w:numPr>
-          <w:ilvl w:val="0"/>
-          <w:numId w:val="1012"/>
-        </w:numPr>
-      </w:pPr>
-      <w:hyperlink r:id="rId57">
-        <w:r>
-          <w:rPr>
-            <w:rStyle w:val="Hyperlink"/>
-          </w:rPr>
-          <w:t xml:space="preserve">Review and ownership</w:t>
-        </w:r>
-      </w:hyperlink>
-    </w:p>
-    <w:p>
-      <w:pPr>
-        <w:pStyle w:val="Compact"/>
-        <w:numPr>
-          <w:ilvl w:val="0"/>
-          <w:numId w:val="1012"/>
-        </w:numPr>
-      </w:pPr>
-      <w:hyperlink r:id="rId60">
-        <w:r>
-          <w:rPr>
-            <w:rStyle w:val="Hyperlink"/>
-          </w:rPr>
-          <w:t xml:space="preserve">Saved links</w:t>
-        </w:r>
-      </w:hyperlink>
-    </w:p>
-    <w:p>
-      <w:pPr>
-        <w:pStyle w:val="Compact"/>
-        <w:numPr>
-          <w:ilvl w:val="0"/>
-          <w:numId w:val="1012"/>
-        </w:numPr>
-      </w:pPr>
-      <w:hyperlink r:id="rId61">
-        <w:r>
-          <w:rPr>
-            <w:rStyle w:val="Hyperlink"/>
-          </w:rPr>
-          <w:t xml:space="preserve">Dirty roster</w:t>
-        </w:r>
-      </w:hyperlink>
-    </w:p>
-    <w:p>
-      <w:pPr>
-        <w:pStyle w:val="Compact"/>
-        <w:numPr>
-          <w:ilvl w:val="0"/>
-          <w:numId w:val="1012"/>
-        </w:numPr>
-      </w:pPr>
-      <w:hyperlink r:id="rId62">
-        <w:r>
-          <w:rPr>
-            <w:rStyle w:val="Hyperlink"/>
-          </w:rPr>
-          <w:t xml:space="preserve">Tablet overflow</w:t>
-        </w:r>
-      </w:hyperlink>
-    </w:p>
-    <w:bookmarkEnd w:id="63"/>
-    <w:bookmarkStart w:id="65" w:name="X33b5867f5c6220c7dc3f037b28dd41f55e9a9be"/>
-    <w:p>
-      <w:pPr>
-        <w:pStyle w:val="Heading2"/>
-      </w:pPr>
-      <w:r>
-        <w:t xml:space="preserve">13. Accepted design is a reference, not a shipped screen</w:t>
-      </w:r>
-    </w:p>
-    <w:p>
-      <w:pPr>
-        <w:pStyle w:val="FirstParagraph"/>
-      </w:pPr>
-      <w:r>
-        <w:t xml:space="preserve">These two images are synthetic accepted role-workspace mockups from the existing reference pack. They are not production screenshots. Their accepted role separation and the existing navigation owners remain authoritative. No additional administrator menu changes are proposed by this briefing.</w:t>
-      </w:r>
-    </w:p>
-    <w:p>
-      <w:pPr>
-        <w:pStyle w:val="Compact"/>
-        <w:numPr>
-          <w:ilvl w:val="0"/>
-          <w:numId w:val="1013"/>
-        </w:numPr>
-      </w:pPr>
-      <w:hyperlink r:id="rId64">
-        <w:r>
-          <w:rPr>
-            <w:rStyle w:val="Hyperlink"/>
-          </w:rPr>
-          <w:t xml:space="preserve">Accepted role gallery</w:t>
-        </w:r>
-      </w:hyperlink>
-    </w:p>
-    <w:p>
-      <w:pPr>
-        <w:pStyle w:val="Compact"/>
-        <w:numPr>
-          <w:ilvl w:val="0"/>
-          <w:numId w:val="1013"/>
-        </w:numPr>
-      </w:pPr>
-      <w:hyperlink r:id="rId35">
-        <w:r>
-          <w:rPr>
-            <w:rStyle w:val="Hyperlink"/>
-          </w:rPr>
-          <w:t xml:space="preserve">Director owner</w:t>
-        </w:r>
-      </w:hyperlink>
-    </w:p>
-    <w:p>
-      <w:pPr>
-        <w:pStyle w:val="Compact"/>
-        <w:numPr>
-          <w:ilvl w:val="0"/>
-          <w:numId w:val="1013"/>
-        </w:numPr>
-      </w:pPr>
-      <w:hyperlink r:id="rId42">
-        <w:r>
-          <w:rPr>
-            <w:rStyle w:val="Hyperlink"/>
-          </w:rPr>
-          <w:t xml:space="preserve">Admin owner</w:t>
-        </w:r>
-      </w:hyperlink>
-    </w:p>
-    <w:bookmarkEnd w:id="65"/>
-    <w:bookmarkStart w:id="68" w:name="Xf218f15e4628929ad623ad5a3b571eda020d4df"/>
-    <w:p>
-      <w:pPr>
-        <w:pStyle w:val="Heading2"/>
-      </w:pPr>
-      <w:r>
-        <w:t xml:space="preserve">14. Help should answer a task in plain language</w:t>
-      </w:r>
-    </w:p>
-    <w:p>
-      <w:pPr>
-        <w:pStyle w:val="FirstParagraph"/>
-      </w:pPr>
-      <w:r>
-        <w:t xml:space="preserve">The help kit is prepared content, not a new Help screen. Draft messages are not sent. Before operational use, check audience, source state, current permission and any event-specific wording. Never place private management links, health details or sensitive records into a general support discussion.</w:t>
-      </w:r>
-    </w:p>
-    <w:p>
-      <w:pPr>
-        <w:pStyle w:val="Compact"/>
-        <w:numPr>
-          <w:ilvl w:val="0"/>
-          <w:numId w:val="1014"/>
-        </w:numPr>
-      </w:pPr>
-      <w:hyperlink r:id="rId66">
-        <w:r>
-          <w:rPr>
-            <w:rStyle w:val="Hyperlink"/>
-          </w:rPr>
-          <w:t xml:space="preserve">Current communications templates</w:t>
-        </w:r>
-      </w:hyperlink>
-    </w:p>
-    <w:p>
-      <w:pPr>
-        <w:pStyle w:val="Compact"/>
-        <w:numPr>
-          <w:ilvl w:val="0"/>
-          <w:numId w:val="1014"/>
+          <w:numId w:val="1029"/>
         </w:numPr>
       </w:pPr>
       <w:hyperlink r:id="rId67">
@@ -921,18 +2694,28 @@
           <w:rPr>
             <w:rStyle w:val="Hyperlink"/>
           </w:rPr>
-          <w:t xml:space="preserve">Future Help owner</w:t>
+          <w:t xml:space="preserve">app/(public)/account/help/authenticator/page.tsx</w:t>
         </w:r>
       </w:hyperlink>
     </w:p>
-    <w:bookmarkEnd w:id="68"/>
-    <w:bookmarkStart w:id="72" w:name="X21d85676f194b2c8b8dfd546595b07fe2278e2f"/>
+    <w:bookmarkEnd w:id="173"/>
+    <w:bookmarkEnd w:id="174"/>
+    <w:bookmarkStart w:id="179" w:name="X0b22c93d0a4f31914b77102e0a93e163517ce77"/>
     <w:p>
       <w:pPr>
         <w:pStyle w:val="Heading2"/>
       </w:pPr>
       <w:r>
-        <w:t xml:space="preserve">15. Future possibilities extend the foundation</w:t>
+        <w:t xml:space="preserve">30. Finish safely and return next time</w:t>
+      </w:r>
+    </w:p>
+    <w:bookmarkStart w:id="175" w:name="say-29"/>
+    <w:p>
+      <w:pPr>
+        <w:pStyle w:val="Heading3"/>
+      </w:pPr>
+      <w:r>
+        <w:t xml:space="preserve">Say</w:t>
       </w:r>
     </w:p>
     <w:p>
@@ -940,7 +2723,35 @@
         <w:pStyle w:val="FirstParagraph"/>
       </w:pPr>
       <w:r>
-        <w:t xml:space="preserve">These groups summarize existing issues; they are not a newly ordered roadmap. Each has different maturity and gates. Do not promise dates, automatically enable vendors or treat conference-level approval of one narrow feature as approval of every adjacent parent.</w:t>
+        <w:t xml:space="preserve">Before leaving, check the result of the task you were doing. A saved draft means you can continue; Submitted means the report was sent; an event registration has its own confirmation and status. Then choose Sign out, especially on a shared computer. Closing the browser tab is not the same action. Next time, return to the website and use the account you already have.</w:t>
+      </w:r>
+    </w:p>
+    <w:bookmarkEnd w:id="175"/>
+    <w:bookmarkStart w:id="176" w:name="show-or-demonstrate-24"/>
+    <w:p>
+      <w:pPr>
+        <w:pStyle w:val="Heading3"/>
+      </w:pPr>
+      <w:r>
+        <w:t xml:space="preserve">Show or demonstrate</w:t>
+      </w:r>
+    </w:p>
+    <w:p>
+      <w:pPr>
+        <w:pStyle w:val="FirstParagraph"/>
+      </w:pPr>
+      <w:r>
+        <w:t xml:space="preserve">Point to Sign out without displaying another person’s session or credentials.</w:t>
+      </w:r>
+    </w:p>
+    <w:bookmarkEnd w:id="176"/>
+    <w:bookmarkStart w:id="178" w:name="preparation-references--not-spoken-29"/>
+    <w:p>
+      <w:pPr>
+        <w:pStyle w:val="Heading3"/>
+      </w:pPr>
+      <w:r>
+        <w:t xml:space="preserve">Preparation references — not spoken</w:t>
       </w:r>
     </w:p>
     <w:p>
@@ -948,7 +2759,80 @@
         <w:pStyle w:val="Compact"/>
         <w:numPr>
           <w:ilvl w:val="0"/>
-          <w:numId w:val="1015"/>
+          <w:numId w:val="1030"/>
+        </w:numPr>
+      </w:pPr>
+      <w:hyperlink r:id="rId177">
+        <w:r>
+          <w:rPr>
+            <w:rStyle w:val="Hyperlink"/>
+          </w:rPr>
+          <w:t xml:space="preserve">components/attendee-sign-out-button.tsx</w:t>
+        </w:r>
+      </w:hyperlink>
+    </w:p>
+    <w:bookmarkEnd w:id="178"/>
+    <w:bookmarkEnd w:id="179"/>
+    <w:bookmarkStart w:id="183" w:name="X146092d4b4cf40915b41242be2c83bbd2ec5de4"/>
+    <w:p>
+      <w:pPr>
+        <w:pStyle w:val="Heading2"/>
+      </w:pPr>
+      <w:r>
+        <w:t xml:space="preserve">31. The three things to remember</w:t>
+      </w:r>
+    </w:p>
+    <w:bookmarkStart w:id="180" w:name="say-30"/>
+    <w:p>
+      <w:pPr>
+        <w:pStyle w:val="Heading3"/>
+      </w:pPr>
+      <w:r>
+        <w:t xml:space="preserve">Say</w:t>
+      </w:r>
+    </w:p>
+    <w:p>
+      <w:pPr>
+        <w:pStyle w:val="FirstParagraph"/>
+      </w:pPr>
+      <w:r>
+        <w:t xml:space="preserve">The goal is not to memorize every menu today. Remember your own account, the right club or coordinator context, and the result of the task. Directors keep the club's information up to date. Coordinators use that information to understand progress and offer help. You can come back to the guides when you need the exact steps.</w:t>
+      </w:r>
+    </w:p>
+    <w:bookmarkEnd w:id="180"/>
+    <w:bookmarkStart w:id="181" w:name="ask-the-group-5"/>
+    <w:p>
+      <w:pPr>
+        <w:pStyle w:val="Heading3"/>
+      </w:pPr>
+      <w:r>
+        <w:t xml:space="preserve">Ask the group</w:t>
+      </w:r>
+    </w:p>
+    <w:p>
+      <w:pPr>
+        <w:pStyle w:val="FirstParagraph"/>
+      </w:pPr>
+      <w:r>
+        <w:t xml:space="preserve">Invite questions about a task people need to do next. Use the quick-start handout for sign-in and role-specific reminders.</w:t>
+      </w:r>
+    </w:p>
+    <w:bookmarkEnd w:id="181"/>
+    <w:bookmarkStart w:id="182" w:name="preparation-references--not-spoken-30"/>
+    <w:p>
+      <w:pPr>
+        <w:pStyle w:val="Heading3"/>
+      </w:pPr>
+      <w:r>
+        <w:t xml:space="preserve">Preparation references — not spoken</w:t>
+      </w:r>
+    </w:p>
+    <w:p>
+      <w:pPr>
+        <w:pStyle w:val="Compact"/>
+        <w:numPr>
+          <w:ilvl w:val="0"/>
+          <w:numId w:val="1031"/>
         </w:numPr>
       </w:pPr>
       <w:hyperlink r:id="rId22">
@@ -956,7 +2840,7 @@
           <w:rPr>
             <w:rStyle w:val="Hyperlink"/>
           </w:rPr>
-          <w:t xml:space="preserve">Ordered roadmap</w:t>
+          <w:t xml:space="preserve">app/page.tsx</w:t>
         </w:r>
       </w:hyperlink>
     </w:p>
@@ -965,590 +2849,7 @@
         <w:pStyle w:val="Compact"/>
         <w:numPr>
           <w:ilvl w:val="0"/>
-          <w:numId w:val="1015"/>
-        </w:numPr>
-      </w:pPr>
-      <w:hyperlink r:id="rId69">
-        <w:r>
-          <w:rPr>
-            <w:rStyle w:val="Hyperlink"/>
-          </w:rPr>
-          <w:t xml:space="preserve">Comparison index</w:t>
-        </w:r>
-      </w:hyperlink>
-    </w:p>
-    <w:p>
-      <w:pPr>
-        <w:pStyle w:val="Compact"/>
-        <w:numPr>
-          <w:ilvl w:val="0"/>
-          <w:numId w:val="1015"/>
-        </w:numPr>
-      </w:pPr>
-      <w:hyperlink r:id="rId70">
-        <w:r>
-          <w:rPr>
-            <w:rStyle w:val="Hyperlink"/>
-          </w:rPr>
-          <w:t xml:space="preserve">Adventurers</w:t>
-        </w:r>
-      </w:hyperlink>
-    </w:p>
-    <w:p>
-      <w:pPr>
-        <w:pStyle w:val="Compact"/>
-        <w:numPr>
-          <w:ilvl w:val="0"/>
-          <w:numId w:val="1015"/>
-        </w:numPr>
-      </w:pPr>
-      <w:hyperlink r:id="rId71">
-        <w:r>
-          <w:rPr>
-            <w:rStyle w:val="Hyperlink"/>
-          </w:rPr>
-          <w:t xml:space="preserve">Future site builder</w:t>
-        </w:r>
-      </w:hyperlink>
-    </w:p>
-    <w:bookmarkEnd w:id="72"/>
-    <w:bookmarkStart w:id="76" w:name="X07bc5e2791f1296c85452d5fdafdeeb1c735f68"/>
-    <w:p>
-      <w:pPr>
-        <w:pStyle w:val="Heading2"/>
-      </w:pPr>
-      <w:r>
-        <w:t xml:space="preserve">16. A full youth-camp system needs more than events</w:t>
-      </w:r>
-    </w:p>
-    <w:p>
-      <w:pPr>
-        <w:pStyle w:val="FirstParagraph"/>
-      </w:pPr>
-      <w:r>
-        <w:t xml:space="preserve">Conference Camp Meeting and residential youth/summer camp are different operating models. Existing lodging beds do not by themselves create a counselor/camper supervision model. The separate camp report maps capability, authoritative records and human policy to existing owners. Missing evidence is marked unknown, not asserted absent from UltraCamp.</w:t>
-      </w:r>
-    </w:p>
-    <w:p>
-      <w:pPr>
-        <w:pStyle w:val="Compact"/>
-        <w:numPr>
-          <w:ilvl w:val="0"/>
-          <w:numId w:val="1016"/>
-        </w:numPr>
-      </w:pPr>
-      <w:hyperlink r:id="rId73">
-        <w:r>
-          <w:rPr>
-            <w:rStyle w:val="Hyperlink"/>
-          </w:rPr>
-          <w:t xml:space="preserve">Camp report companion</w:t>
-        </w:r>
-      </w:hyperlink>
-    </w:p>
-    <w:p>
-      <w:pPr>
-        <w:pStyle w:val="Compact"/>
-        <w:numPr>
-          <w:ilvl w:val="0"/>
-          <w:numId w:val="1016"/>
-        </w:numPr>
-      </w:pPr>
-      <w:hyperlink r:id="rId74">
-        <w:r>
-          <w:rPr>
-            <w:rStyle w:val="Hyperlink"/>
-          </w:rPr>
-          <w:t xml:space="preserve">Legacy operations</w:t>
-        </w:r>
-      </w:hyperlink>
-    </w:p>
-    <w:p>
-      <w:pPr>
-        <w:pStyle w:val="Compact"/>
-        <w:numPr>
-          <w:ilvl w:val="0"/>
-          <w:numId w:val="1016"/>
-        </w:numPr>
-      </w:pPr>
-      <w:hyperlink r:id="rId75">
-        <w:r>
-          <w:rPr>
-            <w:rStyle w:val="Hyperlink"/>
-          </w:rPr>
-          <w:t xml:space="preserve">UltraCamp scope</w:t>
-        </w:r>
-      </w:hyperlink>
-    </w:p>
-    <w:bookmarkEnd w:id="76"/>
-    <w:bookmarkStart w:id="78" w:name="X2ac4241fd8df3a13665a1731cdc42335265a945"/>
-    <w:p>
-      <w:pPr>
-        <w:pStyle w:val="Heading2"/>
-      </w:pPr>
-      <w:r>
-        <w:t xml:space="preserve">17. What we need from UltraCamp</w:t>
-      </w:r>
-    </w:p>
-    <w:p>
-      <w:pPr>
-        <w:pStyle w:val="FirstParagraph"/>
-      </w:pPr>
-      <w:r>
-        <w:t xml:space="preserve">This is a draft information request for the owner to use; nothing is sent to UltraCamp. Ask the camp operator and vendor for synthetic/blank examples, not live camper exports. Public documentation gaps do not prove there is no supported interface. All UltraCamp implementation stays Phase 5 under the existing owner decision.</w:t>
-      </w:r>
-    </w:p>
-    <w:p>
-      <w:pPr>
-        <w:pStyle w:val="Compact"/>
-        <w:numPr>
-          <w:ilvl w:val="0"/>
-          <w:numId w:val="1017"/>
-        </w:numPr>
-      </w:pPr>
-      <w:hyperlink r:id="rId75">
-        <w:r>
-          <w:rPr>
-            <w:rStyle w:val="Hyperlink"/>
-          </w:rPr>
-          <w:t xml:space="preserve">Existing UltraCamp research</w:t>
-        </w:r>
-      </w:hyperlink>
-    </w:p>
-    <w:p>
-      <w:pPr>
-        <w:pStyle w:val="Compact"/>
-        <w:numPr>
-          <w:ilvl w:val="0"/>
-          <w:numId w:val="1017"/>
-        </w:numPr>
-      </w:pPr>
-      <w:hyperlink r:id="rId77">
-        <w:r>
-          <w:rPr>
-            <w:rStyle w:val="Hyperlink"/>
-          </w:rPr>
-          <w:t xml:space="preserve">Health discovery index</w:t>
-        </w:r>
-      </w:hyperlink>
-    </w:p>
-    <w:p>
-      <w:pPr>
-        <w:pStyle w:val="Compact"/>
-        <w:numPr>
-          <w:ilvl w:val="0"/>
-          <w:numId w:val="1017"/>
-        </w:numPr>
-      </w:pPr>
-      <w:hyperlink r:id="rId22">
-        <w:r>
-          <w:rPr>
-            <w:rStyle w:val="Hyperlink"/>
-          </w:rPr>
-          <w:t xml:space="preserve">Phase order</w:t>
-        </w:r>
-      </w:hyperlink>
-    </w:p>
-    <w:bookmarkEnd w:id="78"/>
-    <w:bookmarkStart w:id="82" w:name="X40c52e3d065d2054cfc70be4d04fdc166e057ba"/>
-    <w:p>
-      <w:pPr>
-        <w:pStyle w:val="Heading2"/>
-      </w:pPr>
-      <w:r>
-        <w:t xml:space="preserve">18. The code is a modular monolith</w:t>
-      </w:r>
-    </w:p>
-    <w:p>
-      <w:pPr>
-        <w:pStyle w:val="FirstParagraph"/>
-      </w:pPr>
-      <w:r>
-        <w:t xml:space="preserve">The technical report includes a deeper module/data-flow map and code references. Staff User and AttendeeAccount remain linked1:1 with separate authentication boundaries. Current payment/refund/adjustment/invoice records are not the future generalized ledger. Protected domains have narrower guards than ordinary event access.</w:t>
-      </w:r>
-    </w:p>
-    <w:p>
-      <w:pPr>
-        <w:pStyle w:val="Compact"/>
-        <w:numPr>
-          <w:ilvl w:val="0"/>
-          <w:numId w:val="1018"/>
-        </w:numPr>
-      </w:pPr>
-      <w:hyperlink r:id="rId79">
-        <w:r>
-          <w:rPr>
-            <w:rStyle w:val="Hyperlink"/>
-          </w:rPr>
-          <w:t xml:space="preserve">Automation guide</w:t>
-        </w:r>
-      </w:hyperlink>
-    </w:p>
-    <w:p>
-      <w:pPr>
-        <w:pStyle w:val="Compact"/>
-        <w:numPr>
-          <w:ilvl w:val="0"/>
-          <w:numId w:val="1018"/>
-        </w:numPr>
-      </w:pPr>
-      <w:hyperlink r:id="rId80">
-        <w:r>
-          <w:rPr>
-            <w:rStyle w:val="Hyperlink"/>
-          </w:rPr>
-          <w:t xml:space="preserve">Schema</w:t>
-        </w:r>
-      </w:hyperlink>
-    </w:p>
-    <w:p>
-      <w:pPr>
-        <w:pStyle w:val="Compact"/>
-        <w:numPr>
-          <w:ilvl w:val="0"/>
-          <w:numId w:val="1018"/>
-        </w:numPr>
-      </w:pPr>
-      <w:hyperlink r:id="rId81">
-        <w:r>
-          <w:rPr>
-            <w:rStyle w:val="Hyperlink"/>
-          </w:rPr>
-          <w:t xml:space="preserve">Architecture ADR</w:t>
-        </w:r>
-      </w:hyperlink>
-    </w:p>
-    <w:bookmarkEnd w:id="82"/>
-    <w:bookmarkStart w:id="85" w:name="Xd9401ab4b4668ec5161118bf55e5b2f72be7c74"/>
-    <w:p>
-      <w:pPr>
-        <w:pStyle w:val="Heading2"/>
-      </w:pPr>
-      <w:r>
-        <w:t xml:space="preserve">19. There is measured verification evidence</w:t>
-      </w:r>
-    </w:p>
-    <w:p>
-      <w:pPr>
-        <w:pStyle w:val="FirstParagraph"/>
-      </w:pPr>
-      <w:r>
-        <w:t xml:space="preserve">Exact current main push run 39609956369, job 119260142581, commit 5e367b7c. The skipped backup-script test requires root; the CI runner is nonroot. The full verify job is intentionally skipped on main push; extended database/HTTP evidence is recorded separately for application PR head 9879edba. The app/scripts/workflows are identical between that head and this baseline; the intervening 58 paths are all documentation. These are CI results, not deployment verification.</w:t>
-      </w:r>
-    </w:p>
-    <w:p>
-      <w:pPr>
-        <w:pStyle w:val="Compact"/>
-        <w:numPr>
-          <w:ilvl w:val="0"/>
-          <w:numId w:val="1019"/>
-        </w:numPr>
-      </w:pPr>
-      <w:hyperlink r:id="rId83">
-        <w:r>
-          <w:rPr>
-            <w:rStyle w:val="Hyperlink"/>
-          </w:rPr>
-          <w:t xml:space="preserve">Current main CI run</w:t>
-        </w:r>
-      </w:hyperlink>
-    </w:p>
-    <w:p>
-      <w:pPr>
-        <w:pStyle w:val="Compact"/>
-        <w:numPr>
-          <w:ilvl w:val="0"/>
-          <w:numId w:val="1019"/>
-        </w:numPr>
-      </w:pPr>
-      <w:hyperlink r:id="rId84">
-        <w:r>
-          <w:rPr>
-            <w:rStyle w:val="Hyperlink"/>
-          </w:rPr>
-          <w:t xml:space="preserve">Last application verification</w:t>
-        </w:r>
-      </w:hyperlink>
-    </w:p>
-    <w:bookmarkEnd w:id="85"/>
-    <w:bookmarkStart w:id="89" w:name="Xb8d247165316c3ceb593e59f8a656cf86c6fec8"/>
-    <w:p>
-      <w:pPr>
-        <w:pStyle w:val="Heading2"/>
-      </w:pPr>
-      <w:r>
-        <w:t xml:space="preserve">20. Know what those checks do not prove</w:t>
-      </w:r>
-    </w:p>
-    <w:p>
-      <w:pPr>
-        <w:pStyle w:val="FirstParagraph"/>
-      </w:pPr>
-      <w:r>
-        <w:t xml:space="preserve">The mobile run is 39520478915; it opened 301 dialogs and checked 1,871 fields plus 56 date fields, with 0 accepted findings and 0 page script errors. Screenshots were disabled, so the report is evidence but not a visual screenshot archive. Badge run 39520473962 is automated evidence, not a real printer test. Existing readiness/rehearsal documents remain the owner of human steps; this deck does not recreate them.</w:t>
-      </w:r>
-    </w:p>
-    <w:p>
-      <w:pPr>
-        <w:pStyle w:val="Compact"/>
-        <w:numPr>
-          <w:ilvl w:val="0"/>
-          <w:numId w:val="1020"/>
-        </w:numPr>
-      </w:pPr>
-      <w:hyperlink r:id="rId86">
-        <w:r>
-          <w:rPr>
-            <w:rStyle w:val="Hyperlink"/>
-          </w:rPr>
-          <w:t xml:space="preserve">Mobile run</w:t>
-        </w:r>
-      </w:hyperlink>
-    </w:p>
-    <w:p>
-      <w:pPr>
-        <w:pStyle w:val="Compact"/>
-        <w:numPr>
-          <w:ilvl w:val="0"/>
-          <w:numId w:val="1020"/>
-        </w:numPr>
-      </w:pPr>
-      <w:hyperlink r:id="rId87">
-        <w:r>
-          <w:rPr>
-            <w:rStyle w:val="Hyperlink"/>
-          </w:rPr>
-          <w:t xml:space="preserve">Badge run</w:t>
-        </w:r>
-      </w:hyperlink>
-    </w:p>
-    <w:p>
-      <w:pPr>
-        <w:pStyle w:val="Compact"/>
-        <w:numPr>
-          <w:ilvl w:val="0"/>
-          <w:numId w:val="1020"/>
-        </w:numPr>
-      </w:pPr>
-      <w:hyperlink r:id="rId88">
-        <w:r>
-          <w:rPr>
-            <w:rStyle w:val="Hyperlink"/>
-          </w:rPr>
-          <w:t xml:space="preserve">Readiness evidence</w:t>
-        </w:r>
-      </w:hyperlink>
-    </w:p>
-    <w:bookmarkEnd w:id="89"/>
-    <w:bookmarkStart w:id="94" w:name="X81641c3d87f5309bf9df47d90e81d8890568c55"/>
-    <w:p>
-      <w:pPr>
-        <w:pStyle w:val="Heading2"/>
-      </w:pPr>
-      <w:r>
-        <w:t xml:space="preserve">21. Build on the materials already in Git</w:t>
-      </w:r>
-    </w:p>
-    <w:p>
-      <w:pPr>
-        <w:pStyle w:val="FirstParagraph"/>
-      </w:pPr>
-      <w:r>
-        <w:t xml:space="preserve">This responds to the owner’s correction: the project already has rehearsals, decision records, import preparation and PDF/CSV/JSON outputs. The new feature guide provides an index into them. It does not create another competing decision register, importer or go-live checklist.</w:t>
-      </w:r>
-    </w:p>
-    <w:p>
-      <w:pPr>
-        <w:pStyle w:val="Compact"/>
-        <w:numPr>
-          <w:ilvl w:val="0"/>
-          <w:numId w:val="1021"/>
-        </w:numPr>
-      </w:pPr>
-      <w:hyperlink r:id="rId90">
-        <w:r>
-          <w:rPr>
-            <w:rStyle w:val="Hyperlink"/>
-          </w:rPr>
-          <w:t xml:space="preserve">Existing docs</w:t>
-        </w:r>
-      </w:hyperlink>
-    </w:p>
-    <w:p>
-      <w:pPr>
-        <w:pStyle w:val="Compact"/>
-        <w:numPr>
-          <w:ilvl w:val="0"/>
-          <w:numId w:val="1021"/>
-        </w:numPr>
-      </w:pPr>
-      <w:hyperlink r:id="rId91">
-        <w:r>
-          <w:rPr>
-            <w:rStyle w:val="Hyperlink"/>
-          </w:rPr>
-          <w:t xml:space="preserve">Import references</w:t>
-        </w:r>
-      </w:hyperlink>
-    </w:p>
-    <w:p>
-      <w:pPr>
-        <w:pStyle w:val="Compact"/>
-        <w:numPr>
-          <w:ilvl w:val="0"/>
-          <w:numId w:val="1021"/>
-        </w:numPr>
-      </w:pPr>
-      <w:hyperlink r:id="rId92">
-        <w:r>
-          <w:rPr>
-            <w:rStyle w:val="Hyperlink"/>
-          </w:rPr>
-          <w:t xml:space="preserve">Sample registration PDF</w:t>
-        </w:r>
-      </w:hyperlink>
-    </w:p>
-    <w:p>
-      <w:pPr>
-        <w:pStyle w:val="Compact"/>
-        <w:numPr>
-          <w:ilvl w:val="0"/>
-          <w:numId w:val="1021"/>
-        </w:numPr>
-      </w:pPr>
-      <w:hyperlink r:id="rId93">
-        <w:r>
-          <w:rPr>
-            <w:rStyle w:val="Hyperlink"/>
-          </w:rPr>
-          <w:t xml:space="preserve">Public/list studies</w:t>
-        </w:r>
-      </w:hyperlink>
-    </w:p>
-    <w:bookmarkEnd w:id="94"/>
-    <w:bookmarkStart w:id="95" w:name="X491f6d091536f4de1d7b89b558b07c7d92394e7"/>
-    <w:p>
-      <w:pPr>
-        <w:pStyle w:val="Heading2"/>
-      </w:pPr>
-      <w:r>
-        <w:t xml:space="preserve">22. Use the pack for explanation and review</w:t>
-      </w:r>
-    </w:p>
-    <w:p>
-      <w:pPr>
-        <w:pStyle w:val="FirstParagraph"/>
-      </w:pPr>
-      <w:r>
-        <w:t xml:space="preserve">The deliverables are documentation. Application code, menus, roles, queues and production switches are unchanged. Future implementation continues from #98 and its existing bounded issues. Use the README to select the right document for the audience.</w:t>
-      </w:r>
-    </w:p>
-    <w:p>
-      <w:pPr>
-        <w:pStyle w:val="Compact"/>
-        <w:numPr>
-          <w:ilvl w:val="0"/>
-          <w:numId w:val="1022"/>
-        </w:numPr>
-      </w:pPr>
-      <w:hyperlink r:id="rId69">
-        <w:r>
-          <w:rPr>
-            <w:rStyle w:val="Hyperlink"/>
-          </w:rPr>
-          <w:t xml:space="preserve">Backlog review index</w:t>
-        </w:r>
-      </w:hyperlink>
-    </w:p>
-    <w:p>
-      <w:pPr>
-        <w:pStyle w:val="Compact"/>
-        <w:numPr>
-          <w:ilvl w:val="0"/>
-          <w:numId w:val="1022"/>
-        </w:numPr>
-      </w:pPr>
-      <w:hyperlink r:id="rId22">
-        <w:r>
-          <w:rPr>
-            <w:rStyle w:val="Hyperlink"/>
-          </w:rPr>
-          <w:t xml:space="preserve">Canonical queue</w:t>
-        </w:r>
-      </w:hyperlink>
-    </w:p>
-    <w:bookmarkEnd w:id="95"/>
-    <w:bookmarkStart w:id="96" w:name="Xdc832b029264ccdfd56051c99131943222c18a2"/>
-    <w:p>
-      <w:pPr>
-        <w:pStyle w:val="Heading2"/>
-      </w:pPr>
-      <w:r>
-        <w:t xml:space="preserve">23. Source notes and further reading</w:t>
-      </w:r>
-    </w:p>
-    <w:p>
-      <w:pPr>
-        <w:pStyle w:val="FirstParagraph"/>
-      </w:pPr>
-      <w:r>
-        <w:t xml:space="preserve">Primary source baseline</w:t>
-      </w:r>
-      <w:r>
-        <w:t xml:space="preserve"> </w:t>
-      </w:r>
-      <w:hyperlink r:id="rId20">
-        <w:r>
-          <w:rPr>
-            <w:rStyle w:val="Hyperlink"/>
-          </w:rPr>
-          <w:t xml:space="preserve">https://github.com/DurantTL/IMSDA-Events/commit/5e367b7c4d1b3c173d37c0415e335be76170b300</w:t>
-        </w:r>
-      </w:hyperlink>
-      <w:r>
-        <w:t xml:space="preserve">. The generated documents cite stable source paths and live issue owners. External references are evidence at the dates stated, not a promise about vendor entitlement. This deck uses synthetic accepted design screenshots only, clearly labelled.</w:t>
-      </w:r>
-    </w:p>
-    <w:p>
-      <w:pPr>
-        <w:pStyle w:val="Compact"/>
-        <w:numPr>
-          <w:ilvl w:val="0"/>
-          <w:numId w:val="1023"/>
-        </w:numPr>
-      </w:pPr>
-      <w:hyperlink r:id="rId22">
-        <w:r>
-          <w:rPr>
-            <w:rStyle w:val="Hyperlink"/>
-          </w:rPr>
-          <w:t xml:space="preserve">Roadmap</w:t>
-        </w:r>
-      </w:hyperlink>
-    </w:p>
-    <w:p>
-      <w:pPr>
-        <w:pStyle w:val="Compact"/>
-        <w:numPr>
-          <w:ilvl w:val="0"/>
-          <w:numId w:val="1023"/>
-        </w:numPr>
-      </w:pPr>
-      <w:hyperlink r:id="rId69">
-        <w:r>
-          <w:rPr>
-            <w:rStyle w:val="Hyperlink"/>
-          </w:rPr>
-          <w:t xml:space="preserve">Review index</w:t>
-        </w:r>
-      </w:hyperlink>
-    </w:p>
-    <w:p>
-      <w:pPr>
-        <w:pStyle w:val="Compact"/>
-        <w:numPr>
-          <w:ilvl w:val="0"/>
-          <w:numId w:val="1023"/>
+          <w:numId w:val="1031"/>
         </w:numPr>
       </w:pPr>
       <w:hyperlink r:id="rId23">
@@ -1556,7 +2857,7 @@
           <w:rPr>
             <w:rStyle w:val="Hyperlink"/>
           </w:rPr>
-          <w:t xml:space="preserve">Role design</w:t>
+          <w:t xml:space="preserve">modules/club-rosters/portal-nav.ts</w:t>
         </w:r>
       </w:hyperlink>
     </w:p>
@@ -1565,20 +2866,21 @@
         <w:pStyle w:val="Compact"/>
         <w:numPr>
           <w:ilvl w:val="0"/>
-          <w:numId w:val="1023"/>
+          <w:numId w:val="1031"/>
         </w:numPr>
       </w:pPr>
-      <w:hyperlink r:id="rId46">
+      <w:hyperlink r:id="rId24">
         <w:r>
           <w:rPr>
             <w:rStyle w:val="Hyperlink"/>
           </w:rPr>
-          <w:t xml:space="preserve">Builder</w:t>
+          <w:t xml:space="preserve">components/area-clubs-subnav.tsx</w:t>
         </w:r>
       </w:hyperlink>
     </w:p>
-    <w:bookmarkEnd w:id="96"/>
-    <w:bookmarkEnd w:id="97"/>
+    <w:bookmarkEnd w:id="182"/>
+    <w:bookmarkEnd w:id="183"/>
+    <w:bookmarkEnd w:id="184"/>
     <w:sectPr>
       <w:headerReference r:id="rId9" w:type="default"/>
       <w:footerReference r:id="rId10" w:type="default"/>
@@ -1602,12 +2904,8 @@
       <w:pStyle w:val="Footer"/>
     </w:pPr>
     <w:r>
-      <w:rPr>
-        <w:sz w:val="16"/>
-      </w:rPr>
-      <w:t xml:space="preserve">October 21, 2026  •  Source baseline 5e367b7c   |   </w:t>
+      <w:t>Club directors and Area Coordinators · October 2026</w:t>
     </w:r>
-    <w:fldSimple w:instr="PAGE"/>
   </w:p>
 </w:ftr>
 </file>
@@ -1638,11 +2936,7 @@
       <w:pStyle w:val="Header"/>
     </w:pPr>
     <w:r>
-      <w:rPr>
-        <w:color w:val="536B78"/>
-        <w:sz w:val="16"/>
-      </w:rPr>
-      <w:t>IMSDA EVENTS  /  PLATFORM DOCUMENTATION</w:t>
+      <w:t>IMSDA EVENTS / GETTING STARTED</w:t>
     </w:r>
   </w:p>
 </w:hdr>
@@ -2070,6 +3364,30 @@
     <w:abstractNumId w:val="991"/>
   </w:num>
   <w:num w:numId="1023">
+    <w:abstractNumId w:val="991"/>
+  </w:num>
+  <w:num w:numId="1024">
+    <w:abstractNumId w:val="991"/>
+  </w:num>
+  <w:num w:numId="1025">
+    <w:abstractNumId w:val="991"/>
+  </w:num>
+  <w:num w:numId="1026">
+    <w:abstractNumId w:val="991"/>
+  </w:num>
+  <w:num w:numId="1027">
+    <w:abstractNumId w:val="991"/>
+  </w:num>
+  <w:num w:numId="1028">
+    <w:abstractNumId w:val="991"/>
+  </w:num>
+  <w:num w:numId="1029">
+    <w:abstractNumId w:val="991"/>
+  </w:num>
+  <w:num w:numId="1030">
+    <w:abstractNumId w:val="991"/>
+  </w:num>
+  <w:num w:numId="1031">
     <w:abstractNumId w:val="991"/>
   </w:num>
 </w:numbering>

</xml_diff>

<commit_message>
docs: add current capabilities and future outlook to training
</commit_message>
<xml_diff>
--- a/docs/platform-documentation/2026-10-21/exports/06-presenter-notes.docx
+++ b/docs/platform-documentation/2026-10-21/exports/06-presenter-notes.docx
@@ -2,7 +2,7 @@
 <file path=word/document.xml><?xml version="1.0" encoding="utf-8"?>
 <w:document xmlns:w="http://schemas.openxmlformats.org/wordprocessingml/2006/main" xmlns:m="http://schemas.openxmlformats.org/officeDocument/2006/math" xmlns:r="http://schemas.openxmlformats.org/officeDocument/2006/relationships" xmlns:o="urn:schemas-microsoft-com:office:office" xmlns:v="urn:schemas-microsoft-com:vml" xmlns:w10="urn:schemas-microsoft-com:office:word" xmlns:a="http://schemas.openxmlformats.org/drawingml/2006/main" xmlns:pic="http://schemas.openxmlformats.org/drawingml/2006/picture" xmlns:wp="http://schemas.openxmlformats.org/drawingml/2006/wordprocessingDrawing">
   <w:body>
-    <w:bookmarkStart w:id="189" w:name="X49edbb978561ba76c0b3afe73d562b6de72a494"/>
+    <w:bookmarkStart w:id="304" w:name="X49edbb978561ba76c0b3afe73d562b6de72a494"/>
     <w:p>
       <w:pPr>
         <w:pStyle w:val="Heading1"/>
@@ -17,6 +17,24 @@
       </w:pPr>
       <w:r>
         <w:t xml:space="preserve">A visual orientation for club directors and Area Coordinators. The presentation follows fictional Riverton Pathfinders through ordinary tasks, then changes to a coordinator's view of the same records. These are screenshots of an isolated local copy of the current app, populated only with invented training records. They show implemented behavior at the source version recorded below; production configuration may affect which tools appear.</w:t>
+      </w:r>
+    </w:p>
+    <w:p>
+      <w:pPr>
+        <w:pStyle w:val="BodyText"/>
+      </w:pPr>
+      <w:r>
+        <w:rPr>
+          <w:b/>
+          <w:bCs/>
+        </w:rPr>
+        <w:t xml:space="preserve">Optional closing section:</w:t>
+      </w:r>
+      <w:r>
+        <w:t xml:space="preserve"> </w:t>
+      </w:r>
+      <w:r>
+        <w:t xml:space="preserve">slides 25–30 show other current tools, planned design/form-builder work and longer-term possibilities. These are capability illustrations, not application screenshots. Each slide labels its status; they do not promise a delivery date. Slide 31 finishes the session. For a task-only orientation, use slides 1–24 and 31.</w:t>
       </w:r>
     </w:p>
     <w:p>
@@ -3104,13 +3122,13 @@
     </w:p>
     <w:bookmarkEnd w:id="181"/>
     <w:bookmarkEnd w:id="182"/>
-    <w:bookmarkStart w:id="188" w:name="X0c4a8f035283c0fa6d250bb41a28255f713ae78"/>
+    <w:bookmarkStart w:id="196" w:name="Xeddb98caf26ce68dce77c8b14951d35aae6da68"/>
     <w:p>
       <w:pPr>
         <w:pStyle w:val="Heading2"/>
       </w:pPr>
       <w:r>
-        <w:t xml:space="preserve">25. Check the result. Sign out. Return to the same place.</w:t>
+        <w:t xml:space="preserve">25. More club tools are already here</w:t>
       </w:r>
     </w:p>
     <w:bookmarkStart w:id="183" w:name="say-24"/>
@@ -3127,11 +3145,2076 @@
         <w:pStyle w:val="FirstParagraph"/>
       </w:pPr>
       <w:r>
+        <w:t xml:space="preserve">The walkthrough showed the tasks people often need first. There are other current club tools to use through the year. Class tracking records supported earned items, including class insignia and event patches; it is not a universal checklist for every curriculum requirement. Orders helps the club organize needed supplies, stock and hand-outs rather than taking an online payment. Year-end reports bring together the year's recorded work for review. Jordan should still check the club, year and actual saved information before making a change or submitting a report. The tools shown depend on the person's club role.</w:t>
+      </w:r>
+    </w:p>
+    <w:bookmarkEnd w:id="183"/>
+    <w:bookmarkStart w:id="184" w:name="point-to-or-demonstrate-15"/>
+    <w:p>
+      <w:pPr>
+        <w:pStyle w:val="Heading3"/>
+      </w:pPr>
+      <w:r>
+        <w:t xml:space="preserve">Point to or demonstrate</w:t>
+      </w:r>
+    </w:p>
+    <w:p>
+      <w:pPr>
+        <w:pStyle w:val="FirstParagraph"/>
+      </w:pPr>
+      <w:r>
+        <w:t xml:space="preserve">Use this capability map to explain the purpose of Class tracking, Orders and the year-end report. These are infographic labels, not new app controls. Refer back to the current club navigation if someone wants to practice.</w:t>
+      </w:r>
+    </w:p>
+    <w:bookmarkEnd w:id="184"/>
+    <w:bookmarkStart w:id="185" w:name="ask-the-group-5"/>
+    <w:p>
+      <w:pPr>
+        <w:pStyle w:val="Heading3"/>
+      </w:pPr>
+      <w:r>
+        <w:t xml:space="preserve">Ask the group</w:t>
+      </w:r>
+    </w:p>
+    <w:p>
+      <w:pPr>
+        <w:pStyle w:val="FirstParagraph"/>
+      </w:pPr>
+      <w:r>
+        <w:t xml:space="preserve">Which of these tools would help your club avoid maintaining a second list?</w:t>
+      </w:r>
+    </w:p>
+    <w:bookmarkEnd w:id="185"/>
+    <w:bookmarkStart w:id="186" w:name="capability-status"/>
+    <w:p>
+      <w:pPr>
+        <w:pStyle w:val="Heading3"/>
+      </w:pPr>
+      <w:r>
+        <w:t xml:space="preserve">Capability status</w:t>
+      </w:r>
+    </w:p>
+    <w:p>
+      <w:pPr>
+        <w:pStyle w:val="FirstParagraph"/>
+      </w:pPr>
+      <w:r>
+        <w:t xml:space="preserve">CURRENT. The same club records support achievements, supplies and year-end reporting.</w:t>
+      </w:r>
+    </w:p>
+    <w:bookmarkEnd w:id="186"/>
+    <w:bookmarkStart w:id="195" w:name="preparation-references--not-spoken-24"/>
+    <w:p>
+      <w:pPr>
+        <w:pStyle w:val="Heading3"/>
+      </w:pPr>
+      <w:r>
+        <w:t xml:space="preserve">Preparation references — not spoken</w:t>
+      </w:r>
+    </w:p>
+    <w:p>
+      <w:pPr>
+        <w:pStyle w:val="Compact"/>
+        <w:numPr>
+          <w:ilvl w:val="0"/>
+          <w:numId w:val="1049"/>
+        </w:numPr>
+      </w:pPr>
+      <w:hyperlink r:id="rId187">
+        <w:r>
+          <w:rPr>
+            <w:rStyle w:val="Hyperlink"/>
+          </w:rPr>
+          <w:t xml:space="preserve">modules/club-rosters/portal-nav.ts</w:t>
+        </w:r>
+      </w:hyperlink>
+    </w:p>
+    <w:p>
+      <w:pPr>
+        <w:pStyle w:val="Compact"/>
+        <w:numPr>
+          <w:ilvl w:val="0"/>
+          <w:numId w:val="1049"/>
+        </w:numPr>
+      </w:pPr>
+      <w:hyperlink r:id="rId188">
+        <w:r>
+          <w:rPr>
+            <w:rStyle w:val="Hyperlink"/>
+          </w:rPr>
+          <w:t xml:space="preserve">modules/earned-awards/domain.ts</w:t>
+        </w:r>
+      </w:hyperlink>
+    </w:p>
+    <w:p>
+      <w:pPr>
+        <w:pStyle w:val="Compact"/>
+        <w:numPr>
+          <w:ilvl w:val="0"/>
+          <w:numId w:val="1049"/>
+        </w:numPr>
+      </w:pPr>
+      <w:hyperlink r:id="rId189">
+        <w:r>
+          <w:rPr>
+            <w:rStyle w:val="Hyperlink"/>
+          </w:rPr>
+          <w:t xml:space="preserve">modules/club-orders/domain.ts</w:t>
+        </w:r>
+      </w:hyperlink>
+    </w:p>
+    <w:p>
+      <w:pPr>
+        <w:pStyle w:val="Compact"/>
+        <w:numPr>
+          <w:ilvl w:val="0"/>
+          <w:numId w:val="1049"/>
+        </w:numPr>
+      </w:pPr>
+      <w:hyperlink r:id="rId190">
+        <w:r>
+          <w:rPr>
+            <w:rStyle w:val="Hyperlink"/>
+          </w:rPr>
+          <w:t xml:space="preserve">modules/club-supplies/domain.ts</w:t>
+        </w:r>
+      </w:hyperlink>
+    </w:p>
+    <w:p>
+      <w:pPr>
+        <w:pStyle w:val="Compact"/>
+        <w:numPr>
+          <w:ilvl w:val="0"/>
+          <w:numId w:val="1049"/>
+        </w:numPr>
+      </w:pPr>
+      <w:hyperlink r:id="rId191">
+        <w:r>
+          <w:rPr>
+            <w:rStyle w:val="Hyperlink"/>
+          </w:rPr>
+          <w:t xml:space="preserve">modules/club-reports/year-end-repository.ts</w:t>
+        </w:r>
+      </w:hyperlink>
+    </w:p>
+    <w:p>
+      <w:pPr>
+        <w:pStyle w:val="Compact"/>
+        <w:numPr>
+          <w:ilvl w:val="0"/>
+          <w:numId w:val="1049"/>
+        </w:numPr>
+      </w:pPr>
+      <w:hyperlink r:id="rId192">
+        <w:r>
+          <w:rPr>
+            <w:rStyle w:val="Hyperlink"/>
+          </w:rPr>
+          <w:t xml:space="preserve">Roadmap / issue #41</w:t>
+        </w:r>
+      </w:hyperlink>
+    </w:p>
+    <w:p>
+      <w:pPr>
+        <w:pStyle w:val="Compact"/>
+        <w:numPr>
+          <w:ilvl w:val="0"/>
+          <w:numId w:val="1049"/>
+        </w:numPr>
+      </w:pPr>
+      <w:hyperlink r:id="rId193">
+        <w:r>
+          <w:rPr>
+            <w:rStyle w:val="Hyperlink"/>
+          </w:rPr>
+          <w:t xml:space="preserve">Roadmap / issue #184</w:t>
+        </w:r>
+      </w:hyperlink>
+    </w:p>
+    <w:p>
+      <w:pPr>
+        <w:pStyle w:val="Compact"/>
+        <w:numPr>
+          <w:ilvl w:val="0"/>
+          <w:numId w:val="1049"/>
+        </w:numPr>
+      </w:pPr>
+      <w:hyperlink r:id="rId194">
+        <w:r>
+          <w:rPr>
+            <w:rStyle w:val="Hyperlink"/>
+          </w:rPr>
+          <w:t xml:space="preserve">Roadmap / issue #185</w:t>
+        </w:r>
+      </w:hyperlink>
+    </w:p>
+    <w:bookmarkEnd w:id="195"/>
+    <w:bookmarkEnd w:id="196"/>
+    <w:bookmarkStart w:id="217" w:name="X5a50a071abcacd60cf062319d050624c09b81a1"/>
+    <w:p>
+      <w:pPr>
+        <w:pStyle w:val="Heading2"/>
+      </w:pPr>
+      <w:r>
+        <w:t xml:space="preserve">26. Event teams have tools before, during and after</w:t>
+      </w:r>
+    </w:p>
+    <w:bookmarkStart w:id="197" w:name="say-25"/>
+    <w:p>
+      <w:pPr>
+        <w:pStyle w:val="Heading3"/>
+      </w:pPr>
+      <w:r>
+        <w:t xml:space="preserve">Say</w:t>
+      </w:r>
+    </w:p>
+    <w:p>
+      <w:pPr>
+        <w:pStyle w:val="FirstParagraph"/>
+      </w:pPr>
+      <w:r>
+        <w:t xml:space="preserve">IMSDA Events also supports the people running an event. Beforehand, authorized staff prepare its public information, publish a versioned form and manage registrations, capacity and waitlists. They can review event communications through the configured email service. On arrival, staff have pass, check-in, roster and badge tools. Financial staff have their permitted invoice, payment and reporting workflows. Lodging and meal tools can be used when the event's inventory, plans and settings are prepared. These capabilities belong to the appropriate event and staff permissions. A director or Area Coordinator assignment does not by itself provide the event team's administrative tools.</w:t>
+      </w:r>
+    </w:p>
+    <w:bookmarkEnd w:id="197"/>
+    <w:bookmarkStart w:id="198" w:name="point-to-or-demonstrate-16"/>
+    <w:p>
+      <w:pPr>
+        <w:pStyle w:val="Heading3"/>
+      </w:pPr>
+      <w:r>
+        <w:t xml:space="preserve">Point to or demonstrate</w:t>
+      </w:r>
+    </w:p>
+    <w:p>
+      <w:pPr>
+        <w:pStyle w:val="FirstParagraph"/>
+      </w:pPr>
+      <w:r>
+        <w:t xml:space="preserve">Follow the map from preparation to arrival to follow-up. Explain that configured provider delivery, lodging inventory, meal setup and payment setup are separate from the existence of the tools. This overview is not a live production readiness claim.</w:t>
+      </w:r>
+    </w:p>
+    <w:bookmarkEnd w:id="198"/>
+    <w:bookmarkStart w:id="199" w:name="ask-the-group-6"/>
+    <w:p>
+      <w:pPr>
+        <w:pStyle w:val="Heading3"/>
+      </w:pPr>
+      <w:r>
+        <w:t xml:space="preserve">Ask the group</w:t>
+      </w:r>
+    </w:p>
+    <w:p>
+      <w:pPr>
+        <w:pStyle w:val="FirstParagraph"/>
+      </w:pPr>
+      <w:r>
+        <w:t xml:space="preserve">Which team owns each step at your next event?</w:t>
+      </w:r>
+    </w:p>
+    <w:bookmarkEnd w:id="199"/>
+    <w:bookmarkStart w:id="200" w:name="capability-status-1"/>
+    <w:p>
+      <w:pPr>
+        <w:pStyle w:val="Heading3"/>
+      </w:pPr>
+      <w:r>
+        <w:t xml:space="preserve">Capability status</w:t>
+      </w:r>
+    </w:p>
+    <w:p>
+      <w:pPr>
+        <w:pStyle w:val="FirstParagraph"/>
+      </w:pPr>
+      <w:r>
+        <w:t xml:space="preserve">CURRENT. Event staff use assigned permissions; available options depend on the event and its setup.</w:t>
+      </w:r>
+    </w:p>
+    <w:bookmarkEnd w:id="200"/>
+    <w:bookmarkStart w:id="216" w:name="preparation-references--not-spoken-25"/>
+    <w:p>
+      <w:pPr>
+        <w:pStyle w:val="Heading3"/>
+      </w:pPr>
+      <w:r>
+        <w:t xml:space="preserve">Preparation references — not spoken</w:t>
+      </w:r>
+    </w:p>
+    <w:p>
+      <w:pPr>
+        <w:pStyle w:val="Compact"/>
+        <w:numPr>
+          <w:ilvl w:val="0"/>
+          <w:numId w:val="1050"/>
+        </w:numPr>
+      </w:pPr>
+      <w:hyperlink r:id="rId201">
+        <w:r>
+          <w:rPr>
+            <w:rStyle w:val="Hyperlink"/>
+          </w:rPr>
+          <w:t xml:space="preserve">docs/STAFF-EVENT-WORKFLOW.md</w:t>
+        </w:r>
+      </w:hyperlink>
+    </w:p>
+    <w:p>
+      <w:pPr>
+        <w:pStyle w:val="Compact"/>
+        <w:numPr>
+          <w:ilvl w:val="0"/>
+          <w:numId w:val="1050"/>
+        </w:numPr>
+      </w:pPr>
+      <w:hyperlink r:id="rId202">
+        <w:r>
+          <w:rPr>
+            <w:rStyle w:val="Hyperlink"/>
+          </w:rPr>
+          <w:t xml:space="preserve">docs/EVENT-FEATURES.md</w:t>
+        </w:r>
+      </w:hyperlink>
+    </w:p>
+    <w:p>
+      <w:pPr>
+        <w:pStyle w:val="Compact"/>
+        <w:numPr>
+          <w:ilvl w:val="0"/>
+          <w:numId w:val="1050"/>
+        </w:numPr>
+      </w:pPr>
+      <w:hyperlink r:id="rId203">
+        <w:r>
+          <w:rPr>
+            <w:rStyle w:val="Hyperlink"/>
+          </w:rPr>
+          <w:t xml:space="preserve">modules/forms/repository.ts</w:t>
+        </w:r>
+      </w:hyperlink>
+    </w:p>
+    <w:p>
+      <w:pPr>
+        <w:pStyle w:val="Compact"/>
+        <w:numPr>
+          <w:ilvl w:val="0"/>
+          <w:numId w:val="1050"/>
+        </w:numPr>
+      </w:pPr>
+      <w:hyperlink r:id="rId204">
+        <w:r>
+          <w:rPr>
+            <w:rStyle w:val="Hyperlink"/>
+          </w:rPr>
+          <w:t xml:space="preserve">modules/checkin/README.md</w:t>
+        </w:r>
+      </w:hyperlink>
+    </w:p>
+    <w:p>
+      <w:pPr>
+        <w:pStyle w:val="Compact"/>
+        <w:numPr>
+          <w:ilvl w:val="0"/>
+          <w:numId w:val="1050"/>
+        </w:numPr>
+      </w:pPr>
+      <w:hyperlink r:id="rId205">
+        <w:r>
+          <w:rPr>
+            <w:rStyle w:val="Hyperlink"/>
+          </w:rPr>
+          <w:t xml:space="preserve">modules/communications/effective-delivery.ts</w:t>
+        </w:r>
+      </w:hyperlink>
+    </w:p>
+    <w:p>
+      <w:pPr>
+        <w:pStyle w:val="Compact"/>
+        <w:numPr>
+          <w:ilvl w:val="0"/>
+          <w:numId w:val="1050"/>
+        </w:numPr>
+      </w:pPr>
+      <w:hyperlink r:id="rId206">
+        <w:r>
+          <w:rPr>
+            <w:rStyle w:val="Hyperlink"/>
+          </w:rPr>
+          <w:t xml:space="preserve">docs/BILLING-RESPONSIBILITY.md</w:t>
+        </w:r>
+      </w:hyperlink>
+    </w:p>
+    <w:p>
+      <w:pPr>
+        <w:pStyle w:val="Compact"/>
+        <w:numPr>
+          <w:ilvl w:val="0"/>
+          <w:numId w:val="1050"/>
+        </w:numPr>
+      </w:pPr>
+      <w:hyperlink r:id="rId207">
+        <w:r>
+          <w:rPr>
+            <w:rStyle w:val="Hyperlink"/>
+          </w:rPr>
+          <w:t xml:space="preserve">docs/LODGING.md</w:t>
+        </w:r>
+      </w:hyperlink>
+    </w:p>
+    <w:p>
+      <w:pPr>
+        <w:pStyle w:val="Compact"/>
+        <w:numPr>
+          <w:ilvl w:val="0"/>
+          <w:numId w:val="1050"/>
+        </w:numPr>
+      </w:pPr>
+      <w:hyperlink r:id="rId208">
+        <w:r>
+          <w:rPr>
+            <w:rStyle w:val="Hyperlink"/>
+          </w:rPr>
+          <w:t xml:space="preserve">docs/MEALS.md</w:t>
+        </w:r>
+      </w:hyperlink>
+    </w:p>
+    <w:p>
+      <w:pPr>
+        <w:pStyle w:val="Compact"/>
+        <w:numPr>
+          <w:ilvl w:val="0"/>
+          <w:numId w:val="1050"/>
+        </w:numPr>
+      </w:pPr>
+      <w:hyperlink r:id="rId209">
+        <w:r>
+          <w:rPr>
+            <w:rStyle w:val="Hyperlink"/>
+          </w:rPr>
+          <w:t xml:space="preserve">Roadmap / issue #73</w:t>
+        </w:r>
+      </w:hyperlink>
+    </w:p>
+    <w:p>
+      <w:pPr>
+        <w:pStyle w:val="Compact"/>
+        <w:numPr>
+          <w:ilvl w:val="0"/>
+          <w:numId w:val="1050"/>
+        </w:numPr>
+      </w:pPr>
+      <w:hyperlink r:id="rId210">
+        <w:r>
+          <w:rPr>
+            <w:rStyle w:val="Hyperlink"/>
+          </w:rPr>
+          <w:t xml:space="preserve">Roadmap / issue #75</w:t>
+        </w:r>
+      </w:hyperlink>
+    </w:p>
+    <w:p>
+      <w:pPr>
+        <w:pStyle w:val="Compact"/>
+        <w:numPr>
+          <w:ilvl w:val="0"/>
+          <w:numId w:val="1050"/>
+        </w:numPr>
+      </w:pPr>
+      <w:hyperlink r:id="rId211">
+        <w:r>
+          <w:rPr>
+            <w:rStyle w:val="Hyperlink"/>
+          </w:rPr>
+          <w:t xml:space="preserve">Roadmap / issue #77</w:t>
+        </w:r>
+      </w:hyperlink>
+    </w:p>
+    <w:p>
+      <w:pPr>
+        <w:pStyle w:val="Compact"/>
+        <w:numPr>
+          <w:ilvl w:val="0"/>
+          <w:numId w:val="1050"/>
+        </w:numPr>
+      </w:pPr>
+      <w:hyperlink r:id="rId212">
+        <w:r>
+          <w:rPr>
+            <w:rStyle w:val="Hyperlink"/>
+          </w:rPr>
+          <w:t xml:space="preserve">Roadmap / issue #194</w:t>
+        </w:r>
+      </w:hyperlink>
+    </w:p>
+    <w:p>
+      <w:pPr>
+        <w:pStyle w:val="Compact"/>
+        <w:numPr>
+          <w:ilvl w:val="0"/>
+          <w:numId w:val="1050"/>
+        </w:numPr>
+      </w:pPr>
+      <w:hyperlink r:id="rId213">
+        <w:r>
+          <w:rPr>
+            <w:rStyle w:val="Hyperlink"/>
+          </w:rPr>
+          <w:t xml:space="preserve">Roadmap / issue #197</w:t>
+        </w:r>
+      </w:hyperlink>
+    </w:p>
+    <w:p>
+      <w:pPr>
+        <w:pStyle w:val="Compact"/>
+        <w:numPr>
+          <w:ilvl w:val="0"/>
+          <w:numId w:val="1050"/>
+        </w:numPr>
+      </w:pPr>
+      <w:hyperlink r:id="rId214">
+        <w:r>
+          <w:rPr>
+            <w:rStyle w:val="Hyperlink"/>
+          </w:rPr>
+          <w:t xml:space="preserve">Roadmap / issue #212</w:t>
+        </w:r>
+      </w:hyperlink>
+    </w:p>
+    <w:p>
+      <w:pPr>
+        <w:pStyle w:val="Compact"/>
+        <w:numPr>
+          <w:ilvl w:val="0"/>
+          <w:numId w:val="1050"/>
+        </w:numPr>
+      </w:pPr>
+      <w:hyperlink r:id="rId215">
+        <w:r>
+          <w:rPr>
+            <w:rStyle w:val="Hyperlink"/>
+          </w:rPr>
+          <w:t xml:space="preserve">Roadmap / issue #779</w:t>
+        </w:r>
+      </w:hyperlink>
+    </w:p>
+    <w:bookmarkEnd w:id="216"/>
+    <w:bookmarkEnd w:id="217"/>
+    <w:bookmarkStart w:id="239" w:name="X8cf2524bc2fafc84823b3fbdeb2444a42316dd1"/>
+    <w:p>
+      <w:pPr>
+        <w:pStyle w:val="Heading2"/>
+      </w:pPr>
+      <w:r>
+        <w:t xml:space="preserve">27. Planned: make the next task easier to find</w:t>
+      </w:r>
+    </w:p>
+    <w:bookmarkStart w:id="218" w:name="say-26"/>
+    <w:p>
+      <w:pPr>
+        <w:pStyle w:val="Heading3"/>
+      </w:pPr>
+      <w:r>
+        <w:t xml:space="preserve">Say</w:t>
+      </w:r>
+    </w:p>
+    <w:p>
+      <w:pPr>
+        <w:pStyle w:val="FirstParagraph"/>
+      </w:pPr>
+      <w:r>
+        <w:t xml:space="preserve">One improvement is how people recognize the work already available. The accepted role-workspace direction gives the different roles a consistent visual language while keeping their own navigation, priorities and access. Other tracked work includes clearer list columns and icons, saved task views, public-page and link previews, calendar and club-finder refinements, and guidance near the task. These are improvements to the same jobs we practiced. The accepted layout direction is a reference for implementation, not a released interface. The public-page studies have their own review status. This overview does not add another administrator menu change or give broader permissions to a role. Two operational examples in the ordered roadmap are the administrator alert feed with read and unread states, and kitchen money closeout. Those belong to their respective staff responsibilities; they are not new coordinator or attendee permissions.</w:t>
+      </w:r>
+    </w:p>
+    <w:bookmarkEnd w:id="218"/>
+    <w:bookmarkStart w:id="219" w:name="point-to-or-demonstrate-17"/>
+    <w:p>
+      <w:pPr>
+        <w:pStyle w:val="Heading3"/>
+      </w:pPr>
+      <w:r>
+        <w:t xml:space="preserve">Point to or demonstrate</w:t>
+      </w:r>
+    </w:p>
+    <w:p>
+      <w:pPr>
+        <w:pStyle w:val="FirstParagraph"/>
+      </w:pPr>
+      <w:r>
+        <w:t xml:space="preserve">Read the status attached to each track. Explain the difference between accepted design direction and proposed or planned work. No future app screen is pictured on this slide.</w:t>
+      </w:r>
+    </w:p>
+    <w:bookmarkEnd w:id="219"/>
+    <w:bookmarkStart w:id="220" w:name="ask-the-group-7"/>
+    <w:p>
+      <w:pPr>
+        <w:pStyle w:val="Heading3"/>
+      </w:pPr>
+      <w:r>
+        <w:t xml:space="preserve">Ask the group</w:t>
+      </w:r>
+    </w:p>
+    <w:p>
+      <w:pPr>
+        <w:pStyle w:val="FirstParagraph"/>
+      </w:pPr>
+      <w:r>
+        <w:t xml:space="preserve">Where do people most often hesitate or ask where to go next?</w:t>
+      </w:r>
+    </w:p>
+    <w:bookmarkEnd w:id="220"/>
+    <w:bookmarkStart w:id="221" w:name="capability-status-2"/>
+    <w:p>
+      <w:pPr>
+        <w:pStyle w:val="Heading3"/>
+      </w:pPr>
+      <w:r>
+        <w:t xml:space="preserve">Capability status</w:t>
+      </w:r>
+    </w:p>
+    <w:p>
+      <w:pPr>
+        <w:pStyle w:val="FirstParagraph"/>
+      </w:pPr>
+      <w:r>
+        <w:t xml:space="preserve">PLANNED. The aim is easier learning while each role keeps its own responsibilities and access.</w:t>
+      </w:r>
+    </w:p>
+    <w:bookmarkEnd w:id="221"/>
+    <w:bookmarkStart w:id="238" w:name="preparation-references--not-spoken-26"/>
+    <w:p>
+      <w:pPr>
+        <w:pStyle w:val="Heading3"/>
+      </w:pPr>
+      <w:r>
+        <w:t xml:space="preserve">Preparation references — not spoken</w:t>
+      </w:r>
+    </w:p>
+    <w:p>
+      <w:pPr>
+        <w:pStyle w:val="Compact"/>
+        <w:numPr>
+          <w:ilvl w:val="0"/>
+          <w:numId w:val="1051"/>
+        </w:numPr>
+      </w:pPr>
+      <w:hyperlink r:id="rId222">
+        <w:r>
+          <w:rPr>
+            <w:rStyle w:val="Hyperlink"/>
+          </w:rPr>
+          <w:t xml:space="preserve">docs/design/role-workspaces/README.md</w:t>
+        </w:r>
+      </w:hyperlink>
+    </w:p>
+    <w:p>
+      <w:pPr>
+        <w:pStyle w:val="Compact"/>
+        <w:numPr>
+          <w:ilvl w:val="0"/>
+          <w:numId w:val="1051"/>
+        </w:numPr>
+      </w:pPr>
+      <w:hyperlink r:id="rId223">
+        <w:r>
+          <w:rPr>
+            <w:rStyle w:val="Hyperlink"/>
+          </w:rPr>
+          <w:t xml:space="preserve">docs/design/role-workspaces/evidence/role-contract.md</w:t>
+        </w:r>
+      </w:hyperlink>
+    </w:p>
+    <w:p>
+      <w:pPr>
+        <w:pStyle w:val="Compact"/>
+        <w:numPr>
+          <w:ilvl w:val="0"/>
+          <w:numId w:val="1051"/>
+        </w:numPr>
+      </w:pPr>
+      <w:hyperlink r:id="rId224">
+        <w:r>
+          <w:rPr>
+            <w:rStyle w:val="Hyperlink"/>
+          </w:rPr>
+          <w:t xml:space="preserve">docs/design/public-journeys-and-lists/review.md</w:t>
+        </w:r>
+      </w:hyperlink>
+    </w:p>
+    <w:p>
+      <w:pPr>
+        <w:pStyle w:val="Compact"/>
+        <w:numPr>
+          <w:ilvl w:val="0"/>
+          <w:numId w:val="1051"/>
+        </w:numPr>
+      </w:pPr>
+      <w:hyperlink r:id="rId225">
+        <w:r>
+          <w:rPr>
+            <w:rStyle w:val="Hyperlink"/>
+          </w:rPr>
+          <w:t xml:space="preserve">docs/design/public-journeys-and-lists/existing-owner-notes.md</w:t>
+        </w:r>
+      </w:hyperlink>
+    </w:p>
+    <w:p>
+      <w:pPr>
+        <w:pStyle w:val="Compact"/>
+        <w:numPr>
+          <w:ilvl w:val="0"/>
+          <w:numId w:val="1051"/>
+        </w:numPr>
+      </w:pPr>
+      <w:hyperlink r:id="rId226">
+        <w:r>
+          <w:rPr>
+            <w:rStyle w:val="Hyperlink"/>
+          </w:rPr>
+          <w:t xml:space="preserve">Roadmap / issue #98</w:t>
+        </w:r>
+      </w:hyperlink>
+    </w:p>
+    <w:p>
+      <w:pPr>
+        <w:pStyle w:val="Compact"/>
+        <w:numPr>
+          <w:ilvl w:val="0"/>
+          <w:numId w:val="1051"/>
+        </w:numPr>
+      </w:pPr>
+      <w:hyperlink r:id="rId227">
+        <w:r>
+          <w:rPr>
+            <w:rStyle w:val="Hyperlink"/>
+          </w:rPr>
+          <w:t xml:space="preserve">Roadmap / issue #1109</w:t>
+        </w:r>
+      </w:hyperlink>
+    </w:p>
+    <w:p>
+      <w:pPr>
+        <w:pStyle w:val="Compact"/>
+        <w:numPr>
+          <w:ilvl w:val="0"/>
+          <w:numId w:val="1051"/>
+        </w:numPr>
+      </w:pPr>
+      <w:hyperlink r:id="rId228">
+        <w:r>
+          <w:rPr>
+            <w:rStyle w:val="Hyperlink"/>
+          </w:rPr>
+          <w:t xml:space="preserve">Roadmap / issue #1111</w:t>
+        </w:r>
+      </w:hyperlink>
+    </w:p>
+    <w:p>
+      <w:pPr>
+        <w:pStyle w:val="Compact"/>
+        <w:numPr>
+          <w:ilvl w:val="0"/>
+          <w:numId w:val="1051"/>
+        </w:numPr>
+      </w:pPr>
+      <w:hyperlink r:id="rId229">
+        <w:r>
+          <w:rPr>
+            <w:rStyle w:val="Hyperlink"/>
+          </w:rPr>
+          <w:t xml:space="preserve">Roadmap / issue #1112</w:t>
+        </w:r>
+      </w:hyperlink>
+    </w:p>
+    <w:p>
+      <w:pPr>
+        <w:pStyle w:val="Compact"/>
+        <w:numPr>
+          <w:ilvl w:val="0"/>
+          <w:numId w:val="1051"/>
+        </w:numPr>
+      </w:pPr>
+      <w:hyperlink r:id="rId230">
+        <w:r>
+          <w:rPr>
+            <w:rStyle w:val="Hyperlink"/>
+          </w:rPr>
+          <w:t xml:space="preserve">Roadmap / issue #1113</w:t>
+        </w:r>
+      </w:hyperlink>
+    </w:p>
+    <w:p>
+      <w:pPr>
+        <w:pStyle w:val="Compact"/>
+        <w:numPr>
+          <w:ilvl w:val="0"/>
+          <w:numId w:val="1051"/>
+        </w:numPr>
+      </w:pPr>
+      <w:hyperlink r:id="rId231">
+        <w:r>
+          <w:rPr>
+            <w:rStyle w:val="Hyperlink"/>
+          </w:rPr>
+          <w:t xml:space="preserve">Roadmap / issue #1074</w:t>
+        </w:r>
+      </w:hyperlink>
+    </w:p>
+    <w:p>
+      <w:pPr>
+        <w:pStyle w:val="Compact"/>
+        <w:numPr>
+          <w:ilvl w:val="0"/>
+          <w:numId w:val="1051"/>
+        </w:numPr>
+      </w:pPr>
+      <w:hyperlink r:id="rId232">
+        <w:r>
+          <w:rPr>
+            <w:rStyle w:val="Hyperlink"/>
+          </w:rPr>
+          <w:t xml:space="preserve">Roadmap / issue #1077</w:t>
+        </w:r>
+      </w:hyperlink>
+    </w:p>
+    <w:p>
+      <w:pPr>
+        <w:pStyle w:val="Compact"/>
+        <w:numPr>
+          <w:ilvl w:val="0"/>
+          <w:numId w:val="1051"/>
+        </w:numPr>
+      </w:pPr>
+      <w:hyperlink r:id="rId233">
+        <w:r>
+          <w:rPr>
+            <w:rStyle w:val="Hyperlink"/>
+          </w:rPr>
+          <w:t xml:space="preserve">Roadmap / issue #1103</w:t>
+        </w:r>
+      </w:hyperlink>
+    </w:p>
+    <w:p>
+      <w:pPr>
+        <w:pStyle w:val="Compact"/>
+        <w:numPr>
+          <w:ilvl w:val="0"/>
+          <w:numId w:val="1051"/>
+        </w:numPr>
+      </w:pPr>
+      <w:hyperlink r:id="rId234">
+        <w:r>
+          <w:rPr>
+            <w:rStyle w:val="Hyperlink"/>
+          </w:rPr>
+          <w:t xml:space="preserve">Roadmap / issue #1115</w:t>
+        </w:r>
+      </w:hyperlink>
+    </w:p>
+    <w:p>
+      <w:pPr>
+        <w:pStyle w:val="Compact"/>
+        <w:numPr>
+          <w:ilvl w:val="0"/>
+          <w:numId w:val="1051"/>
+        </w:numPr>
+      </w:pPr>
+      <w:hyperlink r:id="rId235">
+        <w:r>
+          <w:rPr>
+            <w:rStyle w:val="Hyperlink"/>
+          </w:rPr>
+          <w:t xml:space="preserve">Roadmap / issue #1117</w:t>
+        </w:r>
+      </w:hyperlink>
+    </w:p>
+    <w:p>
+      <w:pPr>
+        <w:pStyle w:val="Compact"/>
+        <w:numPr>
+          <w:ilvl w:val="0"/>
+          <w:numId w:val="1051"/>
+        </w:numPr>
+      </w:pPr>
+      <w:hyperlink r:id="rId236">
+        <w:r>
+          <w:rPr>
+            <w:rStyle w:val="Hyperlink"/>
+          </w:rPr>
+          <w:t xml:space="preserve">Roadmap / issue #1118</w:t>
+        </w:r>
+      </w:hyperlink>
+    </w:p>
+    <w:p>
+      <w:pPr>
+        <w:pStyle w:val="Compact"/>
+        <w:numPr>
+          <w:ilvl w:val="0"/>
+          <w:numId w:val="1051"/>
+        </w:numPr>
+      </w:pPr>
+      <w:hyperlink r:id="rId237">
+        <w:r>
+          <w:rPr>
+            <w:rStyle w:val="Hyperlink"/>
+          </w:rPr>
+          <w:t xml:space="preserve">Roadmap / issue #1033</w:t>
+        </w:r>
+      </w:hyperlink>
+    </w:p>
+    <w:p>
+      <w:pPr>
+        <w:pStyle w:val="Compact"/>
+        <w:numPr>
+          <w:ilvl w:val="0"/>
+          <w:numId w:val="1051"/>
+        </w:numPr>
+      </w:pPr>
+      <w:hyperlink r:id="rId214">
+        <w:r>
+          <w:rPr>
+            <w:rStyle w:val="Hyperlink"/>
+          </w:rPr>
+          <w:t xml:space="preserve">Roadmap / issue #212</w:t>
+        </w:r>
+      </w:hyperlink>
+    </w:p>
+    <w:bookmarkEnd w:id="238"/>
+    <w:bookmarkEnd w:id="239"/>
+    <w:bookmarkStart w:id="254" w:name="X2d6769f74723d180dc85306227daee10cb98878"/>
+    <w:p>
+      <w:pPr>
+        <w:pStyle w:val="Heading2"/>
+      </w:pPr>
+      <w:r>
+        <w:t xml:space="preserve">28. Planned: make forms easier to build and maintain</w:t>
+      </w:r>
+    </w:p>
+    <w:bookmarkStart w:id="240" w:name="say-27"/>
+    <w:p>
+      <w:pPr>
+        <w:pStyle w:val="Heading3"/>
+      </w:pPr>
+      <w:r>
+        <w:t xml:space="preserve">Say</w:t>
+      </w:r>
+    </w:p>
+    <w:p>
+      <w:pPr>
+        <w:pStyle w:val="FirstParagraph"/>
+      </w:pPr>
+      <w:r>
+        <w:t xml:space="preserve">Forms already have explicit drafts, preview and test tools, and published versions that keep older submissions tied to their original form version. The roadmap aims to make creating and maintaining those forms easier. Its ordered foundation work includes preparing the builder, app-editable form starters, and notices about changes to their source. Later visual work covers a clearer editing workspace, reusable questions, phone editing and combined visibility rules. Those later steps still require their own design review. A changed starter should not silently rewrite a form someone is already using. This is the planned direction, with no release date announced here.</w:t>
+      </w:r>
+    </w:p>
+    <w:bookmarkEnd w:id="240"/>
+    <w:bookmarkStart w:id="241" w:name="point-to-or-demonstrate-18"/>
+    <w:p>
+      <w:pPr>
+        <w:pStyle w:val="Heading3"/>
+      </w:pPr>
+      <w:r>
+        <w:t xml:space="preserve">Point to or demonstrate</w:t>
+      </w:r>
+    </w:p>
+    <w:p>
+      <w:pPr>
+        <w:pStyle w:val="FirstParagraph"/>
+      </w:pPr>
+      <w:r>
+        <w:t xml:space="preserve">Begin with the takeaway so listeners know which controls already exist. Then follow the planned foundations and the later reviewed tools. Keep engineering extraction and build-queue details in preparation references rather than the spoken explanation.</w:t>
+      </w:r>
+    </w:p>
+    <w:bookmarkEnd w:id="241"/>
+    <w:bookmarkStart w:id="242" w:name="ask-the-group-8"/>
+    <w:p>
+      <w:pPr>
+        <w:pStyle w:val="Heading3"/>
+      </w:pPr>
+      <w:r>
+        <w:t xml:space="preserve">Ask the group</w:t>
+      </w:r>
+    </w:p>
+    <w:p>
+      <w:pPr>
+        <w:pStyle w:val="FirstParagraph"/>
+      </w:pPr>
+      <w:r>
+        <w:t xml:space="preserve">Would a clearer editor, reusable starter or reusable question save you the most work?</w:t>
+      </w:r>
+    </w:p>
+    <w:bookmarkEnd w:id="242"/>
+    <w:bookmarkStart w:id="243" w:name="capability-status-3"/>
+    <w:p>
+      <w:pPr>
+        <w:pStyle w:val="Heading3"/>
+      </w:pPr>
+      <w:r>
+        <w:t xml:space="preserve">Capability status</w:t>
+      </w:r>
+    </w:p>
+    <w:p>
+      <w:pPr>
+        <w:pStyle w:val="FirstParagraph"/>
+      </w:pPr>
+      <w:r>
+        <w:t xml:space="preserve">PLANNED. Drafts and publishing already exist. Planned tools make forms easier to build and maintain.</w:t>
+      </w:r>
+    </w:p>
+    <w:bookmarkEnd w:id="243"/>
+    <w:bookmarkStart w:id="253" w:name="preparation-references--not-spoken-27"/>
+    <w:p>
+      <w:pPr>
+        <w:pStyle w:val="Heading3"/>
+      </w:pPr>
+      <w:r>
+        <w:t xml:space="preserve">Preparation references — not spoken</w:t>
+      </w:r>
+    </w:p>
+    <w:p>
+      <w:pPr>
+        <w:pStyle w:val="Compact"/>
+        <w:numPr>
+          <w:ilvl w:val="0"/>
+          <w:numId w:val="1052"/>
+        </w:numPr>
+      </w:pPr>
+      <w:hyperlink r:id="rId201">
+        <w:r>
+          <w:rPr>
+            <w:rStyle w:val="Hyperlink"/>
+          </w:rPr>
+          <w:t xml:space="preserve">docs/STAFF-EVENT-WORKFLOW.md</w:t>
+        </w:r>
+      </w:hyperlink>
+    </w:p>
+    <w:p>
+      <w:pPr>
+        <w:pStyle w:val="Compact"/>
+        <w:numPr>
+          <w:ilvl w:val="0"/>
+          <w:numId w:val="1052"/>
+        </w:numPr>
+      </w:pPr>
+      <w:hyperlink r:id="rId203">
+        <w:r>
+          <w:rPr>
+            <w:rStyle w:val="Hyperlink"/>
+          </w:rPr>
+          <w:t xml:space="preserve">modules/forms/repository.ts</w:t>
+        </w:r>
+      </w:hyperlink>
+    </w:p>
+    <w:p>
+      <w:pPr>
+        <w:pStyle w:val="Compact"/>
+        <w:numPr>
+          <w:ilvl w:val="0"/>
+          <w:numId w:val="1052"/>
+        </w:numPr>
+      </w:pPr>
+      <w:hyperlink r:id="rId244">
+        <w:r>
+          <w:rPr>
+            <w:rStyle w:val="Hyperlink"/>
+          </w:rPr>
+          <w:t xml:space="preserve">modules/forms/seeded-templates.ts</w:t>
+        </w:r>
+      </w:hyperlink>
+    </w:p>
+    <w:p>
+      <w:pPr>
+        <w:pStyle w:val="Compact"/>
+        <w:numPr>
+          <w:ilvl w:val="0"/>
+          <w:numId w:val="1052"/>
+        </w:numPr>
+      </w:pPr>
+      <w:hyperlink r:id="rId224">
+        <w:r>
+          <w:rPr>
+            <w:rStyle w:val="Hyperlink"/>
+          </w:rPr>
+          <w:t xml:space="preserve">docs/design/public-journeys-and-lists/review.md</w:t>
+        </w:r>
+      </w:hyperlink>
+    </w:p>
+    <w:p>
+      <w:pPr>
+        <w:pStyle w:val="Compact"/>
+        <w:numPr>
+          <w:ilvl w:val="0"/>
+          <w:numId w:val="1052"/>
+        </w:numPr>
+      </w:pPr>
+      <w:hyperlink r:id="rId226">
+        <w:r>
+          <w:rPr>
+            <w:rStyle w:val="Hyperlink"/>
+          </w:rPr>
+          <w:t xml:space="preserve">Roadmap / issue #98</w:t>
+        </w:r>
+      </w:hyperlink>
+    </w:p>
+    <w:p>
+      <w:pPr>
+        <w:pStyle w:val="Compact"/>
+        <w:numPr>
+          <w:ilvl w:val="0"/>
+          <w:numId w:val="1052"/>
+        </w:numPr>
+      </w:pPr>
+      <w:hyperlink r:id="rId245">
+        <w:r>
+          <w:rPr>
+            <w:rStyle w:val="Hyperlink"/>
+          </w:rPr>
+          <w:t xml:space="preserve">Roadmap / issue #1062</w:t>
+        </w:r>
+      </w:hyperlink>
+    </w:p>
+    <w:p>
+      <w:pPr>
+        <w:pStyle w:val="Compact"/>
+        <w:numPr>
+          <w:ilvl w:val="0"/>
+          <w:numId w:val="1052"/>
+        </w:numPr>
+      </w:pPr>
+      <w:hyperlink r:id="rId246">
+        <w:r>
+          <w:rPr>
+            <w:rStyle w:val="Hyperlink"/>
+          </w:rPr>
+          <w:t xml:space="preserve">Roadmap / issue #1063</w:t>
+        </w:r>
+      </w:hyperlink>
+    </w:p>
+    <w:p>
+      <w:pPr>
+        <w:pStyle w:val="Compact"/>
+        <w:numPr>
+          <w:ilvl w:val="0"/>
+          <w:numId w:val="1052"/>
+        </w:numPr>
+      </w:pPr>
+      <w:hyperlink r:id="rId247">
+        <w:r>
+          <w:rPr>
+            <w:rStyle w:val="Hyperlink"/>
+          </w:rPr>
+          <w:t xml:space="preserve">Roadmap / issue #1064</w:t>
+        </w:r>
+      </w:hyperlink>
+    </w:p>
+    <w:p>
+      <w:pPr>
+        <w:pStyle w:val="Compact"/>
+        <w:numPr>
+          <w:ilvl w:val="0"/>
+          <w:numId w:val="1052"/>
+        </w:numPr>
+      </w:pPr>
+      <w:hyperlink r:id="rId248">
+        <w:r>
+          <w:rPr>
+            <w:rStyle w:val="Hyperlink"/>
+          </w:rPr>
+          <w:t xml:space="preserve">Roadmap / issue #1065</w:t>
+        </w:r>
+      </w:hyperlink>
+    </w:p>
+    <w:p>
+      <w:pPr>
+        <w:pStyle w:val="Compact"/>
+        <w:numPr>
+          <w:ilvl w:val="0"/>
+          <w:numId w:val="1052"/>
+        </w:numPr>
+      </w:pPr>
+      <w:hyperlink r:id="rId249">
+        <w:r>
+          <w:rPr>
+            <w:rStyle w:val="Hyperlink"/>
+          </w:rPr>
+          <w:t xml:space="preserve">Roadmap / issue #1069</w:t>
+        </w:r>
+      </w:hyperlink>
+    </w:p>
+    <w:p>
+      <w:pPr>
+        <w:pStyle w:val="Compact"/>
+        <w:numPr>
+          <w:ilvl w:val="0"/>
+          <w:numId w:val="1052"/>
+        </w:numPr>
+      </w:pPr>
+      <w:hyperlink r:id="rId250">
+        <w:r>
+          <w:rPr>
+            <w:rStyle w:val="Hyperlink"/>
+          </w:rPr>
+          <w:t xml:space="preserve">Roadmap / issue #1070</w:t>
+        </w:r>
+      </w:hyperlink>
+    </w:p>
+    <w:p>
+      <w:pPr>
+        <w:pStyle w:val="Compact"/>
+        <w:numPr>
+          <w:ilvl w:val="0"/>
+          <w:numId w:val="1052"/>
+        </w:numPr>
+      </w:pPr>
+      <w:hyperlink r:id="rId251">
+        <w:r>
+          <w:rPr>
+            <w:rStyle w:val="Hyperlink"/>
+          </w:rPr>
+          <w:t xml:space="preserve">Roadmap / issue #1071</w:t>
+        </w:r>
+      </w:hyperlink>
+    </w:p>
+    <w:p>
+      <w:pPr>
+        <w:pStyle w:val="Compact"/>
+        <w:numPr>
+          <w:ilvl w:val="0"/>
+          <w:numId w:val="1052"/>
+        </w:numPr>
+      </w:pPr>
+      <w:hyperlink r:id="rId252">
+        <w:r>
+          <w:rPr>
+            <w:rStyle w:val="Hyperlink"/>
+          </w:rPr>
+          <w:t xml:space="preserve">Roadmap / issue #1072</w:t>
+        </w:r>
+      </w:hyperlink>
+    </w:p>
+    <w:bookmarkEnd w:id="253"/>
+    <w:bookmarkEnd w:id="254"/>
+    <w:bookmarkStart w:id="270" w:name="X4d91e404c79572a134d61186cad6486d05283e2"/>
+    <w:p>
+      <w:pPr>
+        <w:pStyle w:val="Heading2"/>
+      </w:pPr>
+      <w:r>
+        <w:t xml:space="preserve">29. A full camp workflow could build on this foundation</w:t>
+      </w:r>
+    </w:p>
+    <w:bookmarkStart w:id="255" w:name="say-28"/>
+    <w:p>
+      <w:pPr>
+        <w:pStyle w:val="Heading3"/>
+      </w:pPr>
+      <w:r>
+        <w:t xml:space="preserve">Say</w:t>
+      </w:r>
+    </w:p>
+    <w:p>
+      <w:pPr>
+        <w:pStyle w:val="FirstParagraph"/>
+      </w:pPr>
+      <w:r>
+        <w:t xml:space="preserve">A residential camp needs more than a registration and a bed assignment. The current lodging, meal, registration and check-in foundations could support future work. Camp operations would also need clear cabin and counselor responsibility, activity scheduling, guardian consent, appropriate care access, transport and authorized pickup. Those roles and policies must be designed deliberately. UltraCamp is a separate, optional discovery path in the later roadmap. Its allowed data, licensing and API coverage need confirmation, especially for protected forms and care information. We have a separate camp discovery document so this possibility can be assessed without claiming that a complete camp system or automatic synchronization is already available.</w:t>
+      </w:r>
+    </w:p>
+    <w:bookmarkEnd w:id="255"/>
+    <w:bookmarkStart w:id="256" w:name="point-to-or-demonstrate-19"/>
+    <w:p>
+      <w:pPr>
+        <w:pStyle w:val="Heading3"/>
+      </w:pPr>
+      <w:r>
+        <w:t xml:space="preserve">Point to or demonstrate</w:t>
+      </w:r>
+    </w:p>
+    <w:p>
+      <w:pPr>
+        <w:pStyle w:val="FirstParagraph"/>
+      </w:pPr>
+      <w:r>
+        <w:t xml:space="preserve">Follow the diagram from existing foundations through camp responsibility gaps to the optional vendor boundary. Describe this as a capability discussion, not an announced replacement or integration plan.</w:t>
+      </w:r>
+    </w:p>
+    <w:bookmarkEnd w:id="256"/>
+    <w:bookmarkStart w:id="257" w:name="ask-the-group-9"/>
+    <w:p>
+      <w:pPr>
+        <w:pStyle w:val="Heading3"/>
+      </w:pPr>
+      <w:r>
+        <w:t xml:space="preserve">Ask the group</w:t>
+      </w:r>
+    </w:p>
+    <w:p>
+      <w:pPr>
+        <w:pStyle w:val="FirstParagraph"/>
+      </w:pPr>
+      <w:r>
+        <w:t xml:space="preserve">Which camp responsibility is hardest to manage reliably today?</w:t>
+      </w:r>
+    </w:p>
+    <w:bookmarkEnd w:id="257"/>
+    <w:bookmarkStart w:id="258" w:name="capability-status-4"/>
+    <w:p>
+      <w:pPr>
+        <w:pStyle w:val="Heading3"/>
+      </w:pPr>
+      <w:r>
+        <w:t xml:space="preserve">Capability status</w:t>
+      </w:r>
+    </w:p>
+    <w:p>
+      <w:pPr>
+        <w:pStyle w:val="FirstParagraph"/>
+      </w:pPr>
+      <w:r>
+        <w:t xml:space="preserve">POSSIBLE. A camp system adds care, supervision and release responsibilities beyond a lodging reservation.</w:t>
+      </w:r>
+    </w:p>
+    <w:bookmarkEnd w:id="258"/>
+    <w:bookmarkStart w:id="269" w:name="preparation-references--not-spoken-28"/>
+    <w:p>
+      <w:pPr>
+        <w:pStyle w:val="Heading3"/>
+      </w:pPr>
+      <w:r>
+        <w:t xml:space="preserve">Preparation references — not spoken</w:t>
+      </w:r>
+    </w:p>
+    <w:p>
+      <w:pPr>
+        <w:pStyle w:val="Compact"/>
+        <w:numPr>
+          <w:ilvl w:val="0"/>
+          <w:numId w:val="1053"/>
+        </w:numPr>
+      </w:pPr>
+      <w:hyperlink r:id="rId207">
+        <w:r>
+          <w:rPr>
+            <w:rStyle w:val="Hyperlink"/>
+          </w:rPr>
+          <w:t xml:space="preserve">docs/LODGING.md</w:t>
+        </w:r>
+      </w:hyperlink>
+    </w:p>
+    <w:p>
+      <w:pPr>
+        <w:pStyle w:val="Compact"/>
+        <w:numPr>
+          <w:ilvl w:val="0"/>
+          <w:numId w:val="1053"/>
+        </w:numPr>
+      </w:pPr>
+      <w:hyperlink r:id="rId208">
+        <w:r>
+          <w:rPr>
+            <w:rStyle w:val="Hyperlink"/>
+          </w:rPr>
+          <w:t xml:space="preserve">docs/MEALS.md</w:t>
+        </w:r>
+      </w:hyperlink>
+    </w:p>
+    <w:p>
+      <w:pPr>
+        <w:pStyle w:val="Compact"/>
+        <w:numPr>
+          <w:ilvl w:val="0"/>
+          <w:numId w:val="1053"/>
+        </w:numPr>
+      </w:pPr>
+      <w:hyperlink r:id="rId259">
+        <w:r>
+          <w:rPr>
+            <w:rStyle w:val="Hyperlink"/>
+          </w:rPr>
+          <w:t xml:space="preserve">docs/decisions/0005-protected-records-policy.md</w:t>
+        </w:r>
+      </w:hyperlink>
+    </w:p>
+    <w:p>
+      <w:pPr>
+        <w:pStyle w:val="Compact"/>
+        <w:numPr>
+          <w:ilvl w:val="0"/>
+          <w:numId w:val="1053"/>
+        </w:numPr>
+      </w:pPr>
+      <w:hyperlink r:id="rId260">
+        <w:r>
+          <w:rPr>
+            <w:rStyle w:val="Hyperlink"/>
+          </w:rPr>
+          <w:t xml:space="preserve">docs/decisions/0011-personnel-pipeline-policy.md</w:t>
+        </w:r>
+      </w:hyperlink>
+    </w:p>
+    <w:p>
+      <w:pPr>
+        <w:pStyle w:val="Compact"/>
+        <w:numPr>
+          <w:ilvl w:val="0"/>
+          <w:numId w:val="1053"/>
+        </w:numPr>
+      </w:pPr>
+      <w:hyperlink r:id="rId261">
+        <w:r>
+          <w:rPr>
+            <w:rStyle w:val="Hyperlink"/>
+          </w:rPr>
+          <w:t xml:space="preserve">docs/platform-documentation/2026-10-21/content/04-camp-system-and-ultracamp.md</w:t>
+        </w:r>
+      </w:hyperlink>
+    </w:p>
+    <w:p>
+      <w:pPr>
+        <w:pStyle w:val="Compact"/>
+        <w:numPr>
+          <w:ilvl w:val="0"/>
+          <w:numId w:val="1053"/>
+        </w:numPr>
+      </w:pPr>
+      <w:hyperlink r:id="rId226">
+        <w:r>
+          <w:rPr>
+            <w:rStyle w:val="Hyperlink"/>
+          </w:rPr>
+          <w:t xml:space="preserve">Roadmap / issue #98</w:t>
+        </w:r>
+      </w:hyperlink>
+    </w:p>
+    <w:p>
+      <w:pPr>
+        <w:pStyle w:val="Compact"/>
+        <w:numPr>
+          <w:ilvl w:val="0"/>
+          <w:numId w:val="1053"/>
+        </w:numPr>
+      </w:pPr>
+      <w:hyperlink r:id="rId262">
+        <w:r>
+          <w:rPr>
+            <w:rStyle w:val="Hyperlink"/>
+          </w:rPr>
+          <w:t xml:space="preserve">Roadmap / issue #65</w:t>
+        </w:r>
+      </w:hyperlink>
+    </w:p>
+    <w:p>
+      <w:pPr>
+        <w:pStyle w:val="Compact"/>
+        <w:numPr>
+          <w:ilvl w:val="0"/>
+          <w:numId w:val="1053"/>
+        </w:numPr>
+      </w:pPr>
+      <w:hyperlink r:id="rId263">
+        <w:r>
+          <w:rPr>
+            <w:rStyle w:val="Hyperlink"/>
+          </w:rPr>
+          <w:t xml:space="preserve">Roadmap / issue #71</w:t>
+        </w:r>
+      </w:hyperlink>
+    </w:p>
+    <w:p>
+      <w:pPr>
+        <w:pStyle w:val="Compact"/>
+        <w:numPr>
+          <w:ilvl w:val="0"/>
+          <w:numId w:val="1053"/>
+        </w:numPr>
+      </w:pPr>
+      <w:hyperlink r:id="rId264">
+        <w:r>
+          <w:rPr>
+            <w:rStyle w:val="Hyperlink"/>
+          </w:rPr>
+          <w:t xml:space="preserve">Roadmap / issue #78</w:t>
+        </w:r>
+      </w:hyperlink>
+    </w:p>
+    <w:p>
+      <w:pPr>
+        <w:pStyle w:val="Compact"/>
+        <w:numPr>
+          <w:ilvl w:val="0"/>
+          <w:numId w:val="1053"/>
+        </w:numPr>
+      </w:pPr>
+      <w:hyperlink r:id="rId265">
+        <w:r>
+          <w:rPr>
+            <w:rStyle w:val="Hyperlink"/>
+          </w:rPr>
+          <w:t xml:space="preserve">Roadmap / issue #79</w:t>
+        </w:r>
+      </w:hyperlink>
+    </w:p>
+    <w:p>
+      <w:pPr>
+        <w:pStyle w:val="Compact"/>
+        <w:numPr>
+          <w:ilvl w:val="0"/>
+          <w:numId w:val="1053"/>
+        </w:numPr>
+      </w:pPr>
+      <w:hyperlink r:id="rId266">
+        <w:r>
+          <w:rPr>
+            <w:rStyle w:val="Hyperlink"/>
+          </w:rPr>
+          <w:t xml:space="preserve">Roadmap / issue #89</w:t>
+        </w:r>
+      </w:hyperlink>
+    </w:p>
+    <w:p>
+      <w:pPr>
+        <w:pStyle w:val="Compact"/>
+        <w:numPr>
+          <w:ilvl w:val="0"/>
+          <w:numId w:val="1053"/>
+        </w:numPr>
+      </w:pPr>
+      <w:hyperlink r:id="rId267">
+        <w:r>
+          <w:rPr>
+            <w:rStyle w:val="Hyperlink"/>
+          </w:rPr>
+          <w:t xml:space="preserve">Roadmap / issue #237</w:t>
+        </w:r>
+      </w:hyperlink>
+    </w:p>
+    <w:p>
+      <w:pPr>
+        <w:pStyle w:val="Compact"/>
+        <w:numPr>
+          <w:ilvl w:val="0"/>
+          <w:numId w:val="1053"/>
+        </w:numPr>
+      </w:pPr>
+      <w:hyperlink r:id="rId268">
+        <w:r>
+          <w:rPr>
+            <w:rStyle w:val="Hyperlink"/>
+          </w:rPr>
+          <w:t xml:space="preserve">Roadmap / issue #238</w:t>
+        </w:r>
+      </w:hyperlink>
+    </w:p>
+    <w:bookmarkEnd w:id="269"/>
+    <w:bookmarkEnd w:id="270"/>
+    <w:bookmarkStart w:id="297" w:name="X652c180441971af10d748777629faef5a37ddb3"/>
+    <w:p>
+      <w:pPr>
+        <w:pStyle w:val="Heading2"/>
+      </w:pPr>
+      <w:r>
+        <w:t xml:space="preserve">30. Longer-term possibilities to develop</w:t>
+      </w:r>
+    </w:p>
+    <w:bookmarkStart w:id="271" w:name="say-29"/>
+    <w:p>
+      <w:pPr>
+        <w:pStyle w:val="Heading3"/>
+      </w:pPr>
+      <w:r>
+        <w:t xml:space="preserve">Say</w:t>
+      </w:r>
+    </w:p>
+    <w:p>
+      <w:pPr>
+        <w:pStyle w:val="FirstParagraph"/>
+      </w:pPr>
+      <w:r>
+        <w:t xml:space="preserve">There are further possibilities beyond the changes to everyday screens. Adventurer ministry has its own program, materials and scope decisions. Wallet passes could build on the web passes that already exist; a native mobile experience would also need its own provider, privacy and offline rules. Merchandise checkout remains on hold, and a camp-store account would be a larger project than today's Orders helper. Surveys, certificates and recorded outcomes could improve follow-up after an event. These items have different levels of detail and different dependencies. They are possibilities on the longer roadmap, not an announcement that everything is approved, scheduled or available now. Donations, fundraising and designated funds are another later track, separate from current church invoicing and the Orders helper.</w:t>
+      </w:r>
+    </w:p>
+    <w:bookmarkEnd w:id="271"/>
+    <w:bookmarkStart w:id="272" w:name="point-to-or-demonstrate-20"/>
+    <w:p>
+      <w:pPr>
+        <w:pStyle w:val="Heading3"/>
+      </w:pPr>
+      <w:r>
+        <w:t xml:space="preserve">Point to or demonstrate</w:t>
+      </w:r>
+    </w:p>
+    <w:p>
+      <w:pPr>
+        <w:pStyle w:val="FirstParagraph"/>
+      </w:pPr>
+      <w:r>
+        <w:t xml:space="preserve">Point to the different status labels. Ask for useful examples of need rather than presenting a delivery schedule. The canonical roadmap remains the source of implementation order.</w:t>
+      </w:r>
+    </w:p>
+    <w:bookmarkEnd w:id="272"/>
+    <w:bookmarkStart w:id="273" w:name="ask-the-group-10"/>
+    <w:p>
+      <w:pPr>
+        <w:pStyle w:val="Heading3"/>
+      </w:pPr>
+      <w:r>
+        <w:t xml:space="preserve">Ask the group</w:t>
+      </w:r>
+    </w:p>
+    <w:p>
+      <w:pPr>
+        <w:pStyle w:val="FirstParagraph"/>
+      </w:pPr>
+      <w:r>
+        <w:t xml:space="preserve">Which future outcome would solve a concrete problem for your club or event team?</w:t>
+      </w:r>
+    </w:p>
+    <w:bookmarkEnd w:id="273"/>
+    <w:bookmarkStart w:id="274" w:name="capability-status-5"/>
+    <w:p>
+      <w:pPr>
+        <w:pStyle w:val="Heading3"/>
+      </w:pPr>
+      <w:r>
+        <w:t xml:space="preserve">Capability status</w:t>
+      </w:r>
+    </w:p>
+    <w:p>
+      <w:pPr>
+        <w:pStyle w:val="FirstParagraph"/>
+      </w:pPr>
+      <w:r>
+        <w:t xml:space="preserve">POSSIBLE. Future scope follows the existing roadmap, decisions and event needs; no delivery dates are set.</w:t>
+      </w:r>
+    </w:p>
+    <w:bookmarkEnd w:id="274"/>
+    <w:bookmarkStart w:id="296" w:name="preparation-references--not-spoken-29"/>
+    <w:p>
+      <w:pPr>
+        <w:pStyle w:val="Heading3"/>
+      </w:pPr>
+      <w:r>
+        <w:t xml:space="preserve">Preparation references — not spoken</w:t>
+      </w:r>
+    </w:p>
+    <w:p>
+      <w:pPr>
+        <w:pStyle w:val="Compact"/>
+        <w:numPr>
+          <w:ilvl w:val="0"/>
+          <w:numId w:val="1054"/>
+        </w:numPr>
+      </w:pPr>
+      <w:hyperlink r:id="rId275">
+        <w:r>
+          <w:rPr>
+            <w:rStyle w:val="Hyperlink"/>
+          </w:rPr>
+          <w:t xml:space="preserve">docs/NEW-CLUB-APPLICATIONS.md</w:t>
+        </w:r>
+      </w:hyperlink>
+    </w:p>
+    <w:p>
+      <w:pPr>
+        <w:pStyle w:val="Compact"/>
+        <w:numPr>
+          <w:ilvl w:val="0"/>
+          <w:numId w:val="1054"/>
+        </w:numPr>
+      </w:pPr>
+      <w:hyperlink r:id="rId276">
+        <w:r>
+          <w:rPr>
+            <w:rStyle w:val="Hyperlink"/>
+          </w:rPr>
+          <w:t xml:space="preserve">docs/ATTENDEE-ACCOUNT-RELEASE.md</w:t>
+        </w:r>
+      </w:hyperlink>
+    </w:p>
+    <w:p>
+      <w:pPr>
+        <w:pStyle w:val="Compact"/>
+        <w:numPr>
+          <w:ilvl w:val="0"/>
+          <w:numId w:val="1054"/>
+        </w:numPr>
+      </w:pPr>
+      <w:hyperlink r:id="rId277">
+        <w:r>
+          <w:rPr>
+            <w:rStyle w:val="Hyperlink"/>
+          </w:rPr>
+          <w:t xml:space="preserve">docs/MERCHANDISE-LEDGER-MIGRATION.md</w:t>
+        </w:r>
+      </w:hyperlink>
+    </w:p>
+    <w:p>
+      <w:pPr>
+        <w:pStyle w:val="Compact"/>
+        <w:numPr>
+          <w:ilvl w:val="0"/>
+          <w:numId w:val="1054"/>
+        </w:numPr>
+      </w:pPr>
+      <w:hyperlink r:id="rId260">
+        <w:r>
+          <w:rPr>
+            <w:rStyle w:val="Hyperlink"/>
+          </w:rPr>
+          <w:t xml:space="preserve">docs/decisions/0011-personnel-pipeline-policy.md</w:t>
+        </w:r>
+      </w:hyperlink>
+    </w:p>
+    <w:p>
+      <w:pPr>
+        <w:pStyle w:val="Compact"/>
+        <w:numPr>
+          <w:ilvl w:val="0"/>
+          <w:numId w:val="1054"/>
+        </w:numPr>
+      </w:pPr>
+      <w:hyperlink r:id="rId226">
+        <w:r>
+          <w:rPr>
+            <w:rStyle w:val="Hyperlink"/>
+          </w:rPr>
+          <w:t xml:space="preserve">Roadmap / issue #98</w:t>
+        </w:r>
+      </w:hyperlink>
+    </w:p>
+    <w:p>
+      <w:pPr>
+        <w:pStyle w:val="Compact"/>
+        <w:numPr>
+          <w:ilvl w:val="0"/>
+          <w:numId w:val="1054"/>
+        </w:numPr>
+      </w:pPr>
+      <w:hyperlink r:id="rId278">
+        <w:r>
+          <w:rPr>
+            <w:rStyle w:val="Hyperlink"/>
+          </w:rPr>
+          <w:t xml:space="preserve">Roadmap / issue #840</w:t>
+        </w:r>
+      </w:hyperlink>
+    </w:p>
+    <w:p>
+      <w:pPr>
+        <w:pStyle w:val="Compact"/>
+        <w:numPr>
+          <w:ilvl w:val="0"/>
+          <w:numId w:val="1054"/>
+        </w:numPr>
+      </w:pPr>
+      <w:hyperlink r:id="rId279">
+        <w:r>
+          <w:rPr>
+            <w:rStyle w:val="Hyperlink"/>
+          </w:rPr>
+          <w:t xml:space="preserve">Roadmap / issue #841</w:t>
+        </w:r>
+      </w:hyperlink>
+    </w:p>
+    <w:p>
+      <w:pPr>
+        <w:pStyle w:val="Compact"/>
+        <w:numPr>
+          <w:ilvl w:val="0"/>
+          <w:numId w:val="1054"/>
+        </w:numPr>
+      </w:pPr>
+      <w:hyperlink r:id="rId280">
+        <w:r>
+          <w:rPr>
+            <w:rStyle w:val="Hyperlink"/>
+          </w:rPr>
+          <w:t xml:space="preserve">Roadmap / issue #842</w:t>
+        </w:r>
+      </w:hyperlink>
+    </w:p>
+    <w:p>
+      <w:pPr>
+        <w:pStyle w:val="Compact"/>
+        <w:numPr>
+          <w:ilvl w:val="0"/>
+          <w:numId w:val="1054"/>
+        </w:numPr>
+      </w:pPr>
+      <w:hyperlink r:id="rId281">
+        <w:r>
+          <w:rPr>
+            <w:rStyle w:val="Hyperlink"/>
+          </w:rPr>
+          <w:t xml:space="preserve">Roadmap / issue #843</w:t>
+        </w:r>
+      </w:hyperlink>
+    </w:p>
+    <w:p>
+      <w:pPr>
+        <w:pStyle w:val="Compact"/>
+        <w:numPr>
+          <w:ilvl w:val="0"/>
+          <w:numId w:val="1054"/>
+        </w:numPr>
+      </w:pPr>
+      <w:hyperlink r:id="rId282">
+        <w:r>
+          <w:rPr>
+            <w:rStyle w:val="Hyperlink"/>
+          </w:rPr>
+          <w:t xml:space="preserve">Roadmap / issue #53</w:t>
+        </w:r>
+      </w:hyperlink>
+    </w:p>
+    <w:p>
+      <w:pPr>
+        <w:pStyle w:val="Compact"/>
+        <w:numPr>
+          <w:ilvl w:val="0"/>
+          <w:numId w:val="1054"/>
+        </w:numPr>
+      </w:pPr>
+      <w:hyperlink r:id="rId283">
+        <w:r>
+          <w:rPr>
+            <w:rStyle w:val="Hyperlink"/>
+          </w:rPr>
+          <w:t xml:space="preserve">Roadmap / issue #91</w:t>
+        </w:r>
+      </w:hyperlink>
+    </w:p>
+    <w:p>
+      <w:pPr>
+        <w:pStyle w:val="Compact"/>
+        <w:numPr>
+          <w:ilvl w:val="0"/>
+          <w:numId w:val="1054"/>
+        </w:numPr>
+      </w:pPr>
+      <w:hyperlink r:id="rId284">
+        <w:r>
+          <w:rPr>
+            <w:rStyle w:val="Hyperlink"/>
+          </w:rPr>
+          <w:t xml:space="preserve">Roadmap / issue #226</w:t>
+        </w:r>
+      </w:hyperlink>
+    </w:p>
+    <w:p>
+      <w:pPr>
+        <w:pStyle w:val="Compact"/>
+        <w:numPr>
+          <w:ilvl w:val="0"/>
+          <w:numId w:val="1054"/>
+        </w:numPr>
+      </w:pPr>
+      <w:hyperlink r:id="rId285">
+        <w:r>
+          <w:rPr>
+            <w:rStyle w:val="Hyperlink"/>
+          </w:rPr>
+          <w:t xml:space="preserve">Roadmap / issue #227</w:t>
+        </w:r>
+      </w:hyperlink>
+    </w:p>
+    <w:p>
+      <w:pPr>
+        <w:pStyle w:val="Compact"/>
+        <w:numPr>
+          <w:ilvl w:val="0"/>
+          <w:numId w:val="1054"/>
+        </w:numPr>
+      </w:pPr>
+      <w:hyperlink r:id="rId286">
+        <w:r>
+          <w:rPr>
+            <w:rStyle w:val="Hyperlink"/>
+          </w:rPr>
+          <w:t xml:space="preserve">Roadmap / issue #228</w:t>
+        </w:r>
+      </w:hyperlink>
+    </w:p>
+    <w:p>
+      <w:pPr>
+        <w:pStyle w:val="Compact"/>
+        <w:numPr>
+          <w:ilvl w:val="0"/>
+          <w:numId w:val="1054"/>
+        </w:numPr>
+      </w:pPr>
+      <w:hyperlink r:id="rId287">
+        <w:r>
+          <w:rPr>
+            <w:rStyle w:val="Hyperlink"/>
+          </w:rPr>
+          <w:t xml:space="preserve">Roadmap / issue #54</w:t>
+        </w:r>
+      </w:hyperlink>
+    </w:p>
+    <w:p>
+      <w:pPr>
+        <w:pStyle w:val="Compact"/>
+        <w:numPr>
+          <w:ilvl w:val="0"/>
+          <w:numId w:val="1054"/>
+        </w:numPr>
+      </w:pPr>
+      <w:hyperlink r:id="rId288">
+        <w:r>
+          <w:rPr>
+            <w:rStyle w:val="Hyperlink"/>
+          </w:rPr>
+          <w:t xml:space="preserve">Roadmap / issue #146</w:t>
+        </w:r>
+      </w:hyperlink>
+    </w:p>
+    <w:p>
+      <w:pPr>
+        <w:pStyle w:val="Compact"/>
+        <w:numPr>
+          <w:ilvl w:val="0"/>
+          <w:numId w:val="1054"/>
+        </w:numPr>
+      </w:pPr>
+      <w:hyperlink r:id="rId289">
+        <w:r>
+          <w:rPr>
+            <w:rStyle w:val="Hyperlink"/>
+          </w:rPr>
+          <w:t xml:space="preserve">Roadmap / issue #147</w:t>
+        </w:r>
+      </w:hyperlink>
+    </w:p>
+    <w:p>
+      <w:pPr>
+        <w:pStyle w:val="Compact"/>
+        <w:numPr>
+          <w:ilvl w:val="0"/>
+          <w:numId w:val="1054"/>
+        </w:numPr>
+      </w:pPr>
+      <w:hyperlink r:id="rId290">
+        <w:r>
+          <w:rPr>
+            <w:rStyle w:val="Hyperlink"/>
+          </w:rPr>
+          <w:t xml:space="preserve">Roadmap / issue #148</w:t>
+        </w:r>
+      </w:hyperlink>
+    </w:p>
+    <w:p>
+      <w:pPr>
+        <w:pStyle w:val="Compact"/>
+        <w:numPr>
+          <w:ilvl w:val="0"/>
+          <w:numId w:val="1054"/>
+        </w:numPr>
+      </w:pPr>
+      <w:hyperlink r:id="rId291">
+        <w:r>
+          <w:rPr>
+            <w:rStyle w:val="Hyperlink"/>
+          </w:rPr>
+          <w:t xml:space="preserve">Roadmap / issue #90</w:t>
+        </w:r>
+      </w:hyperlink>
+    </w:p>
+    <w:p>
+      <w:pPr>
+        <w:pStyle w:val="Compact"/>
+        <w:numPr>
+          <w:ilvl w:val="0"/>
+          <w:numId w:val="1054"/>
+        </w:numPr>
+      </w:pPr>
+      <w:hyperlink r:id="rId292">
+        <w:r>
+          <w:rPr>
+            <w:rStyle w:val="Hyperlink"/>
+          </w:rPr>
+          <w:t xml:space="preserve">Roadmap / issue #233</w:t>
+        </w:r>
+      </w:hyperlink>
+    </w:p>
+    <w:p>
+      <w:pPr>
+        <w:pStyle w:val="Compact"/>
+        <w:numPr>
+          <w:ilvl w:val="0"/>
+          <w:numId w:val="1054"/>
+        </w:numPr>
+      </w:pPr>
+      <w:hyperlink r:id="rId293">
+        <w:r>
+          <w:rPr>
+            <w:rStyle w:val="Hyperlink"/>
+          </w:rPr>
+          <w:t xml:space="preserve">Roadmap / issue #234</w:t>
+        </w:r>
+      </w:hyperlink>
+    </w:p>
+    <w:p>
+      <w:pPr>
+        <w:pStyle w:val="Compact"/>
+        <w:numPr>
+          <w:ilvl w:val="0"/>
+          <w:numId w:val="1054"/>
+        </w:numPr>
+      </w:pPr>
+      <w:hyperlink r:id="rId294">
+        <w:r>
+          <w:rPr>
+            <w:rStyle w:val="Hyperlink"/>
+          </w:rPr>
+          <w:t xml:space="preserve">Roadmap / issue #235</w:t>
+        </w:r>
+      </w:hyperlink>
+    </w:p>
+    <w:p>
+      <w:pPr>
+        <w:pStyle w:val="Compact"/>
+        <w:numPr>
+          <w:ilvl w:val="0"/>
+          <w:numId w:val="1054"/>
+        </w:numPr>
+      </w:pPr>
+      <w:hyperlink r:id="rId295">
+        <w:r>
+          <w:rPr>
+            <w:rStyle w:val="Hyperlink"/>
+          </w:rPr>
+          <w:t xml:space="preserve">Roadmap / issue #95</w:t>
+        </w:r>
+      </w:hyperlink>
+    </w:p>
+    <w:bookmarkEnd w:id="296"/>
+    <w:bookmarkEnd w:id="297"/>
+    <w:bookmarkStart w:id="303" w:name="X0afc5c14d790d862b4f988b904827637de58660"/>
+    <w:p>
+      <w:pPr>
+        <w:pStyle w:val="Heading2"/>
+      </w:pPr>
+      <w:r>
+        <w:t xml:space="preserve">31. Check the result. Sign out. Return to the same place.</w:t>
+      </w:r>
+    </w:p>
+    <w:bookmarkStart w:id="298" w:name="say-30"/>
+    <w:p>
+      <w:pPr>
+        <w:pStyle w:val="Heading3"/>
+      </w:pPr>
+      <w:r>
+        <w:t xml:space="preserve">Say</w:t>
+      </w:r>
+    </w:p>
+    <w:p>
+      <w:pPr>
+        <w:pStyle w:val="FirstParagraph"/>
+      </w:pPr>
+      <w:r>
         <w:t xml:space="preserve">The aim is not to memorize every menu. Use your own account, choose the right club or coordinator view and check the result of the work. A saved draft, a submitted report and an event registration confirmation mean different things. Choose one realistic task to practice next: a director can find the roster or a Monthly Record; a coordinator can find a club and read one month. Then choose Sign out, especially on a shared device. Closing a tab is not the same action. Next time, return to events dot imsda dot org and sign in with the account you already have.</w:t>
       </w:r>
     </w:p>
-    <w:bookmarkEnd w:id="183"/>
-    <w:bookmarkStart w:id="184" w:name="ask-the-group-5"/>
+    <w:bookmarkEnd w:id="298"/>
+    <w:bookmarkStart w:id="299" w:name="ask-the-group-11"/>
     <w:p>
       <w:pPr>
         <w:pStyle w:val="Heading3"/>
@@ -3148,8 +5231,8 @@
         <w:t xml:space="preserve">Which one task will you practice first? Use the quick-start handout when you need the steps.</w:t>
       </w:r>
     </w:p>
-    <w:bookmarkEnd w:id="184"/>
-    <w:bookmarkStart w:id="185" w:name="visual-example-24"/>
+    <w:bookmarkEnd w:id="299"/>
+    <w:bookmarkStart w:id="300" w:name="visual-example-24"/>
     <w:p>
       <w:pPr>
         <w:pStyle w:val="Heading3"/>
@@ -3163,7 +5246,7 @@
         <w:pStyle w:val="Compact"/>
         <w:numPr>
           <w:ilvl w:val="0"/>
-          <w:numId w:val="1049"/>
+          <w:numId w:val="1055"/>
         </w:numPr>
       </w:pPr>
       <w:r>
@@ -3175,15 +5258,15 @@
         <w:pStyle w:val="Compact"/>
         <w:numPr>
           <w:ilvl w:val="0"/>
-          <w:numId w:val="1049"/>
+          <w:numId w:val="1055"/>
         </w:numPr>
       </w:pPr>
       <w:r>
         <w:t xml:space="preserve">Use Sign out before leaving: Account Profile and the actual Sign out control in the portal header.</w:t>
       </w:r>
     </w:p>
-    <w:bookmarkEnd w:id="185"/>
-    <w:bookmarkStart w:id="187" w:name="preparation-references--not-spoken-24"/>
+    <w:bookmarkEnd w:id="300"/>
+    <w:bookmarkStart w:id="302" w:name="preparation-references--not-spoken-30"/>
     <w:p>
       <w:pPr>
         <w:pStyle w:val="Heading3"/>
@@ -3197,10 +5280,10 @@
         <w:pStyle w:val="Compact"/>
         <w:numPr>
           <w:ilvl w:val="0"/>
-          <w:numId w:val="1050"/>
-        </w:numPr>
-      </w:pPr>
-      <w:hyperlink r:id="rId186">
+          <w:numId w:val="1056"/>
+        </w:numPr>
+      </w:pPr>
+      <w:hyperlink r:id="rId301">
         <w:r>
           <w:rPr>
             <w:rStyle w:val="Hyperlink"/>
@@ -3214,7 +5297,7 @@
         <w:pStyle w:val="Compact"/>
         <w:numPr>
           <w:ilvl w:val="0"/>
-          <w:numId w:val="1050"/>
+          <w:numId w:val="1056"/>
         </w:numPr>
       </w:pPr>
       <w:hyperlink r:id="rId24">
@@ -3226,9 +5309,9 @@
         </w:r>
       </w:hyperlink>
     </w:p>
-    <w:bookmarkEnd w:id="187"/>
-    <w:bookmarkEnd w:id="188"/>
-    <w:bookmarkEnd w:id="189"/>
+    <w:bookmarkEnd w:id="302"/>
+    <w:bookmarkEnd w:id="303"/>
+    <w:bookmarkEnd w:id="304"/>
     <w:sectPr>
       <w:headerReference r:id="rId9" w:type="default"/>
       <w:footerReference r:id="rId10" w:type="default"/>
@@ -3793,6 +5876,24 @@
     <w:abstractNumId w:val="991"/>
   </w:num>
   <w:num w:numId="1050">
+    <w:abstractNumId w:val="991"/>
+  </w:num>
+  <w:num w:numId="1051">
+    <w:abstractNumId w:val="991"/>
+  </w:num>
+  <w:num w:numId="1052">
+    <w:abstractNumId w:val="991"/>
+  </w:num>
+  <w:num w:numId="1053">
+    <w:abstractNumId w:val="991"/>
+  </w:num>
+  <w:num w:numId="1054">
+    <w:abstractNumId w:val="991"/>
+  </w:num>
+  <w:num w:numId="1055">
+    <w:abstractNumId w:val="991"/>
+  </w:num>
+  <w:num w:numId="1056">
     <w:abstractNumId w:val="991"/>
   </w:num>
 </w:numbering>

</xml_diff>

<commit_message>
docs: show club tools and revise meeting form walkthrough
</commit_message>
<xml_diff>
--- a/docs/platform-documentation/2026-10-21/exports/06-presenter-notes.docx
+++ b/docs/platform-documentation/2026-10-21/exports/06-presenter-notes.docx
@@ -2,7 +2,7 @@
 <file path=word/document.xml><?xml version="1.0" encoding="utf-8"?>
 <w:document xmlns:w="http://schemas.openxmlformats.org/wordprocessingml/2006/main" xmlns:m="http://schemas.openxmlformats.org/officeDocument/2006/math" xmlns:r="http://schemas.openxmlformats.org/officeDocument/2006/relationships" xmlns:o="urn:schemas-microsoft-com:office:office" xmlns:v="urn:schemas-microsoft-com:vml" xmlns:w10="urn:schemas-microsoft-com:office:word" xmlns:a="http://schemas.openxmlformats.org/drawingml/2006/main" xmlns:pic="http://schemas.openxmlformats.org/drawingml/2006/picture" xmlns:wp="http://schemas.openxmlformats.org/drawingml/2006/wordprocessingDrawing">
   <w:body>
-    <w:bookmarkStart w:id="304" w:name="X49edbb978561ba76c0b3afe73d562b6de72a494"/>
+    <w:bookmarkStart w:id="325" w:name="X49edbb978561ba76c0b3afe73d562b6de72a494"/>
     <w:p>
       <w:pPr>
         <w:pStyle w:val="Heading1"/>
@@ -28,13 +28,31 @@
           <w:b/>
           <w:bCs/>
         </w:rPr>
-        <w:t xml:space="preserve">Optional closing section:</w:t>
+        <w:t xml:space="preserve">More tools and meeting section:</w:t>
       </w:r>
       <w:r>
         <w:t xml:space="preserve"> </w:t>
       </w:r>
       <w:r>
-        <w:t xml:space="preserve">slides 25–30 show other current tools, planned design/form-builder work and longer-term possibilities. These are capability illustrations, not application screenshots. Each slide labels its status; they do not promise a delivery date. Slide 31 finishes the session. For a task-only orientation, use slides 1–24 and 31.</w:t>
+        <w:t xml:space="preserve">slides 25–27 demonstrate Class tracking, Orders and the Year-End Report with fictional-data screenshots. Slides 28–32 cover event-team capabilities, planned workspace improvements, a practical form-building meeting walkthrough and longer-term possibilities. Capability diagrams label their status; they are not future app screenshots. Slide 33 finishes the session. A shorter orientation can use slides 1–24 and 33.</w:t>
+      </w:r>
+    </w:p>
+    <w:p>
+      <w:pPr>
+        <w:pStyle w:val="BodyText"/>
+      </w:pPr>
+      <w:r>
+        <w:rPr>
+          <w:b/>
+          <w:bCs/>
+        </w:rPr>
+        <w:t xml:space="preserve">Form-builder meeting preparation:</w:t>
+      </w:r>
+      <w:r>
+        <w:t xml:space="preserve"> </w:t>
+      </w:r>
+      <w:r>
+        <w:t xml:space="preserve">the owner expects the editor changes before the meeting. The form slide teaches the stable build/save/preview/test/publish workflow rather than advertising those changes as a distant-future feature. Refresh editor screenshots and exact button labels against the approved meeting-day release. This pack does not claim the reviewed open redesign scope has already shipped.</w:t>
       </w:r>
     </w:p>
     <w:p>
@@ -3122,13 +3140,13 @@
     </w:p>
     <w:bookmarkEnd w:id="181"/>
     <w:bookmarkEnd w:id="182"/>
-    <w:bookmarkStart w:id="196" w:name="Xeddb98caf26ce68dce77c8b14951d35aae6da68"/>
+    <w:bookmarkStart w:id="195" w:name="X57b4d14380e40c355b713b1bb443266ac37da90"/>
     <w:p>
       <w:pPr>
         <w:pStyle w:val="Heading2"/>
       </w:pPr>
       <w:r>
-        <w:t xml:space="preserve">25. More club tools are already here</w:t>
+        <w:t xml:space="preserve">25. Record completed classes and earned items</w:t>
       </w:r>
     </w:p>
     <w:bookmarkStart w:id="183" w:name="say-24"/>
@@ -3145,7 +3163,7 @@
         <w:pStyle w:val="FirstParagraph"/>
       </w:pPr>
       <w:r>
-        <w:t xml:space="preserve">The walkthrough showed the tasks people often need first. There are other current club tools to use through the year. Class tracking records supported earned items, including class insignia and event patches; it is not a universal checklist for every curriculum requirement. Orders helps the club organize needed supplies, stock and hand-outs rather than taking an online payment. Year-end reports bring together the year's recorded work for review. Jordan should still check the club, year and actual saved information before making a change or submitting a report. The tools shown depend on the person's club role.</w:t>
+        <w:t xml:space="preserve">Class tracking keeps completed classes and supported earned items with the member. In our fictional example, Morgan is in Companion and has a recorded Friend completion. The saved history prevents recording the same completion again. That completion suggests the corresponding insignia, but it does not order anything by itself. Jordan reviews the suggested items and chooses Add to order list only for items actually needed. Other supported records include event patches, Good Conduct, TLT items and Master Award progress. This is not a checklist for every curriculum requirement. Directors and deputies record these items; narrower roles retain their own access.</w:t>
       </w:r>
     </w:p>
     <w:bookmarkEnd w:id="183"/>
@@ -3163,7 +3181,7 @@
         <w:pStyle w:val="FirstParagraph"/>
       </w:pPr>
       <w:r>
-        <w:t xml:space="preserve">Use this capability map to explain the purpose of Class tracking, Orders and the year-end report. These are infographic labels, not new app controls. Refer back to the current club navigation if someone wants to practice.</w:t>
+        <w:t xml:space="preserve">Open Class tracking. Read Morgan’s saved Friend completion and Class history, then inspect the separate Suggested insignia panel and Add to order list action. Explain that marking a class completed and adding its items to the order helper are separate steps. Do not repeat a completion that is already recorded.</w:t>
       </w:r>
     </w:p>
     <w:bookmarkEnd w:id="184"/>
@@ -3181,7 +3199,7 @@
         <w:pStyle w:val="FirstParagraph"/>
       </w:pPr>
       <w:r>
-        <w:t xml:space="preserve">Which of these tools would help your club avoid maintaining a second list?</w:t>
+        <w:t xml:space="preserve">Does a completed class automatically place an order or change stock?</w:t>
       </w:r>
     </w:p>
     <w:bookmarkEnd w:id="185"/>
@@ -3199,16 +3217,50 @@
         <w:pStyle w:val="FirstParagraph"/>
       </w:pPr>
       <w:r>
-        <w:t xml:space="preserve">CURRENT. The same club records support achievements, supplies and year-end reporting.</w:t>
+        <w:t xml:space="preserve">CURRENT. Completing a class suggests insignia. Add to order list is a separate choice.</w:t>
       </w:r>
     </w:p>
     <w:bookmarkEnd w:id="186"/>
-    <w:bookmarkStart w:id="195" w:name="preparation-references--not-spoken-24"/>
+    <w:bookmarkStart w:id="187" w:name="visual-example-24"/>
     <w:p>
       <w:pPr>
         <w:pStyle w:val="Heading3"/>
       </w:pPr>
       <w:r>
+        <w:t xml:space="preserve">Visual example</w:t>
+      </w:r>
+    </w:p>
+    <w:p>
+      <w:pPr>
+        <w:pStyle w:val="Compact"/>
+        <w:numPr>
+          <w:ilvl w:val="0"/>
+          <w:numId w:val="1049"/>
+        </w:numPr>
+      </w:pPr>
+      <w:r>
+        <w:t xml:space="preserve">Morgan · recorded Friend completion: Morgan Reed’s Friend completion is recorded. The filtered member table shows the completion date and Class history.</w:t>
+      </w:r>
+    </w:p>
+    <w:p>
+      <w:pPr>
+        <w:pStyle w:val="Compact"/>
+        <w:numPr>
+          <w:ilvl w:val="0"/>
+          <w:numId w:val="1049"/>
+        </w:numPr>
+      </w:pPr>
+      <w:r>
+        <w:t xml:space="preserve">Insignia · a separate order-list choice: Morgan Reed’s four suggested Friend insignia items require a separate Add to order list confirmation.</w:t>
+      </w:r>
+    </w:p>
+    <w:bookmarkEnd w:id="187"/>
+    <w:bookmarkStart w:id="194" w:name="preparation-references--not-spoken-24"/>
+    <w:p>
+      <w:pPr>
+        <w:pStyle w:val="Heading3"/>
+      </w:pPr>
+      <w:r>
         <w:t xml:space="preserve">Preparation references — not spoken</w:t>
       </w:r>
     </w:p>
@@ -3217,10 +3269,61 @@
         <w:pStyle w:val="Compact"/>
         <w:numPr>
           <w:ilvl w:val="0"/>
-          <w:numId w:val="1049"/>
-        </w:numPr>
-      </w:pPr>
-      <w:hyperlink r:id="rId187">
+          <w:numId w:val="1050"/>
+        </w:numPr>
+      </w:pPr>
+      <w:hyperlink r:id="rId188">
+        <w:r>
+          <w:rPr>
+            <w:rStyle w:val="Hyperlink"/>
+          </w:rPr>
+          <w:t xml:space="preserve">components/club-earned-awards-workspace.tsx</w:t>
+        </w:r>
+      </w:hyperlink>
+    </w:p>
+    <w:p>
+      <w:pPr>
+        <w:pStyle w:val="Compact"/>
+        <w:numPr>
+          <w:ilvl w:val="0"/>
+          <w:numId w:val="1050"/>
+        </w:numPr>
+      </w:pPr>
+      <w:hyperlink r:id="rId189">
+        <w:r>
+          <w:rPr>
+            <w:rStyle w:val="Hyperlink"/>
+          </w:rPr>
+          <w:t xml:space="preserve">modules/earned-awards/order-source.ts</w:t>
+        </w:r>
+      </w:hyperlink>
+    </w:p>
+    <w:p>
+      <w:pPr>
+        <w:pStyle w:val="Compact"/>
+        <w:numPr>
+          <w:ilvl w:val="0"/>
+          <w:numId w:val="1050"/>
+        </w:numPr>
+      </w:pPr>
+      <w:hyperlink r:id="rId190">
+        <w:r>
+          <w:rPr>
+            <w:rStyle w:val="Hyperlink"/>
+          </w:rPr>
+          <w:t xml:space="preserve">modules/earned-awards/domain.ts</w:t>
+        </w:r>
+      </w:hyperlink>
+    </w:p>
+    <w:p>
+      <w:pPr>
+        <w:pStyle w:val="Compact"/>
+        <w:numPr>
+          <w:ilvl w:val="0"/>
+          <w:numId w:val="1050"/>
+        </w:numPr>
+      </w:pPr>
+      <w:hyperlink r:id="rId25">
         <w:r>
           <w:rPr>
             <w:rStyle w:val="Hyperlink"/>
@@ -3234,15 +3337,15 @@
         <w:pStyle w:val="Compact"/>
         <w:numPr>
           <w:ilvl w:val="0"/>
-          <w:numId w:val="1049"/>
-        </w:numPr>
-      </w:pPr>
-      <w:hyperlink r:id="rId188">
+          <w:numId w:val="1050"/>
+        </w:numPr>
+      </w:pPr>
+      <w:hyperlink r:id="rId191">
         <w:r>
           <w:rPr>
             <w:rStyle w:val="Hyperlink"/>
           </w:rPr>
-          <w:t xml:space="preserve">modules/earned-awards/domain.ts</w:t>
+          <w:t xml:space="preserve">Roadmap / issue #532</w:t>
         </w:r>
       </w:hyperlink>
     </w:p>
@@ -3251,10 +3354,199 @@
         <w:pStyle w:val="Compact"/>
         <w:numPr>
           <w:ilvl w:val="0"/>
-          <w:numId w:val="1049"/>
-        </w:numPr>
-      </w:pPr>
-      <w:hyperlink r:id="rId189">
+          <w:numId w:val="1050"/>
+        </w:numPr>
+      </w:pPr>
+      <w:hyperlink r:id="rId192">
+        <w:r>
+          <w:rPr>
+            <w:rStyle w:val="Hyperlink"/>
+          </w:rPr>
+          <w:t xml:space="preserve">Roadmap / issue #184</w:t>
+        </w:r>
+      </w:hyperlink>
+    </w:p>
+    <w:p>
+      <w:pPr>
+        <w:pStyle w:val="Compact"/>
+        <w:numPr>
+          <w:ilvl w:val="0"/>
+          <w:numId w:val="1050"/>
+        </w:numPr>
+      </w:pPr>
+      <w:hyperlink r:id="rId193">
+        <w:r>
+          <w:rPr>
+            <w:rStyle w:val="Hyperlink"/>
+          </w:rPr>
+          <w:t xml:space="preserve">Roadmap / issue #185</w:t>
+        </w:r>
+      </w:hyperlink>
+    </w:p>
+    <w:bookmarkEnd w:id="194"/>
+    <w:bookmarkEnd w:id="195"/>
+    <w:bookmarkStart w:id="207" w:name="X1f8257e51b1f4ab4fc51f911447a259c7d03330"/>
+    <w:p>
+      <w:pPr>
+        <w:pStyle w:val="Heading2"/>
+      </w:pPr>
+      <w:r>
+        <w:t xml:space="preserve">26. Use Orders for supplies and hand-outs</w:t>
+      </w:r>
+    </w:p>
+    <w:bookmarkStart w:id="196" w:name="say-25"/>
+    <w:p>
+      <w:pPr>
+        <w:pStyle w:val="Heading3"/>
+      </w:pPr>
+      <w:r>
+        <w:t xml:space="preserve">Say</w:t>
+      </w:r>
+    </w:p>
+    <w:p>
+      <w:pPr>
+        <w:pStyle w:val="FirstParagraph"/>
+      </w:pPr>
+      <w:r>
+        <w:t xml:space="preserve">The scarf row shows four needed, two available and two to order. Drew’s Good Conduct Bar is selected for an actual hand-out; the saved result leaves two on hand, down from three. The app subtracts that handed-out item automatically, so do not subtract it a second time. Orders helps Jordan turn recorded needs into a practical supply list. The fictional list includes scarves and earned items. Stock is what the club already has, and a hand-out records items actually given to a member. Those are different steps, so an item on the helper list is not proof it was purchased or handed out. Use the available CSV, printable list or pick list for the real task. This is not an online checkout and does not create a personal payment for the director. Directors and deputies manage the supported records; a registrar’s view remains narrower.</w:t>
+      </w:r>
+    </w:p>
+    <w:bookmarkEnd w:id="196"/>
+    <w:bookmarkStart w:id="197" w:name="point-to-or-demonstrate-16"/>
+    <w:p>
+      <w:pPr>
+        <w:pStyle w:val="Heading3"/>
+      </w:pPr>
+      <w:r>
+        <w:t xml:space="preserve">Point to or demonstrate</w:t>
+      </w:r>
+    </w:p>
+    <w:p>
+      <w:pPr>
+        <w:pStyle w:val="FirstParagraph"/>
+      </w:pPr>
+      <w:r>
+        <w:t xml:space="preserve">Open Orders. Read the fictional scarf and earned-item needs, then compare the stock quantity and hand-out controls. Point to available exports/pick-list actions. Use only the synthetic training records if demonstrating a stock or hand-out action.</w:t>
+      </w:r>
+    </w:p>
+    <w:bookmarkEnd w:id="197"/>
+    <w:bookmarkStart w:id="198" w:name="ask-the-group-6"/>
+    <w:p>
+      <w:pPr>
+        <w:pStyle w:val="Heading3"/>
+      </w:pPr>
+      <w:r>
+        <w:t xml:space="preserve">Ask the group</w:t>
+      </w:r>
+    </w:p>
+    <w:p>
+      <w:pPr>
+        <w:pStyle w:val="FirstParagraph"/>
+      </w:pPr>
+      <w:r>
+        <w:t xml:space="preserve">If a scarf appears on the helper list, does that mean the member has received it?</w:t>
+      </w:r>
+    </w:p>
+    <w:bookmarkEnd w:id="198"/>
+    <w:bookmarkStart w:id="199" w:name="capability-status-1"/>
+    <w:p>
+      <w:pPr>
+        <w:pStyle w:val="Heading3"/>
+      </w:pPr>
+      <w:r>
+        <w:t xml:space="preserve">Capability status</w:t>
+      </w:r>
+    </w:p>
+    <w:p>
+      <w:pPr>
+        <w:pStyle w:val="FirstParagraph"/>
+      </w:pPr>
+      <w:r>
+        <w:t xml:space="preserve">CURRENT. Orders is a supply helper. A list, stock receipt and hand-out are different records.</w:t>
+      </w:r>
+    </w:p>
+    <w:bookmarkEnd w:id="199"/>
+    <w:bookmarkStart w:id="200" w:name="visual-example-25"/>
+    <w:p>
+      <w:pPr>
+        <w:pStyle w:val="Heading3"/>
+      </w:pPr>
+      <w:r>
+        <w:t xml:space="preserve">Visual example</w:t>
+      </w:r>
+    </w:p>
+    <w:p>
+      <w:pPr>
+        <w:pStyle w:val="Compact"/>
+        <w:numPr>
+          <w:ilvl w:val="0"/>
+          <w:numId w:val="1051"/>
+        </w:numPr>
+      </w:pPr>
+      <w:r>
+        <w:t xml:space="preserve">Helper list · 4 scarves needed − 2 available = 2 to order: Actual Orders helper row: Pathfinder Scarf quantity 4 minus available stock 2 gives 2 to order. Save and Remove edit this helper list.</w:t>
+      </w:r>
+    </w:p>
+    <w:p>
+      <w:pPr>
+        <w:pStyle w:val="Compact"/>
+        <w:numPr>
+          <w:ilvl w:val="0"/>
+          <w:numId w:val="1051"/>
+        </w:numPr>
+      </w:pPr>
+      <w:r>
+        <w:t xml:space="preserve">Hand out · Drew’s Good Conduct Bar: Drew Patel’s Good Conduct Bar is ready from stock. The selected row enables the actual Mark handed out action.</w:t>
+      </w:r>
+    </w:p>
+    <w:p>
+      <w:pPr>
+        <w:pStyle w:val="Compact"/>
+        <w:numPr>
+          <w:ilvl w:val="0"/>
+          <w:numId w:val="1051"/>
+        </w:numPr>
+      </w:pPr>
+      <w:r>
+        <w:t xml:space="preserve">Saved result · Good Conduct stock: 3 → 2: After the actual handout, Good Conduct Bar stock is 2. Drew’s need is no longer in Ready to hand out.</w:t>
+      </w:r>
+    </w:p>
+    <w:bookmarkEnd w:id="200"/>
+    <w:bookmarkStart w:id="206" w:name="preparation-references--not-spoken-25"/>
+    <w:p>
+      <w:pPr>
+        <w:pStyle w:val="Heading3"/>
+      </w:pPr>
+      <w:r>
+        <w:t xml:space="preserve">Preparation references — not spoken</w:t>
+      </w:r>
+    </w:p>
+    <w:p>
+      <w:pPr>
+        <w:pStyle w:val="Compact"/>
+        <w:numPr>
+          <w:ilvl w:val="0"/>
+          <w:numId w:val="1052"/>
+        </w:numPr>
+      </w:pPr>
+      <w:hyperlink r:id="rId201">
+        <w:r>
+          <w:rPr>
+            <w:rStyle w:val="Hyperlink"/>
+          </w:rPr>
+          <w:t xml:space="preserve">app/(public)/account/(portal)/clubs/[organizationId]/orders/page.tsx</w:t>
+        </w:r>
+      </w:hyperlink>
+    </w:p>
+    <w:p>
+      <w:pPr>
+        <w:pStyle w:val="Compact"/>
+        <w:numPr>
+          <w:ilvl w:val="0"/>
+          <w:numId w:val="1052"/>
+        </w:numPr>
+      </w:pPr>
+      <w:hyperlink r:id="rId202">
         <w:r>
           <w:rPr>
             <w:rStyle w:val="Hyperlink"/>
@@ -3268,10 +3560,10 @@
         <w:pStyle w:val="Compact"/>
         <w:numPr>
           <w:ilvl w:val="0"/>
-          <w:numId w:val="1049"/>
-        </w:numPr>
-      </w:pPr>
-      <w:hyperlink r:id="rId190">
+          <w:numId w:val="1052"/>
+        </w:numPr>
+      </w:pPr>
+      <w:hyperlink r:id="rId203">
         <w:r>
           <w:rPr>
             <w:rStyle w:val="Hyperlink"/>
@@ -3285,10 +3577,250 @@
         <w:pStyle w:val="Compact"/>
         <w:numPr>
           <w:ilvl w:val="0"/>
-          <w:numId w:val="1049"/>
-        </w:numPr>
-      </w:pPr>
-      <w:hyperlink r:id="rId191">
+          <w:numId w:val="1052"/>
+        </w:numPr>
+      </w:pPr>
+      <w:hyperlink r:id="rId204">
+        <w:r>
+          <w:rPr>
+            <w:rStyle w:val="Hyperlink"/>
+          </w:rPr>
+          <w:t xml:space="preserve">modules/club-orders/repository.ts</w:t>
+        </w:r>
+      </w:hyperlink>
+    </w:p>
+    <w:p>
+      <w:pPr>
+        <w:pStyle w:val="Compact"/>
+        <w:numPr>
+          <w:ilvl w:val="0"/>
+          <w:numId w:val="1052"/>
+        </w:numPr>
+      </w:pPr>
+      <w:hyperlink r:id="rId205">
+        <w:r>
+          <w:rPr>
+            <w:rStyle w:val="Hyperlink"/>
+          </w:rPr>
+          <w:t xml:space="preserve">Roadmap / issue #41</w:t>
+        </w:r>
+      </w:hyperlink>
+    </w:p>
+    <w:p>
+      <w:pPr>
+        <w:pStyle w:val="Compact"/>
+        <w:numPr>
+          <w:ilvl w:val="0"/>
+          <w:numId w:val="1052"/>
+        </w:numPr>
+      </w:pPr>
+      <w:hyperlink r:id="rId192">
+        <w:r>
+          <w:rPr>
+            <w:rStyle w:val="Hyperlink"/>
+          </w:rPr>
+          <w:t xml:space="preserve">Roadmap / issue #184</w:t>
+        </w:r>
+      </w:hyperlink>
+    </w:p>
+    <w:p>
+      <w:pPr>
+        <w:pStyle w:val="Compact"/>
+        <w:numPr>
+          <w:ilvl w:val="0"/>
+          <w:numId w:val="1052"/>
+        </w:numPr>
+      </w:pPr>
+      <w:hyperlink r:id="rId193">
+        <w:r>
+          <w:rPr>
+            <w:rStyle w:val="Hyperlink"/>
+          </w:rPr>
+          <w:t xml:space="preserve">Roadmap / issue #185</w:t>
+        </w:r>
+      </w:hyperlink>
+    </w:p>
+    <w:bookmarkEnd w:id="206"/>
+    <w:bookmarkEnd w:id="207"/>
+    <w:bookmarkStart w:id="218" w:name="Xa70bcf5025acf7538f9c7a1703fc4bd36ffb9cb"/>
+    <w:p>
+      <w:pPr>
+        <w:pStyle w:val="Heading2"/>
+      </w:pPr>
+      <w:r>
+        <w:t xml:space="preserve">27. Review the Year-End Report</w:t>
+      </w:r>
+    </w:p>
+    <w:bookmarkStart w:id="208" w:name="say-26"/>
+    <w:p>
+      <w:pPr>
+        <w:pStyle w:val="Heading3"/>
+      </w:pPr>
+      <w:r>
+        <w:t xml:space="preserve">Say</w:t>
+      </w:r>
+    </w:p>
+    <w:p>
+      <w:pPr>
+        <w:pStyle w:val="FirstParagraph"/>
+      </w:pPr>
+      <w:r>
+        <w:t xml:space="preserve">The Year-End Report uses saved club information to help prepare the yearly record. Check the report year and due date first. Review the prefilled figures and their source, then enter or correct the information the form requires. A prefilled number still needs review; it is not a guarantee the underlying record is complete. Our October training example is a draft for 2026–27, due April first, 2027. We are showing preparation, not telling clubs to submit an incomplete year early. Save draft keeps work in progress. The club’s director, deputy or reporter submits the report when it is complete; a submitted report is locked until the office reopens it.</w:t>
+      </w:r>
+    </w:p>
+    <w:bookmarkEnd w:id="208"/>
+    <w:bookmarkStart w:id="209" w:name="point-to-or-demonstrate-17"/>
+    <w:p>
+      <w:pPr>
+        <w:pStyle w:val="Heading3"/>
+      </w:pPr>
+      <w:r>
+        <w:t xml:space="preserve">Point to or demonstrate</w:t>
+      </w:r>
+    </w:p>
+    <w:p>
+      <w:pPr>
+        <w:pStyle w:val="FirstParagraph"/>
+      </w:pPr>
+      <w:r>
+        <w:t xml:space="preserve">From Monthly Records, open the appropriate Year-End Report. Read the year/span, due date, Draft state and source labels on prefilled counts. Point to Save draft. There is no separate Preview button on this form; the displayed report is the review surface. Keep the synthetic example as a draft.</w:t>
+      </w:r>
+    </w:p>
+    <w:bookmarkEnd w:id="209"/>
+    <w:bookmarkStart w:id="210" w:name="ask-the-group-7"/>
+    <w:p>
+      <w:pPr>
+        <w:pStyle w:val="Heading3"/>
+      </w:pPr>
+      <w:r>
+        <w:t xml:space="preserve">Ask the group</w:t>
+      </w:r>
+    </w:p>
+    <w:p>
+      <w:pPr>
+        <w:pStyle w:val="FirstParagraph"/>
+      </w:pPr>
+      <w:r>
+        <w:t xml:space="preserve">What should you check before trusting a prefilled number? Has Save draft filed the report?</w:t>
+      </w:r>
+    </w:p>
+    <w:bookmarkEnd w:id="210"/>
+    <w:bookmarkStart w:id="211" w:name="capability-status-2"/>
+    <w:p>
+      <w:pPr>
+        <w:pStyle w:val="Heading3"/>
+      </w:pPr>
+      <w:r>
+        <w:t xml:space="preserve">Capability status</w:t>
+      </w:r>
+    </w:p>
+    <w:p>
+      <w:pPr>
+        <w:pStyle w:val="FirstParagraph"/>
+      </w:pPr>
+      <w:r>
+        <w:t xml:space="preserve">CURRENT. Review the saved records and any manual figures. Save draft does not submit the report.</w:t>
+      </w:r>
+    </w:p>
+    <w:bookmarkEnd w:id="211"/>
+    <w:bookmarkStart w:id="212" w:name="visual-example-26"/>
+    <w:p>
+      <w:pPr>
+        <w:pStyle w:val="Heading3"/>
+      </w:pPr>
+      <w:r>
+        <w:t xml:space="preserve">Visual example</w:t>
+      </w:r>
+    </w:p>
+    <w:p>
+      <w:pPr>
+        <w:pStyle w:val="Compact"/>
+        <w:numPr>
+          <w:ilvl w:val="0"/>
+          <w:numId w:val="1053"/>
+        </w:numPr>
+      </w:pPr>
+      <w:r>
+        <w:t xml:space="preserve">2026–27 · May–April · Due April 1, 2027 · Draft: Actual Year-End Report header: Pathfinder year 2026–27, May 1–April 30, due April 1, 2027, and Draft state.</w:t>
+      </w:r>
+    </w:p>
+    <w:p>
+      <w:pPr>
+        <w:pStyle w:val="Compact"/>
+        <w:numPr>
+          <w:ilvl w:val="0"/>
+          <w:numId w:val="1053"/>
+        </w:numPr>
+      </w:pPr>
+      <w:r>
+        <w:t xml:space="preserve">Review · 9 members + 1 staff = 10 total: Year-End draft review shows membership 9, staff 1 and total membership 10, with calculated totals and roster sources.</w:t>
+      </w:r>
+    </w:p>
+    <w:p>
+      <w:pPr>
+        <w:pStyle w:val="Compact"/>
+        <w:numPr>
+          <w:ilvl w:val="0"/>
+          <w:numId w:val="1053"/>
+        </w:numPr>
+      </w:pPr>
+      <w:r>
+        <w:t xml:space="preserve">Keep unfinished work: Lower Year-End sections distinguish prefilled class and honor counts from manual entries, with Save draft and Submit report.</w:t>
+      </w:r>
+    </w:p>
+    <w:bookmarkEnd w:id="212"/>
+    <w:bookmarkStart w:id="217" w:name="preparation-references--not-spoken-26"/>
+    <w:p>
+      <w:pPr>
+        <w:pStyle w:val="Heading3"/>
+      </w:pPr>
+      <w:r>
+        <w:t xml:space="preserve">Preparation references — not spoken</w:t>
+      </w:r>
+    </w:p>
+    <w:p>
+      <w:pPr>
+        <w:pStyle w:val="Compact"/>
+        <w:numPr>
+          <w:ilvl w:val="0"/>
+          <w:numId w:val="1054"/>
+        </w:numPr>
+      </w:pPr>
+      <w:hyperlink r:id="rId213">
+        <w:r>
+          <w:rPr>
+            <w:rStyle w:val="Hyperlink"/>
+          </w:rPr>
+          <w:t xml:space="preserve">components/club-year-end-report-form.tsx</w:t>
+        </w:r>
+      </w:hyperlink>
+    </w:p>
+    <w:p>
+      <w:pPr>
+        <w:pStyle w:val="Compact"/>
+        <w:numPr>
+          <w:ilvl w:val="0"/>
+          <w:numId w:val="1054"/>
+        </w:numPr>
+      </w:pPr>
+      <w:hyperlink r:id="rId214">
+        <w:r>
+          <w:rPr>
+            <w:rStyle w:val="Hyperlink"/>
+          </w:rPr>
+          <w:t xml:space="preserve">modules/club-reports/year-end-domain.ts</w:t>
+        </w:r>
+      </w:hyperlink>
+    </w:p>
+    <w:p>
+      <w:pPr>
+        <w:pStyle w:val="Compact"/>
+        <w:numPr>
+          <w:ilvl w:val="0"/>
+          <w:numId w:val="1054"/>
+        </w:numPr>
+      </w:pPr>
+      <w:hyperlink r:id="rId215">
         <w:r>
           <w:rPr>
             <w:rStyle w:val="Hyperlink"/>
@@ -3302,10 +3834,27 @@
         <w:pStyle w:val="Compact"/>
         <w:numPr>
           <w:ilvl w:val="0"/>
-          <w:numId w:val="1049"/>
-        </w:numPr>
-      </w:pPr>
-      <w:hyperlink r:id="rId192">
+          <w:numId w:val="1054"/>
+        </w:numPr>
+      </w:pPr>
+      <w:hyperlink r:id="rId216">
+        <w:r>
+          <w:rPr>
+            <w:rStyle w:val="Hyperlink"/>
+          </w:rPr>
+          <w:t xml:space="preserve">app/(public)/account/(portal)/clubs/[organizationId]/reports/year-end/[year]/page.tsx</w:t>
+        </w:r>
+      </w:hyperlink>
+    </w:p>
+    <w:p>
+      <w:pPr>
+        <w:pStyle w:val="Compact"/>
+        <w:numPr>
+          <w:ilvl w:val="0"/>
+          <w:numId w:val="1054"/>
+        </w:numPr>
+      </w:pPr>
+      <w:hyperlink r:id="rId205">
         <w:r>
           <w:rPr>
             <w:rStyle w:val="Hyperlink"/>
@@ -3319,27 +3868,10 @@
         <w:pStyle w:val="Compact"/>
         <w:numPr>
           <w:ilvl w:val="0"/>
-          <w:numId w:val="1049"/>
+          <w:numId w:val="1054"/>
         </w:numPr>
       </w:pPr>
       <w:hyperlink r:id="rId193">
-        <w:r>
-          <w:rPr>
-            <w:rStyle w:val="Hyperlink"/>
-          </w:rPr>
-          <w:t xml:space="preserve">Roadmap / issue #184</w:t>
-        </w:r>
-      </w:hyperlink>
-    </w:p>
-    <w:p>
-      <w:pPr>
-        <w:pStyle w:val="Compact"/>
-        <w:numPr>
-          <w:ilvl w:val="0"/>
-          <w:numId w:val="1049"/>
-        </w:numPr>
-      </w:pPr>
-      <w:hyperlink r:id="rId194">
         <w:r>
           <w:rPr>
             <w:rStyle w:val="Hyperlink"/>
@@ -3348,18 +3880,18 @@
         </w:r>
       </w:hyperlink>
     </w:p>
-    <w:bookmarkEnd w:id="195"/>
-    <w:bookmarkEnd w:id="196"/>
-    <w:bookmarkStart w:id="217" w:name="X5a50a071abcacd60cf062319d050624c09b81a1"/>
+    <w:bookmarkEnd w:id="217"/>
+    <w:bookmarkEnd w:id="218"/>
+    <w:bookmarkStart w:id="239" w:name="X6278de4b63da395e4ecd383d434bc93925d1b4b"/>
     <w:p>
       <w:pPr>
         <w:pStyle w:val="Heading2"/>
       </w:pPr>
       <w:r>
-        <w:t xml:space="preserve">26. Event teams have tools before, during and after</w:t>
-      </w:r>
-    </w:p>
-    <w:bookmarkStart w:id="197" w:name="say-25"/>
+        <w:t xml:space="preserve">28. Event teams have tools before, during and after</w:t>
+      </w:r>
+    </w:p>
+    <w:bookmarkStart w:id="219" w:name="say-27"/>
     <w:p>
       <w:pPr>
         <w:pStyle w:val="Heading3"/>
@@ -3376,8 +3908,8 @@
         <w:t xml:space="preserve">IMSDA Events also supports the people running an event. Beforehand, authorized staff prepare its public information, publish a versioned form and manage registrations, capacity and waitlists. They can review event communications through the configured email service. On arrival, staff have pass, check-in, roster and badge tools. Financial staff have their permitted invoice, payment and reporting workflows. Lodging and meal tools can be used when the event's inventory, plans and settings are prepared. These capabilities belong to the appropriate event and staff permissions. A director or Area Coordinator assignment does not by itself provide the event team's administrative tools.</w:t>
       </w:r>
     </w:p>
-    <w:bookmarkEnd w:id="197"/>
-    <w:bookmarkStart w:id="198" w:name="point-to-or-demonstrate-16"/>
+    <w:bookmarkEnd w:id="219"/>
+    <w:bookmarkStart w:id="220" w:name="point-to-or-demonstrate-18"/>
     <w:p>
       <w:pPr>
         <w:pStyle w:val="Heading3"/>
@@ -3394,8 +3926,8 @@
         <w:t xml:space="preserve">Follow the map from preparation to arrival to follow-up. Explain that configured provider delivery, lodging inventory, meal setup and payment setup are separate from the existence of the tools. This overview is not a live production readiness claim.</w:t>
       </w:r>
     </w:p>
-    <w:bookmarkEnd w:id="198"/>
-    <w:bookmarkStart w:id="199" w:name="ask-the-group-6"/>
+    <w:bookmarkEnd w:id="220"/>
+    <w:bookmarkStart w:id="221" w:name="ask-the-group-8"/>
     <w:p>
       <w:pPr>
         <w:pStyle w:val="Heading3"/>
@@ -3412,8 +3944,8 @@
         <w:t xml:space="preserve">Which team owns each step at your next event?</w:t>
       </w:r>
     </w:p>
-    <w:bookmarkEnd w:id="199"/>
-    <w:bookmarkStart w:id="200" w:name="capability-status-1"/>
+    <w:bookmarkEnd w:id="221"/>
+    <w:bookmarkStart w:id="222" w:name="capability-status-3"/>
     <w:p>
       <w:pPr>
         <w:pStyle w:val="Heading3"/>
@@ -3430,8 +3962,8 @@
         <w:t xml:space="preserve">CURRENT. Event staff use assigned permissions; available options depend on the event and its setup.</w:t>
       </w:r>
     </w:p>
-    <w:bookmarkEnd w:id="200"/>
-    <w:bookmarkStart w:id="216" w:name="preparation-references--not-spoken-25"/>
+    <w:bookmarkEnd w:id="222"/>
+    <w:bookmarkStart w:id="238" w:name="preparation-references--not-spoken-27"/>
     <w:p>
       <w:pPr>
         <w:pStyle w:val="Heading3"/>
@@ -3445,10 +3977,10 @@
         <w:pStyle w:val="Compact"/>
         <w:numPr>
           <w:ilvl w:val="0"/>
-          <w:numId w:val="1050"/>
-        </w:numPr>
-      </w:pPr>
-      <w:hyperlink r:id="rId201">
+          <w:numId w:val="1055"/>
+        </w:numPr>
+      </w:pPr>
+      <w:hyperlink r:id="rId223">
         <w:r>
           <w:rPr>
             <w:rStyle w:val="Hyperlink"/>
@@ -3462,10 +3994,10 @@
         <w:pStyle w:val="Compact"/>
         <w:numPr>
           <w:ilvl w:val="0"/>
-          <w:numId w:val="1050"/>
-        </w:numPr>
-      </w:pPr>
-      <w:hyperlink r:id="rId202">
+          <w:numId w:val="1055"/>
+        </w:numPr>
+      </w:pPr>
+      <w:hyperlink r:id="rId224">
         <w:r>
           <w:rPr>
             <w:rStyle w:val="Hyperlink"/>
@@ -3479,10 +4011,10 @@
         <w:pStyle w:val="Compact"/>
         <w:numPr>
           <w:ilvl w:val="0"/>
-          <w:numId w:val="1050"/>
-        </w:numPr>
-      </w:pPr>
-      <w:hyperlink r:id="rId203">
+          <w:numId w:val="1055"/>
+        </w:numPr>
+      </w:pPr>
+      <w:hyperlink r:id="rId225">
         <w:r>
           <w:rPr>
             <w:rStyle w:val="Hyperlink"/>
@@ -3496,10 +4028,10 @@
         <w:pStyle w:val="Compact"/>
         <w:numPr>
           <w:ilvl w:val="0"/>
-          <w:numId w:val="1050"/>
-        </w:numPr>
-      </w:pPr>
-      <w:hyperlink r:id="rId204">
+          <w:numId w:val="1055"/>
+        </w:numPr>
+      </w:pPr>
+      <w:hyperlink r:id="rId226">
         <w:r>
           <w:rPr>
             <w:rStyle w:val="Hyperlink"/>
@@ -3513,10 +4045,10 @@
         <w:pStyle w:val="Compact"/>
         <w:numPr>
           <w:ilvl w:val="0"/>
-          <w:numId w:val="1050"/>
-        </w:numPr>
-      </w:pPr>
-      <w:hyperlink r:id="rId205">
+          <w:numId w:val="1055"/>
+        </w:numPr>
+      </w:pPr>
+      <w:hyperlink r:id="rId227">
         <w:r>
           <w:rPr>
             <w:rStyle w:val="Hyperlink"/>
@@ -3530,10 +4062,10 @@
         <w:pStyle w:val="Compact"/>
         <w:numPr>
           <w:ilvl w:val="0"/>
-          <w:numId w:val="1050"/>
-        </w:numPr>
-      </w:pPr>
-      <w:hyperlink r:id="rId206">
+          <w:numId w:val="1055"/>
+        </w:numPr>
+      </w:pPr>
+      <w:hyperlink r:id="rId228">
         <w:r>
           <w:rPr>
             <w:rStyle w:val="Hyperlink"/>
@@ -3547,10 +4079,10 @@
         <w:pStyle w:val="Compact"/>
         <w:numPr>
           <w:ilvl w:val="0"/>
-          <w:numId w:val="1050"/>
-        </w:numPr>
-      </w:pPr>
-      <w:hyperlink r:id="rId207">
+          <w:numId w:val="1055"/>
+        </w:numPr>
+      </w:pPr>
+      <w:hyperlink r:id="rId229">
         <w:r>
           <w:rPr>
             <w:rStyle w:val="Hyperlink"/>
@@ -3564,10 +4096,10 @@
         <w:pStyle w:val="Compact"/>
         <w:numPr>
           <w:ilvl w:val="0"/>
-          <w:numId w:val="1050"/>
-        </w:numPr>
-      </w:pPr>
-      <w:hyperlink r:id="rId208">
+          <w:numId w:val="1055"/>
+        </w:numPr>
+      </w:pPr>
+      <w:hyperlink r:id="rId230">
         <w:r>
           <w:rPr>
             <w:rStyle w:val="Hyperlink"/>
@@ -3581,10 +4113,10 @@
         <w:pStyle w:val="Compact"/>
         <w:numPr>
           <w:ilvl w:val="0"/>
-          <w:numId w:val="1050"/>
-        </w:numPr>
-      </w:pPr>
-      <w:hyperlink r:id="rId209">
+          <w:numId w:val="1055"/>
+        </w:numPr>
+      </w:pPr>
+      <w:hyperlink r:id="rId231">
         <w:r>
           <w:rPr>
             <w:rStyle w:val="Hyperlink"/>
@@ -3598,10 +4130,10 @@
         <w:pStyle w:val="Compact"/>
         <w:numPr>
           <w:ilvl w:val="0"/>
-          <w:numId w:val="1050"/>
-        </w:numPr>
-      </w:pPr>
-      <w:hyperlink r:id="rId210">
+          <w:numId w:val="1055"/>
+        </w:numPr>
+      </w:pPr>
+      <w:hyperlink r:id="rId232">
         <w:r>
           <w:rPr>
             <w:rStyle w:val="Hyperlink"/>
@@ -3615,10 +4147,10 @@
         <w:pStyle w:val="Compact"/>
         <w:numPr>
           <w:ilvl w:val="0"/>
-          <w:numId w:val="1050"/>
-        </w:numPr>
-      </w:pPr>
-      <w:hyperlink r:id="rId211">
+          <w:numId w:val="1055"/>
+        </w:numPr>
+      </w:pPr>
+      <w:hyperlink r:id="rId233">
         <w:r>
           <w:rPr>
             <w:rStyle w:val="Hyperlink"/>
@@ -3632,10 +4164,10 @@
         <w:pStyle w:val="Compact"/>
         <w:numPr>
           <w:ilvl w:val="0"/>
-          <w:numId w:val="1050"/>
-        </w:numPr>
-      </w:pPr>
-      <w:hyperlink r:id="rId212">
+          <w:numId w:val="1055"/>
+        </w:numPr>
+      </w:pPr>
+      <w:hyperlink r:id="rId234">
         <w:r>
           <w:rPr>
             <w:rStyle w:val="Hyperlink"/>
@@ -3649,10 +4181,10 @@
         <w:pStyle w:val="Compact"/>
         <w:numPr>
           <w:ilvl w:val="0"/>
-          <w:numId w:val="1050"/>
-        </w:numPr>
-      </w:pPr>
-      <w:hyperlink r:id="rId213">
+          <w:numId w:val="1055"/>
+        </w:numPr>
+      </w:pPr>
+      <w:hyperlink r:id="rId235">
         <w:r>
           <w:rPr>
             <w:rStyle w:val="Hyperlink"/>
@@ -3666,10 +4198,10 @@
         <w:pStyle w:val="Compact"/>
         <w:numPr>
           <w:ilvl w:val="0"/>
-          <w:numId w:val="1050"/>
-        </w:numPr>
-      </w:pPr>
-      <w:hyperlink r:id="rId214">
+          <w:numId w:val="1055"/>
+        </w:numPr>
+      </w:pPr>
+      <w:hyperlink r:id="rId236">
         <w:r>
           <w:rPr>
             <w:rStyle w:val="Hyperlink"/>
@@ -3683,10 +4215,10 @@
         <w:pStyle w:val="Compact"/>
         <w:numPr>
           <w:ilvl w:val="0"/>
-          <w:numId w:val="1050"/>
-        </w:numPr>
-      </w:pPr>
-      <w:hyperlink r:id="rId215">
+          <w:numId w:val="1055"/>
+        </w:numPr>
+      </w:pPr>
+      <w:hyperlink r:id="rId237">
         <w:r>
           <w:rPr>
             <w:rStyle w:val="Hyperlink"/>
@@ -3695,18 +4227,18 @@
         </w:r>
       </w:hyperlink>
     </w:p>
-    <w:bookmarkEnd w:id="216"/>
-    <w:bookmarkEnd w:id="217"/>
-    <w:bookmarkStart w:id="239" w:name="X8cf2524bc2fafc84823b3fbdeb2444a42316dd1"/>
+    <w:bookmarkEnd w:id="238"/>
+    <w:bookmarkEnd w:id="239"/>
+    <w:bookmarkStart w:id="261" w:name="X81bc9133805a3f0d4953e33e3398913df3a353e"/>
     <w:p>
       <w:pPr>
         <w:pStyle w:val="Heading2"/>
       </w:pPr>
       <w:r>
-        <w:t xml:space="preserve">27. Planned: make the next task easier to find</w:t>
-      </w:r>
-    </w:p>
-    <w:bookmarkStart w:id="218" w:name="say-26"/>
+        <w:t xml:space="preserve">29. Planned: make the next task easier to find</w:t>
+      </w:r>
+    </w:p>
+    <w:bookmarkStart w:id="240" w:name="say-28"/>
     <w:p>
       <w:pPr>
         <w:pStyle w:val="Heading3"/>
@@ -3723,8 +4255,8 @@
         <w:t xml:space="preserve">One improvement is how people recognize the work already available. The accepted role-workspace direction gives the different roles a consistent visual language while keeping their own navigation, priorities and access. Other tracked work includes clearer list columns and icons, saved task views, public-page and link previews, calendar and club-finder refinements, and guidance near the task. These are improvements to the same jobs we practiced. The accepted layout direction is a reference for implementation, not a released interface. The public-page studies have their own review status. This overview does not add another administrator menu change or give broader permissions to a role. Two operational examples in the ordered roadmap are the administrator alert feed with read and unread states, and kitchen money closeout. Those belong to their respective staff responsibilities; they are not new coordinator or attendee permissions.</w:t>
       </w:r>
     </w:p>
-    <w:bookmarkEnd w:id="218"/>
-    <w:bookmarkStart w:id="219" w:name="point-to-or-demonstrate-17"/>
+    <w:bookmarkEnd w:id="240"/>
+    <w:bookmarkStart w:id="241" w:name="point-to-or-demonstrate-19"/>
     <w:p>
       <w:pPr>
         <w:pStyle w:val="Heading3"/>
@@ -3741,8 +4273,8 @@
         <w:t xml:space="preserve">Read the status attached to each track. Explain the difference between accepted design direction and proposed or planned work. No future app screen is pictured on this slide.</w:t>
       </w:r>
     </w:p>
-    <w:bookmarkEnd w:id="219"/>
-    <w:bookmarkStart w:id="220" w:name="ask-the-group-7"/>
+    <w:bookmarkEnd w:id="241"/>
+    <w:bookmarkStart w:id="242" w:name="ask-the-group-9"/>
     <w:p>
       <w:pPr>
         <w:pStyle w:val="Heading3"/>
@@ -3759,8 +4291,8 @@
         <w:t xml:space="preserve">Where do people most often hesitate or ask where to go next?</w:t>
       </w:r>
     </w:p>
-    <w:bookmarkEnd w:id="220"/>
-    <w:bookmarkStart w:id="221" w:name="capability-status-2"/>
+    <w:bookmarkEnd w:id="242"/>
+    <w:bookmarkStart w:id="243" w:name="capability-status-4"/>
     <w:p>
       <w:pPr>
         <w:pStyle w:val="Heading3"/>
@@ -3777,8 +4309,8 @@
         <w:t xml:space="preserve">PLANNED. The aim is easier learning while each role keeps its own responsibilities and access.</w:t>
       </w:r>
     </w:p>
-    <w:bookmarkEnd w:id="221"/>
-    <w:bookmarkStart w:id="238" w:name="preparation-references--not-spoken-26"/>
+    <w:bookmarkEnd w:id="243"/>
+    <w:bookmarkStart w:id="260" w:name="preparation-references--not-spoken-28"/>
     <w:p>
       <w:pPr>
         <w:pStyle w:val="Heading3"/>
@@ -3792,10 +4324,10 @@
         <w:pStyle w:val="Compact"/>
         <w:numPr>
           <w:ilvl w:val="0"/>
-          <w:numId w:val="1051"/>
-        </w:numPr>
-      </w:pPr>
-      <w:hyperlink r:id="rId222">
+          <w:numId w:val="1056"/>
+        </w:numPr>
+      </w:pPr>
+      <w:hyperlink r:id="rId244">
         <w:r>
           <w:rPr>
             <w:rStyle w:val="Hyperlink"/>
@@ -3809,10 +4341,10 @@
         <w:pStyle w:val="Compact"/>
         <w:numPr>
           <w:ilvl w:val="0"/>
-          <w:numId w:val="1051"/>
-        </w:numPr>
-      </w:pPr>
-      <w:hyperlink r:id="rId223">
+          <w:numId w:val="1056"/>
+        </w:numPr>
+      </w:pPr>
+      <w:hyperlink r:id="rId245">
         <w:r>
           <w:rPr>
             <w:rStyle w:val="Hyperlink"/>
@@ -3826,10 +4358,10 @@
         <w:pStyle w:val="Compact"/>
         <w:numPr>
           <w:ilvl w:val="0"/>
-          <w:numId w:val="1051"/>
-        </w:numPr>
-      </w:pPr>
-      <w:hyperlink r:id="rId224">
+          <w:numId w:val="1056"/>
+        </w:numPr>
+      </w:pPr>
+      <w:hyperlink r:id="rId246">
         <w:r>
           <w:rPr>
             <w:rStyle w:val="Hyperlink"/>
@@ -3843,10 +4375,10 @@
         <w:pStyle w:val="Compact"/>
         <w:numPr>
           <w:ilvl w:val="0"/>
-          <w:numId w:val="1051"/>
-        </w:numPr>
-      </w:pPr>
-      <w:hyperlink r:id="rId225">
+          <w:numId w:val="1056"/>
+        </w:numPr>
+      </w:pPr>
+      <w:hyperlink r:id="rId247">
         <w:r>
           <w:rPr>
             <w:rStyle w:val="Hyperlink"/>
@@ -3860,10 +4392,10 @@
         <w:pStyle w:val="Compact"/>
         <w:numPr>
           <w:ilvl w:val="0"/>
-          <w:numId w:val="1051"/>
-        </w:numPr>
-      </w:pPr>
-      <w:hyperlink r:id="rId226">
+          <w:numId w:val="1056"/>
+        </w:numPr>
+      </w:pPr>
+      <w:hyperlink r:id="rId248">
         <w:r>
           <w:rPr>
             <w:rStyle w:val="Hyperlink"/>
@@ -3877,10 +4409,10 @@
         <w:pStyle w:val="Compact"/>
         <w:numPr>
           <w:ilvl w:val="0"/>
-          <w:numId w:val="1051"/>
-        </w:numPr>
-      </w:pPr>
-      <w:hyperlink r:id="rId227">
+          <w:numId w:val="1056"/>
+        </w:numPr>
+      </w:pPr>
+      <w:hyperlink r:id="rId249">
         <w:r>
           <w:rPr>
             <w:rStyle w:val="Hyperlink"/>
@@ -3894,10 +4426,10 @@
         <w:pStyle w:val="Compact"/>
         <w:numPr>
           <w:ilvl w:val="0"/>
-          <w:numId w:val="1051"/>
-        </w:numPr>
-      </w:pPr>
-      <w:hyperlink r:id="rId228">
+          <w:numId w:val="1056"/>
+        </w:numPr>
+      </w:pPr>
+      <w:hyperlink r:id="rId250">
         <w:r>
           <w:rPr>
             <w:rStyle w:val="Hyperlink"/>
@@ -3911,10 +4443,10 @@
         <w:pStyle w:val="Compact"/>
         <w:numPr>
           <w:ilvl w:val="0"/>
-          <w:numId w:val="1051"/>
-        </w:numPr>
-      </w:pPr>
-      <w:hyperlink r:id="rId229">
+          <w:numId w:val="1056"/>
+        </w:numPr>
+      </w:pPr>
+      <w:hyperlink r:id="rId251">
         <w:r>
           <w:rPr>
             <w:rStyle w:val="Hyperlink"/>
@@ -3928,10 +4460,10 @@
         <w:pStyle w:val="Compact"/>
         <w:numPr>
           <w:ilvl w:val="0"/>
-          <w:numId w:val="1051"/>
-        </w:numPr>
-      </w:pPr>
-      <w:hyperlink r:id="rId230">
+          <w:numId w:val="1056"/>
+        </w:numPr>
+      </w:pPr>
+      <w:hyperlink r:id="rId252">
         <w:r>
           <w:rPr>
             <w:rStyle w:val="Hyperlink"/>
@@ -3945,10 +4477,10 @@
         <w:pStyle w:val="Compact"/>
         <w:numPr>
           <w:ilvl w:val="0"/>
-          <w:numId w:val="1051"/>
-        </w:numPr>
-      </w:pPr>
-      <w:hyperlink r:id="rId231">
+          <w:numId w:val="1056"/>
+        </w:numPr>
+      </w:pPr>
+      <w:hyperlink r:id="rId253">
         <w:r>
           <w:rPr>
             <w:rStyle w:val="Hyperlink"/>
@@ -3962,10 +4494,10 @@
         <w:pStyle w:val="Compact"/>
         <w:numPr>
           <w:ilvl w:val="0"/>
-          <w:numId w:val="1051"/>
-        </w:numPr>
-      </w:pPr>
-      <w:hyperlink r:id="rId232">
+          <w:numId w:val="1056"/>
+        </w:numPr>
+      </w:pPr>
+      <w:hyperlink r:id="rId254">
         <w:r>
           <w:rPr>
             <w:rStyle w:val="Hyperlink"/>
@@ -3979,10 +4511,10 @@
         <w:pStyle w:val="Compact"/>
         <w:numPr>
           <w:ilvl w:val="0"/>
-          <w:numId w:val="1051"/>
-        </w:numPr>
-      </w:pPr>
-      <w:hyperlink r:id="rId233">
+          <w:numId w:val="1056"/>
+        </w:numPr>
+      </w:pPr>
+      <w:hyperlink r:id="rId255">
         <w:r>
           <w:rPr>
             <w:rStyle w:val="Hyperlink"/>
@@ -3996,10 +4528,10 @@
         <w:pStyle w:val="Compact"/>
         <w:numPr>
           <w:ilvl w:val="0"/>
-          <w:numId w:val="1051"/>
-        </w:numPr>
-      </w:pPr>
-      <w:hyperlink r:id="rId234">
+          <w:numId w:val="1056"/>
+        </w:numPr>
+      </w:pPr>
+      <w:hyperlink r:id="rId256">
         <w:r>
           <w:rPr>
             <w:rStyle w:val="Hyperlink"/>
@@ -4013,10 +4545,10 @@
         <w:pStyle w:val="Compact"/>
         <w:numPr>
           <w:ilvl w:val="0"/>
-          <w:numId w:val="1051"/>
-        </w:numPr>
-      </w:pPr>
-      <w:hyperlink r:id="rId235">
+          <w:numId w:val="1056"/>
+        </w:numPr>
+      </w:pPr>
+      <w:hyperlink r:id="rId257">
         <w:r>
           <w:rPr>
             <w:rStyle w:val="Hyperlink"/>
@@ -4030,10 +4562,10 @@
         <w:pStyle w:val="Compact"/>
         <w:numPr>
           <w:ilvl w:val="0"/>
-          <w:numId w:val="1051"/>
-        </w:numPr>
-      </w:pPr>
-      <w:hyperlink r:id="rId236">
+          <w:numId w:val="1056"/>
+        </w:numPr>
+      </w:pPr>
+      <w:hyperlink r:id="rId258">
         <w:r>
           <w:rPr>
             <w:rStyle w:val="Hyperlink"/>
@@ -4047,10 +4579,10 @@
         <w:pStyle w:val="Compact"/>
         <w:numPr>
           <w:ilvl w:val="0"/>
-          <w:numId w:val="1051"/>
-        </w:numPr>
-      </w:pPr>
-      <w:hyperlink r:id="rId237">
+          <w:numId w:val="1056"/>
+        </w:numPr>
+      </w:pPr>
+      <w:hyperlink r:id="rId259">
         <w:r>
           <w:rPr>
             <w:rStyle w:val="Hyperlink"/>
@@ -4064,10 +4596,10 @@
         <w:pStyle w:val="Compact"/>
         <w:numPr>
           <w:ilvl w:val="0"/>
-          <w:numId w:val="1051"/>
-        </w:numPr>
-      </w:pPr>
-      <w:hyperlink r:id="rId214">
+          <w:numId w:val="1056"/>
+        </w:numPr>
+      </w:pPr>
+      <w:hyperlink r:id="rId236">
         <w:r>
           <w:rPr>
             <w:rStyle w:val="Hyperlink"/>
@@ -4076,18 +4608,18 @@
         </w:r>
       </w:hyperlink>
     </w:p>
-    <w:bookmarkEnd w:id="238"/>
-    <w:bookmarkEnd w:id="239"/>
-    <w:bookmarkStart w:id="254" w:name="X2d6769f74723d180dc85306227daee10cb98878"/>
+    <w:bookmarkEnd w:id="260"/>
+    <w:bookmarkEnd w:id="261"/>
+    <w:bookmarkStart w:id="275" w:name="X079db9e3bf7eef6ecc7eed8a4104ff12fac9a87"/>
     <w:p>
       <w:pPr>
         <w:pStyle w:val="Heading2"/>
       </w:pPr>
       <w:r>
-        <w:t xml:space="preserve">28. Planned: make forms easier to build and maintain</w:t>
-      </w:r>
-    </w:p>
-    <w:bookmarkStart w:id="240" w:name="say-27"/>
+        <w:t xml:space="preserve">30. Build and check an event form</w:t>
+      </w:r>
+    </w:p>
+    <w:bookmarkStart w:id="262" w:name="say-29"/>
     <w:p>
       <w:pPr>
         <w:pStyle w:val="Heading3"/>
@@ -4101,11 +4633,11 @@
         <w:pStyle w:val="FirstParagraph"/>
       </w:pPr>
       <w:r>
-        <w:t xml:space="preserve">Forms already have explicit drafts, preview and test tools, and published versions that keep older submissions tied to their original form version. The roadmap aims to make creating and maintaining those forms easier. Its ordered foundation work includes preparing the builder, app-editable form starters, and notices about changes to their source. Later visual work covers a clearer editing workspace, reusable questions, phone editing and combined visibility rules. Those later steps still require their own design review. A changed starter should not silently rewrite a form someone is already using. This is the planned direction, with no release date announced here.</w:t>
-      </w:r>
-    </w:p>
-    <w:bookmarkEnd w:id="240"/>
-    <w:bookmarkStart w:id="241" w:name="point-to-or-demonstrate-18"/>
+        <w:t xml:space="preserve">Start with the correct event and registration form. A starter gives you an independent copy; replacing an existing draft is a deliberate action. Check whether a question is asked once for the booking or for every attendee, and which answers are required. Save the draft, then preview and test with fictional people. A valid test is required before the first publication; later versions do not acquire another mandatory first-publication test. Review and publish the saved version, and check that the event is published too. Existing registrations keep the version they submitted. We will use the editor available for this meeting; the job is to build, check and publish the right form.</w:t>
+      </w:r>
+    </w:p>
+    <w:bookmarkEnd w:id="262"/>
+    <w:bookmarkStart w:id="263" w:name="point-to-or-demonstrate-20"/>
     <w:p>
       <w:pPr>
         <w:pStyle w:val="Heading3"/>
@@ -4119,11 +4651,11 @@
         <w:pStyle w:val="FirstParagraph"/>
       </w:pPr>
       <w:r>
-        <w:t xml:space="preserve">Begin with the takeaway so listeners know which controls already exist. Then follow the planned foundations and the later reviewed tools. Keep engineering extraction and build-queue details in preparation references rather than the spoken explanation.</w:t>
-      </w:r>
-    </w:p>
-    <w:bookmarkEnd w:id="241"/>
-    <w:bookmarkStart w:id="242" w:name="ask-the-group-8"/>
+        <w:t xml:space="preserve">In the meeting-day editor, demonstrate New from template or Update draft from a template, question scope and Required, Save draft, Preview &amp; test, Run test submission, Publish version and the Publish form confirmation. Check Open public form. Trainer preparation: the owner expects the redesign before the meeting. Refresh actual builder screenshots and exact labels against that approved release; this workflow diagram does not claim the unfinished inspector, shared-template library, saved-question library or complete phone editor is already delivered. If it has not landed, demonstrate the actual available editor. Use a synthetic event; do not change a live public form for training.</w:t>
+      </w:r>
+    </w:p>
+    <w:bookmarkEnd w:id="263"/>
+    <w:bookmarkStart w:id="264" w:name="ask-the-group-10"/>
     <w:p>
       <w:pPr>
         <w:pStyle w:val="Heading3"/>
@@ -4137,11 +4669,11 @@
         <w:pStyle w:val="FirstParagraph"/>
       </w:pPr>
       <w:r>
-        <w:t xml:space="preserve">Would a clearer editor, reusable starter or reusable question save you the most work?</w:t>
-      </w:r>
-    </w:p>
-    <w:bookmarkEnd w:id="242"/>
-    <w:bookmarkStart w:id="243" w:name="capability-status-3"/>
+        <w:t xml:space="preserve">If you save a draft, have you changed the form visitors are using? What else must be published?</w:t>
+      </w:r>
+    </w:p>
+    <w:bookmarkEnd w:id="264"/>
+    <w:bookmarkStart w:id="265" w:name="capability-status-5"/>
     <w:p>
       <w:pPr>
         <w:pStyle w:val="Heading3"/>
@@ -4155,11 +4687,11 @@
         <w:pStyle w:val="FirstParagraph"/>
       </w:pPr>
       <w:r>
-        <w:t xml:space="preserve">PLANNED. Drafts and publishing already exist. Planned tools make forms easier to build and maintain.</w:t>
-      </w:r>
-    </w:p>
-    <w:bookmarkEnd w:id="243"/>
-    <w:bookmarkStart w:id="253" w:name="preparation-references--not-spoken-27"/>
+        <w:t xml:space="preserve">CURRENT. Choose a starter, save the draft, check the attendee experience, then publish.</w:t>
+      </w:r>
+    </w:p>
+    <w:bookmarkEnd w:id="265"/>
+    <w:bookmarkStart w:id="274" w:name="preparation-references--not-spoken-29"/>
     <w:p>
       <w:pPr>
         <w:pStyle w:val="Heading3"/>
@@ -4173,10 +4705,78 @@
         <w:pStyle w:val="Compact"/>
         <w:numPr>
           <w:ilvl w:val="0"/>
-          <w:numId w:val="1052"/>
-        </w:numPr>
-      </w:pPr>
-      <w:hyperlink r:id="rId201">
+          <w:numId w:val="1057"/>
+        </w:numPr>
+      </w:pPr>
+      <w:hyperlink r:id="rId266">
+        <w:r>
+          <w:rPr>
+            <w:rStyle w:val="Hyperlink"/>
+          </w:rPr>
+          <w:t xml:space="preserve">app/(workspace)/registration-builder/page.tsx</w:t>
+        </w:r>
+      </w:hyperlink>
+    </w:p>
+    <w:p>
+      <w:pPr>
+        <w:pStyle w:val="Compact"/>
+        <w:numPr>
+          <w:ilvl w:val="0"/>
+          <w:numId w:val="1057"/>
+        </w:numPr>
+      </w:pPr>
+      <w:hyperlink r:id="rId267">
+        <w:r>
+          <w:rPr>
+            <w:rStyle w:val="Hyperlink"/>
+          </w:rPr>
+          <w:t xml:space="preserve">components/registration-builder-workspace.tsx</w:t>
+        </w:r>
+      </w:hyperlink>
+    </w:p>
+    <w:p>
+      <w:pPr>
+        <w:pStyle w:val="Compact"/>
+        <w:numPr>
+          <w:ilvl w:val="0"/>
+          <w:numId w:val="1057"/>
+        </w:numPr>
+      </w:pPr>
+      <w:hyperlink r:id="rId225">
+        <w:r>
+          <w:rPr>
+            <w:rStyle w:val="Hyperlink"/>
+          </w:rPr>
+          <w:t xml:space="preserve">modules/forms/repository.ts</w:t>
+        </w:r>
+      </w:hyperlink>
+    </w:p>
+    <w:p>
+      <w:pPr>
+        <w:pStyle w:val="Compact"/>
+        <w:numPr>
+          <w:ilvl w:val="0"/>
+          <w:numId w:val="1057"/>
+        </w:numPr>
+      </w:pPr>
+      <w:hyperlink r:id="rId268">
+        <w:r>
+          <w:rPr>
+            <w:rStyle w:val="Hyperlink"/>
+          </w:rPr>
+          <w:t xml:space="preserve">modules/forms/seeded-templates.ts</w:t>
+        </w:r>
+      </w:hyperlink>
+    </w:p>
+    <w:p>
+      <w:pPr>
+        <w:pStyle w:val="Compact"/>
+        <w:numPr>
+          <w:ilvl w:val="0"/>
+          <w:numId w:val="1057"/>
+        </w:numPr>
+      </w:pPr>
+      <w:hyperlink r:id="rId223">
         <w:r>
           <w:rPr>
             <w:rStyle w:val="Hyperlink"/>
@@ -4190,15 +4790,15 @@
         <w:pStyle w:val="Compact"/>
         <w:numPr>
           <w:ilvl w:val="0"/>
-          <w:numId w:val="1052"/>
-        </w:numPr>
-      </w:pPr>
-      <w:hyperlink r:id="rId203">
+          <w:numId w:val="1057"/>
+        </w:numPr>
+      </w:pPr>
+      <w:hyperlink r:id="rId269">
         <w:r>
           <w:rPr>
             <w:rStyle w:val="Hyperlink"/>
           </w:rPr>
-          <w:t xml:space="preserve">modules/forms/repository.ts</w:t>
+          <w:t xml:space="preserve">Roadmap / issue #1062</w:t>
         </w:r>
       </w:hyperlink>
     </w:p>
@@ -4207,15 +4807,15 @@
         <w:pStyle w:val="Compact"/>
         <w:numPr>
           <w:ilvl w:val="0"/>
-          <w:numId w:val="1052"/>
-        </w:numPr>
-      </w:pPr>
-      <w:hyperlink r:id="rId244">
+          <w:numId w:val="1057"/>
+        </w:numPr>
+      </w:pPr>
+      <w:hyperlink r:id="rId270">
         <w:r>
           <w:rPr>
             <w:rStyle w:val="Hyperlink"/>
           </w:rPr>
-          <w:t xml:space="preserve">modules/forms/seeded-templates.ts</w:t>
+          <w:t xml:space="preserve">Roadmap / issue #1056</w:t>
         </w:r>
       </w:hyperlink>
     </w:p>
@@ -4224,15 +4824,15 @@
         <w:pStyle w:val="Compact"/>
         <w:numPr>
           <w:ilvl w:val="0"/>
-          <w:numId w:val="1052"/>
-        </w:numPr>
-      </w:pPr>
-      <w:hyperlink r:id="rId224">
+          <w:numId w:val="1057"/>
+        </w:numPr>
+      </w:pPr>
+      <w:hyperlink r:id="rId271">
         <w:r>
           <w:rPr>
             <w:rStyle w:val="Hyperlink"/>
           </w:rPr>
-          <w:t xml:space="preserve">docs/design/public-journeys-and-lists/review.md</w:t>
+          <w:t xml:space="preserve">Roadmap / issue #1057</w:t>
         </w:r>
       </w:hyperlink>
     </w:p>
@@ -4241,10 +4841,221 @@
         <w:pStyle w:val="Compact"/>
         <w:numPr>
           <w:ilvl w:val="0"/>
-          <w:numId w:val="1052"/>
-        </w:numPr>
-      </w:pPr>
-      <w:hyperlink r:id="rId226">
+          <w:numId w:val="1057"/>
+        </w:numPr>
+      </w:pPr>
+      <w:hyperlink r:id="rId272">
+        <w:r>
+          <w:rPr>
+            <w:rStyle w:val="Hyperlink"/>
+          </w:rPr>
+          <w:t xml:space="preserve">Roadmap / issue #1061</w:t>
+        </w:r>
+      </w:hyperlink>
+    </w:p>
+    <w:p>
+      <w:pPr>
+        <w:pStyle w:val="Compact"/>
+        <w:numPr>
+          <w:ilvl w:val="0"/>
+          <w:numId w:val="1057"/>
+        </w:numPr>
+      </w:pPr>
+      <w:hyperlink r:id="rId273">
+        <w:r>
+          <w:rPr>
+            <w:rStyle w:val="Hyperlink"/>
+          </w:rPr>
+          <w:t xml:space="preserve">Roadmap / issue #1066</w:t>
+        </w:r>
+      </w:hyperlink>
+    </w:p>
+    <w:bookmarkEnd w:id="274"/>
+    <w:bookmarkEnd w:id="275"/>
+    <w:bookmarkStart w:id="291" w:name="Xc55830ee78370c3bb920acb07701cd0db95b220"/>
+    <w:p>
+      <w:pPr>
+        <w:pStyle w:val="Heading2"/>
+      </w:pPr>
+      <w:r>
+        <w:t xml:space="preserve">31. A full camp workflow could build on this foundation</w:t>
+      </w:r>
+    </w:p>
+    <w:bookmarkStart w:id="276" w:name="say-30"/>
+    <w:p>
+      <w:pPr>
+        <w:pStyle w:val="Heading3"/>
+      </w:pPr>
+      <w:r>
+        <w:t xml:space="preserve">Say</w:t>
+      </w:r>
+    </w:p>
+    <w:p>
+      <w:pPr>
+        <w:pStyle w:val="FirstParagraph"/>
+      </w:pPr>
+      <w:r>
+        <w:t xml:space="preserve">A residential camp needs more than a registration and a bed assignment. The current lodging, meal, registration and check-in foundations could support future work. Camp operations would also need clear cabin and counselor responsibility, activity scheduling, guardian consent, appropriate care access, transport and authorized pickup. Those roles and policies must be designed deliberately. UltraCamp is a separate, optional discovery path in the later roadmap. Its allowed data, licensing and API coverage need confirmation, especially for protected forms and care information. We have a separate camp discovery document so this possibility can be assessed without claiming that a complete camp system or automatic synchronization is already available.</w:t>
+      </w:r>
+    </w:p>
+    <w:bookmarkEnd w:id="276"/>
+    <w:bookmarkStart w:id="277" w:name="point-to-or-demonstrate-21"/>
+    <w:p>
+      <w:pPr>
+        <w:pStyle w:val="Heading3"/>
+      </w:pPr>
+      <w:r>
+        <w:t xml:space="preserve">Point to or demonstrate</w:t>
+      </w:r>
+    </w:p>
+    <w:p>
+      <w:pPr>
+        <w:pStyle w:val="FirstParagraph"/>
+      </w:pPr>
+      <w:r>
+        <w:t xml:space="preserve">Follow the diagram from existing foundations through camp responsibility gaps to the optional vendor boundary. Describe this as a capability discussion, not an announced replacement or integration plan.</w:t>
+      </w:r>
+    </w:p>
+    <w:bookmarkEnd w:id="277"/>
+    <w:bookmarkStart w:id="278" w:name="ask-the-group-11"/>
+    <w:p>
+      <w:pPr>
+        <w:pStyle w:val="Heading3"/>
+      </w:pPr>
+      <w:r>
+        <w:t xml:space="preserve">Ask the group</w:t>
+      </w:r>
+    </w:p>
+    <w:p>
+      <w:pPr>
+        <w:pStyle w:val="FirstParagraph"/>
+      </w:pPr>
+      <w:r>
+        <w:t xml:space="preserve">Which camp responsibility is hardest to manage reliably today?</w:t>
+      </w:r>
+    </w:p>
+    <w:bookmarkEnd w:id="278"/>
+    <w:bookmarkStart w:id="279" w:name="capability-status-6"/>
+    <w:p>
+      <w:pPr>
+        <w:pStyle w:val="Heading3"/>
+      </w:pPr>
+      <w:r>
+        <w:t xml:space="preserve">Capability status</w:t>
+      </w:r>
+    </w:p>
+    <w:p>
+      <w:pPr>
+        <w:pStyle w:val="FirstParagraph"/>
+      </w:pPr>
+      <w:r>
+        <w:t xml:space="preserve">POSSIBLE. A camp system adds care, supervision and release responsibilities beyond a lodging reservation.</w:t>
+      </w:r>
+    </w:p>
+    <w:bookmarkEnd w:id="279"/>
+    <w:bookmarkStart w:id="290" w:name="preparation-references--not-spoken-30"/>
+    <w:p>
+      <w:pPr>
+        <w:pStyle w:val="Heading3"/>
+      </w:pPr>
+      <w:r>
+        <w:t xml:space="preserve">Preparation references — not spoken</w:t>
+      </w:r>
+    </w:p>
+    <w:p>
+      <w:pPr>
+        <w:pStyle w:val="Compact"/>
+        <w:numPr>
+          <w:ilvl w:val="0"/>
+          <w:numId w:val="1058"/>
+        </w:numPr>
+      </w:pPr>
+      <w:hyperlink r:id="rId229">
+        <w:r>
+          <w:rPr>
+            <w:rStyle w:val="Hyperlink"/>
+          </w:rPr>
+          <w:t xml:space="preserve">docs/LODGING.md</w:t>
+        </w:r>
+      </w:hyperlink>
+    </w:p>
+    <w:p>
+      <w:pPr>
+        <w:pStyle w:val="Compact"/>
+        <w:numPr>
+          <w:ilvl w:val="0"/>
+          <w:numId w:val="1058"/>
+        </w:numPr>
+      </w:pPr>
+      <w:hyperlink r:id="rId230">
+        <w:r>
+          <w:rPr>
+            <w:rStyle w:val="Hyperlink"/>
+          </w:rPr>
+          <w:t xml:space="preserve">docs/MEALS.md</w:t>
+        </w:r>
+      </w:hyperlink>
+    </w:p>
+    <w:p>
+      <w:pPr>
+        <w:pStyle w:val="Compact"/>
+        <w:numPr>
+          <w:ilvl w:val="0"/>
+          <w:numId w:val="1058"/>
+        </w:numPr>
+      </w:pPr>
+      <w:hyperlink r:id="rId280">
+        <w:r>
+          <w:rPr>
+            <w:rStyle w:val="Hyperlink"/>
+          </w:rPr>
+          <w:t xml:space="preserve">docs/decisions/0005-protected-records-policy.md</w:t>
+        </w:r>
+      </w:hyperlink>
+    </w:p>
+    <w:p>
+      <w:pPr>
+        <w:pStyle w:val="Compact"/>
+        <w:numPr>
+          <w:ilvl w:val="0"/>
+          <w:numId w:val="1058"/>
+        </w:numPr>
+      </w:pPr>
+      <w:hyperlink r:id="rId281">
+        <w:r>
+          <w:rPr>
+            <w:rStyle w:val="Hyperlink"/>
+          </w:rPr>
+          <w:t xml:space="preserve">docs/decisions/0011-personnel-pipeline-policy.md</w:t>
+        </w:r>
+      </w:hyperlink>
+    </w:p>
+    <w:p>
+      <w:pPr>
+        <w:pStyle w:val="Compact"/>
+        <w:numPr>
+          <w:ilvl w:val="0"/>
+          <w:numId w:val="1058"/>
+        </w:numPr>
+      </w:pPr>
+      <w:hyperlink r:id="rId282">
+        <w:r>
+          <w:rPr>
+            <w:rStyle w:val="Hyperlink"/>
+          </w:rPr>
+          <w:t xml:space="preserve">docs/platform-documentation/2026-10-21/content/04-camp-system-and-ultracamp.md</w:t>
+        </w:r>
+      </w:hyperlink>
+    </w:p>
+    <w:p>
+      <w:pPr>
+        <w:pStyle w:val="Compact"/>
+        <w:numPr>
+          <w:ilvl w:val="0"/>
+          <w:numId w:val="1058"/>
+        </w:numPr>
+      </w:pPr>
+      <w:hyperlink r:id="rId248">
         <w:r>
           <w:rPr>
             <w:rStyle w:val="Hyperlink"/>
@@ -4258,15 +5069,15 @@
         <w:pStyle w:val="Compact"/>
         <w:numPr>
           <w:ilvl w:val="0"/>
-          <w:numId w:val="1052"/>
-        </w:numPr>
-      </w:pPr>
-      <w:hyperlink r:id="rId245">
+          <w:numId w:val="1058"/>
+        </w:numPr>
+      </w:pPr>
+      <w:hyperlink r:id="rId283">
         <w:r>
           <w:rPr>
             <w:rStyle w:val="Hyperlink"/>
           </w:rPr>
-          <w:t xml:space="preserve">Roadmap / issue #1062</w:t>
+          <w:t xml:space="preserve">Roadmap / issue #65</w:t>
         </w:r>
       </w:hyperlink>
     </w:p>
@@ -4275,15 +5086,15 @@
         <w:pStyle w:val="Compact"/>
         <w:numPr>
           <w:ilvl w:val="0"/>
-          <w:numId w:val="1052"/>
-        </w:numPr>
-      </w:pPr>
-      <w:hyperlink r:id="rId246">
+          <w:numId w:val="1058"/>
+        </w:numPr>
+      </w:pPr>
+      <w:hyperlink r:id="rId284">
         <w:r>
           <w:rPr>
             <w:rStyle w:val="Hyperlink"/>
           </w:rPr>
-          <w:t xml:space="preserve">Roadmap / issue #1063</w:t>
+          <w:t xml:space="preserve">Roadmap / issue #71</w:t>
         </w:r>
       </w:hyperlink>
     </w:p>
@@ -4292,15 +5103,15 @@
         <w:pStyle w:val="Compact"/>
         <w:numPr>
           <w:ilvl w:val="0"/>
-          <w:numId w:val="1052"/>
-        </w:numPr>
-      </w:pPr>
-      <w:hyperlink r:id="rId247">
+          <w:numId w:val="1058"/>
+        </w:numPr>
+      </w:pPr>
+      <w:hyperlink r:id="rId285">
         <w:r>
           <w:rPr>
             <w:rStyle w:val="Hyperlink"/>
           </w:rPr>
-          <w:t xml:space="preserve">Roadmap / issue #1064</w:t>
+          <w:t xml:space="preserve">Roadmap / issue #78</w:t>
         </w:r>
       </w:hyperlink>
     </w:p>
@@ -4309,15 +5120,15 @@
         <w:pStyle w:val="Compact"/>
         <w:numPr>
           <w:ilvl w:val="0"/>
-          <w:numId w:val="1052"/>
-        </w:numPr>
-      </w:pPr>
-      <w:hyperlink r:id="rId248">
+          <w:numId w:val="1058"/>
+        </w:numPr>
+      </w:pPr>
+      <w:hyperlink r:id="rId286">
         <w:r>
           <w:rPr>
             <w:rStyle w:val="Hyperlink"/>
           </w:rPr>
-          <w:t xml:space="preserve">Roadmap / issue #1065</w:t>
+          <w:t xml:space="preserve">Roadmap / issue #79</w:t>
         </w:r>
       </w:hyperlink>
     </w:p>
@@ -4326,15 +5137,15 @@
         <w:pStyle w:val="Compact"/>
         <w:numPr>
           <w:ilvl w:val="0"/>
-          <w:numId w:val="1052"/>
-        </w:numPr>
-      </w:pPr>
-      <w:hyperlink r:id="rId249">
+          <w:numId w:val="1058"/>
+        </w:numPr>
+      </w:pPr>
+      <w:hyperlink r:id="rId287">
         <w:r>
           <w:rPr>
             <w:rStyle w:val="Hyperlink"/>
           </w:rPr>
-          <w:t xml:space="preserve">Roadmap / issue #1069</w:t>
+          <w:t xml:space="preserve">Roadmap / issue #89</w:t>
         </w:r>
       </w:hyperlink>
     </w:p>
@@ -4343,15 +5154,15 @@
         <w:pStyle w:val="Compact"/>
         <w:numPr>
           <w:ilvl w:val="0"/>
-          <w:numId w:val="1052"/>
-        </w:numPr>
-      </w:pPr>
-      <w:hyperlink r:id="rId250">
+          <w:numId w:val="1058"/>
+        </w:numPr>
+      </w:pPr>
+      <w:hyperlink r:id="rId288">
         <w:r>
           <w:rPr>
             <w:rStyle w:val="Hyperlink"/>
           </w:rPr>
-          <w:t xml:space="preserve">Roadmap / issue #1070</w:t>
+          <w:t xml:space="preserve">Roadmap / issue #237</w:t>
         </w:r>
       </w:hyperlink>
     </w:p>
@@ -4360,141 +5171,141 @@
         <w:pStyle w:val="Compact"/>
         <w:numPr>
           <w:ilvl w:val="0"/>
-          <w:numId w:val="1052"/>
-        </w:numPr>
-      </w:pPr>
-      <w:hyperlink r:id="rId251">
+          <w:numId w:val="1058"/>
+        </w:numPr>
+      </w:pPr>
+      <w:hyperlink r:id="rId289">
         <w:r>
           <w:rPr>
             <w:rStyle w:val="Hyperlink"/>
           </w:rPr>
-          <w:t xml:space="preserve">Roadmap / issue #1071</w:t>
+          <w:t xml:space="preserve">Roadmap / issue #238</w:t>
         </w:r>
       </w:hyperlink>
     </w:p>
-    <w:p>
-      <w:pPr>
-        <w:pStyle w:val="Compact"/>
-        <w:numPr>
-          <w:ilvl w:val="0"/>
-          <w:numId w:val="1052"/>
-        </w:numPr>
-      </w:pPr>
-      <w:hyperlink r:id="rId252">
+    <w:bookmarkEnd w:id="290"/>
+    <w:bookmarkEnd w:id="291"/>
+    <w:bookmarkStart w:id="318" w:name="X20420d81450c203a95ca2bfb671ac096a394f05"/>
+    <w:p>
+      <w:pPr>
+        <w:pStyle w:val="Heading2"/>
+      </w:pPr>
+      <w:r>
+        <w:t xml:space="preserve">32. Longer-term possibilities to develop</w:t>
+      </w:r>
+    </w:p>
+    <w:bookmarkStart w:id="292" w:name="say-31"/>
+    <w:p>
+      <w:pPr>
+        <w:pStyle w:val="Heading3"/>
+      </w:pPr>
+      <w:r>
+        <w:t xml:space="preserve">Say</w:t>
+      </w:r>
+    </w:p>
+    <w:p>
+      <w:pPr>
+        <w:pStyle w:val="FirstParagraph"/>
+      </w:pPr>
+      <w:r>
+        <w:t xml:space="preserve">There are further possibilities beyond the changes to everyday screens. Adventurer ministry has its own program, materials and scope decisions. Wallet passes could build on the web passes that already exist; a native mobile experience would also need its own provider, privacy and offline rules. Merchandise checkout remains on hold, and a camp-store account would be a larger project than today's Orders helper. Surveys, certificates and recorded outcomes could improve follow-up after an event. These items have different levels of detail and different dependencies. They are possibilities on the longer roadmap, not an announcement that everything is approved, scheduled or available now. Donations, fundraising and designated funds are another later track, separate from current church invoicing and the Orders helper.</w:t>
+      </w:r>
+    </w:p>
+    <w:bookmarkEnd w:id="292"/>
+    <w:bookmarkStart w:id="293" w:name="point-to-or-demonstrate-22"/>
+    <w:p>
+      <w:pPr>
+        <w:pStyle w:val="Heading3"/>
+      </w:pPr>
+      <w:r>
+        <w:t xml:space="preserve">Point to or demonstrate</w:t>
+      </w:r>
+    </w:p>
+    <w:p>
+      <w:pPr>
+        <w:pStyle w:val="FirstParagraph"/>
+      </w:pPr>
+      <w:r>
+        <w:t xml:space="preserve">Point to the different status labels. Ask for useful examples of need rather than presenting a delivery schedule. The canonical roadmap remains the source of implementation order.</w:t>
+      </w:r>
+    </w:p>
+    <w:bookmarkEnd w:id="293"/>
+    <w:bookmarkStart w:id="294" w:name="ask-the-group-12"/>
+    <w:p>
+      <w:pPr>
+        <w:pStyle w:val="Heading3"/>
+      </w:pPr>
+      <w:r>
+        <w:t xml:space="preserve">Ask the group</w:t>
+      </w:r>
+    </w:p>
+    <w:p>
+      <w:pPr>
+        <w:pStyle w:val="FirstParagraph"/>
+      </w:pPr>
+      <w:r>
+        <w:t xml:space="preserve">Which future outcome would solve a concrete problem for your club or event team?</w:t>
+      </w:r>
+    </w:p>
+    <w:bookmarkEnd w:id="294"/>
+    <w:bookmarkStart w:id="295" w:name="capability-status-7"/>
+    <w:p>
+      <w:pPr>
+        <w:pStyle w:val="Heading3"/>
+      </w:pPr>
+      <w:r>
+        <w:t xml:space="preserve">Capability status</w:t>
+      </w:r>
+    </w:p>
+    <w:p>
+      <w:pPr>
+        <w:pStyle w:val="FirstParagraph"/>
+      </w:pPr>
+      <w:r>
+        <w:t xml:space="preserve">POSSIBLE. Future scope follows the existing roadmap, decisions and event needs; no delivery dates are set.</w:t>
+      </w:r>
+    </w:p>
+    <w:bookmarkEnd w:id="295"/>
+    <w:bookmarkStart w:id="317" w:name="preparation-references--not-spoken-31"/>
+    <w:p>
+      <w:pPr>
+        <w:pStyle w:val="Heading3"/>
+      </w:pPr>
+      <w:r>
+        <w:t xml:space="preserve">Preparation references — not spoken</w:t>
+      </w:r>
+    </w:p>
+    <w:p>
+      <w:pPr>
+        <w:pStyle w:val="Compact"/>
+        <w:numPr>
+          <w:ilvl w:val="0"/>
+          <w:numId w:val="1059"/>
+        </w:numPr>
+      </w:pPr>
+      <w:hyperlink r:id="rId296">
         <w:r>
           <w:rPr>
             <w:rStyle w:val="Hyperlink"/>
           </w:rPr>
-          <w:t xml:space="preserve">Roadmap / issue #1072</w:t>
+          <w:t xml:space="preserve">docs/NEW-CLUB-APPLICATIONS.md</w:t>
         </w:r>
       </w:hyperlink>
     </w:p>
-    <w:bookmarkEnd w:id="253"/>
-    <w:bookmarkEnd w:id="254"/>
-    <w:bookmarkStart w:id="270" w:name="X4d91e404c79572a134d61186cad6486d05283e2"/>
-    <w:p>
-      <w:pPr>
-        <w:pStyle w:val="Heading2"/>
-      </w:pPr>
-      <w:r>
-        <w:t xml:space="preserve">29. A full camp workflow could build on this foundation</w:t>
-      </w:r>
-    </w:p>
-    <w:bookmarkStart w:id="255" w:name="say-28"/>
-    <w:p>
-      <w:pPr>
-        <w:pStyle w:val="Heading3"/>
-      </w:pPr>
-      <w:r>
-        <w:t xml:space="preserve">Say</w:t>
-      </w:r>
-    </w:p>
-    <w:p>
-      <w:pPr>
-        <w:pStyle w:val="FirstParagraph"/>
-      </w:pPr>
-      <w:r>
-        <w:t xml:space="preserve">A residential camp needs more than a registration and a bed assignment. The current lodging, meal, registration and check-in foundations could support future work. Camp operations would also need clear cabin and counselor responsibility, activity scheduling, guardian consent, appropriate care access, transport and authorized pickup. Those roles and policies must be designed deliberately. UltraCamp is a separate, optional discovery path in the later roadmap. Its allowed data, licensing and API coverage need confirmation, especially for protected forms and care information. We have a separate camp discovery document so this possibility can be assessed without claiming that a complete camp system or automatic synchronization is already available.</w:t>
-      </w:r>
-    </w:p>
-    <w:bookmarkEnd w:id="255"/>
-    <w:bookmarkStart w:id="256" w:name="point-to-or-demonstrate-19"/>
-    <w:p>
-      <w:pPr>
-        <w:pStyle w:val="Heading3"/>
-      </w:pPr>
-      <w:r>
-        <w:t xml:space="preserve">Point to or demonstrate</w:t>
-      </w:r>
-    </w:p>
-    <w:p>
-      <w:pPr>
-        <w:pStyle w:val="FirstParagraph"/>
-      </w:pPr>
-      <w:r>
-        <w:t xml:space="preserve">Follow the diagram from existing foundations through camp responsibility gaps to the optional vendor boundary. Describe this as a capability discussion, not an announced replacement or integration plan.</w:t>
-      </w:r>
-    </w:p>
-    <w:bookmarkEnd w:id="256"/>
-    <w:bookmarkStart w:id="257" w:name="ask-the-group-9"/>
-    <w:p>
-      <w:pPr>
-        <w:pStyle w:val="Heading3"/>
-      </w:pPr>
-      <w:r>
-        <w:t xml:space="preserve">Ask the group</w:t>
-      </w:r>
-    </w:p>
-    <w:p>
-      <w:pPr>
-        <w:pStyle w:val="FirstParagraph"/>
-      </w:pPr>
-      <w:r>
-        <w:t xml:space="preserve">Which camp responsibility is hardest to manage reliably today?</w:t>
-      </w:r>
-    </w:p>
-    <w:bookmarkEnd w:id="257"/>
-    <w:bookmarkStart w:id="258" w:name="capability-status-4"/>
-    <w:p>
-      <w:pPr>
-        <w:pStyle w:val="Heading3"/>
-      </w:pPr>
-      <w:r>
-        <w:t xml:space="preserve">Capability status</w:t>
-      </w:r>
-    </w:p>
-    <w:p>
-      <w:pPr>
-        <w:pStyle w:val="FirstParagraph"/>
-      </w:pPr>
-      <w:r>
-        <w:t xml:space="preserve">POSSIBLE. A camp system adds care, supervision and release responsibilities beyond a lodging reservation.</w:t>
-      </w:r>
-    </w:p>
-    <w:bookmarkEnd w:id="258"/>
-    <w:bookmarkStart w:id="269" w:name="preparation-references--not-spoken-28"/>
-    <w:p>
-      <w:pPr>
-        <w:pStyle w:val="Heading3"/>
-      </w:pPr>
-      <w:r>
-        <w:t xml:space="preserve">Preparation references — not spoken</w:t>
-      </w:r>
-    </w:p>
-    <w:p>
-      <w:pPr>
-        <w:pStyle w:val="Compact"/>
-        <w:numPr>
-          <w:ilvl w:val="0"/>
-          <w:numId w:val="1053"/>
-        </w:numPr>
-      </w:pPr>
-      <w:hyperlink r:id="rId207">
+    <w:p>
+      <w:pPr>
+        <w:pStyle w:val="Compact"/>
+        <w:numPr>
+          <w:ilvl w:val="0"/>
+          <w:numId w:val="1059"/>
+        </w:numPr>
+      </w:pPr>
+      <w:hyperlink r:id="rId297">
         <w:r>
           <w:rPr>
             <w:rStyle w:val="Hyperlink"/>
           </w:rPr>
-          <w:t xml:space="preserve">docs/LODGING.md</w:t>
+          <w:t xml:space="preserve">docs/ATTENDEE-ACCOUNT-RELEASE.md</w:t>
         </w:r>
       </w:hyperlink>
     </w:p>
@@ -4503,15 +5314,15 @@
         <w:pStyle w:val="Compact"/>
         <w:numPr>
           <w:ilvl w:val="0"/>
-          <w:numId w:val="1053"/>
-        </w:numPr>
-      </w:pPr>
-      <w:hyperlink r:id="rId208">
+          <w:numId w:val="1059"/>
+        </w:numPr>
+      </w:pPr>
+      <w:hyperlink r:id="rId298">
         <w:r>
           <w:rPr>
             <w:rStyle w:val="Hyperlink"/>
           </w:rPr>
-          <w:t xml:space="preserve">docs/MEALS.md</w:t>
+          <w:t xml:space="preserve">docs/MERCHANDISE-LEDGER-MIGRATION.md</w:t>
         </w:r>
       </w:hyperlink>
     </w:p>
@@ -4520,27 +5331,10 @@
         <w:pStyle w:val="Compact"/>
         <w:numPr>
           <w:ilvl w:val="0"/>
-          <w:numId w:val="1053"/>
-        </w:numPr>
-      </w:pPr>
-      <w:hyperlink r:id="rId259">
-        <w:r>
-          <w:rPr>
-            <w:rStyle w:val="Hyperlink"/>
-          </w:rPr>
-          <w:t xml:space="preserve">docs/decisions/0005-protected-records-policy.md</w:t>
-        </w:r>
-      </w:hyperlink>
-    </w:p>
-    <w:p>
-      <w:pPr>
-        <w:pStyle w:val="Compact"/>
-        <w:numPr>
-          <w:ilvl w:val="0"/>
-          <w:numId w:val="1053"/>
-        </w:numPr>
-      </w:pPr>
-      <w:hyperlink r:id="rId260">
+          <w:numId w:val="1059"/>
+        </w:numPr>
+      </w:pPr>
+      <w:hyperlink r:id="rId281">
         <w:r>
           <w:rPr>
             <w:rStyle w:val="Hyperlink"/>
@@ -4554,27 +5348,10 @@
         <w:pStyle w:val="Compact"/>
         <w:numPr>
           <w:ilvl w:val="0"/>
-          <w:numId w:val="1053"/>
-        </w:numPr>
-      </w:pPr>
-      <w:hyperlink r:id="rId261">
-        <w:r>
-          <w:rPr>
-            <w:rStyle w:val="Hyperlink"/>
-          </w:rPr>
-          <w:t xml:space="preserve">docs/platform-documentation/2026-10-21/content/04-camp-system-and-ultracamp.md</w:t>
-        </w:r>
-      </w:hyperlink>
-    </w:p>
-    <w:p>
-      <w:pPr>
-        <w:pStyle w:val="Compact"/>
-        <w:numPr>
-          <w:ilvl w:val="0"/>
-          <w:numId w:val="1053"/>
-        </w:numPr>
-      </w:pPr>
-      <w:hyperlink r:id="rId226">
+          <w:numId w:val="1059"/>
+        </w:numPr>
+      </w:pPr>
+      <w:hyperlink r:id="rId248">
         <w:r>
           <w:rPr>
             <w:rStyle w:val="Hyperlink"/>
@@ -4588,306 +5365,10 @@
         <w:pStyle w:val="Compact"/>
         <w:numPr>
           <w:ilvl w:val="0"/>
-          <w:numId w:val="1053"/>
-        </w:numPr>
-      </w:pPr>
-      <w:hyperlink r:id="rId262">
-        <w:r>
-          <w:rPr>
-            <w:rStyle w:val="Hyperlink"/>
-          </w:rPr>
-          <w:t xml:space="preserve">Roadmap / issue #65</w:t>
-        </w:r>
-      </w:hyperlink>
-    </w:p>
-    <w:p>
-      <w:pPr>
-        <w:pStyle w:val="Compact"/>
-        <w:numPr>
-          <w:ilvl w:val="0"/>
-          <w:numId w:val="1053"/>
-        </w:numPr>
-      </w:pPr>
-      <w:hyperlink r:id="rId263">
-        <w:r>
-          <w:rPr>
-            <w:rStyle w:val="Hyperlink"/>
-          </w:rPr>
-          <w:t xml:space="preserve">Roadmap / issue #71</w:t>
-        </w:r>
-      </w:hyperlink>
-    </w:p>
-    <w:p>
-      <w:pPr>
-        <w:pStyle w:val="Compact"/>
-        <w:numPr>
-          <w:ilvl w:val="0"/>
-          <w:numId w:val="1053"/>
-        </w:numPr>
-      </w:pPr>
-      <w:hyperlink r:id="rId264">
-        <w:r>
-          <w:rPr>
-            <w:rStyle w:val="Hyperlink"/>
-          </w:rPr>
-          <w:t xml:space="preserve">Roadmap / issue #78</w:t>
-        </w:r>
-      </w:hyperlink>
-    </w:p>
-    <w:p>
-      <w:pPr>
-        <w:pStyle w:val="Compact"/>
-        <w:numPr>
-          <w:ilvl w:val="0"/>
-          <w:numId w:val="1053"/>
-        </w:numPr>
-      </w:pPr>
-      <w:hyperlink r:id="rId265">
-        <w:r>
-          <w:rPr>
-            <w:rStyle w:val="Hyperlink"/>
-          </w:rPr>
-          <w:t xml:space="preserve">Roadmap / issue #79</w:t>
-        </w:r>
-      </w:hyperlink>
-    </w:p>
-    <w:p>
-      <w:pPr>
-        <w:pStyle w:val="Compact"/>
-        <w:numPr>
-          <w:ilvl w:val="0"/>
-          <w:numId w:val="1053"/>
-        </w:numPr>
-      </w:pPr>
-      <w:hyperlink r:id="rId266">
-        <w:r>
-          <w:rPr>
-            <w:rStyle w:val="Hyperlink"/>
-          </w:rPr>
-          <w:t xml:space="preserve">Roadmap / issue #89</w:t>
-        </w:r>
-      </w:hyperlink>
-    </w:p>
-    <w:p>
-      <w:pPr>
-        <w:pStyle w:val="Compact"/>
-        <w:numPr>
-          <w:ilvl w:val="0"/>
-          <w:numId w:val="1053"/>
-        </w:numPr>
-      </w:pPr>
-      <w:hyperlink r:id="rId267">
-        <w:r>
-          <w:rPr>
-            <w:rStyle w:val="Hyperlink"/>
-          </w:rPr>
-          <w:t xml:space="preserve">Roadmap / issue #237</w:t>
-        </w:r>
-      </w:hyperlink>
-    </w:p>
-    <w:p>
-      <w:pPr>
-        <w:pStyle w:val="Compact"/>
-        <w:numPr>
-          <w:ilvl w:val="0"/>
-          <w:numId w:val="1053"/>
-        </w:numPr>
-      </w:pPr>
-      <w:hyperlink r:id="rId268">
-        <w:r>
-          <w:rPr>
-            <w:rStyle w:val="Hyperlink"/>
-          </w:rPr>
-          <w:t xml:space="preserve">Roadmap / issue #238</w:t>
-        </w:r>
-      </w:hyperlink>
-    </w:p>
-    <w:bookmarkEnd w:id="269"/>
-    <w:bookmarkEnd w:id="270"/>
-    <w:bookmarkStart w:id="297" w:name="X652c180441971af10d748777629faef5a37ddb3"/>
-    <w:p>
-      <w:pPr>
-        <w:pStyle w:val="Heading2"/>
-      </w:pPr>
-      <w:r>
-        <w:t xml:space="preserve">30. Longer-term possibilities to develop</w:t>
-      </w:r>
-    </w:p>
-    <w:bookmarkStart w:id="271" w:name="say-29"/>
-    <w:p>
-      <w:pPr>
-        <w:pStyle w:val="Heading3"/>
-      </w:pPr>
-      <w:r>
-        <w:t xml:space="preserve">Say</w:t>
-      </w:r>
-    </w:p>
-    <w:p>
-      <w:pPr>
-        <w:pStyle w:val="FirstParagraph"/>
-      </w:pPr>
-      <w:r>
-        <w:t xml:space="preserve">There are further possibilities beyond the changes to everyday screens. Adventurer ministry has its own program, materials and scope decisions. Wallet passes could build on the web passes that already exist; a native mobile experience would also need its own provider, privacy and offline rules. Merchandise checkout remains on hold, and a camp-store account would be a larger project than today's Orders helper. Surveys, certificates and recorded outcomes could improve follow-up after an event. These items have different levels of detail and different dependencies. They are possibilities on the longer roadmap, not an announcement that everything is approved, scheduled or available now. Donations, fundraising and designated funds are another later track, separate from current church invoicing and the Orders helper.</w:t>
-      </w:r>
-    </w:p>
-    <w:bookmarkEnd w:id="271"/>
-    <w:bookmarkStart w:id="272" w:name="point-to-or-demonstrate-20"/>
-    <w:p>
-      <w:pPr>
-        <w:pStyle w:val="Heading3"/>
-      </w:pPr>
-      <w:r>
-        <w:t xml:space="preserve">Point to or demonstrate</w:t>
-      </w:r>
-    </w:p>
-    <w:p>
-      <w:pPr>
-        <w:pStyle w:val="FirstParagraph"/>
-      </w:pPr>
-      <w:r>
-        <w:t xml:space="preserve">Point to the different status labels. Ask for useful examples of need rather than presenting a delivery schedule. The canonical roadmap remains the source of implementation order.</w:t>
-      </w:r>
-    </w:p>
-    <w:bookmarkEnd w:id="272"/>
-    <w:bookmarkStart w:id="273" w:name="ask-the-group-10"/>
-    <w:p>
-      <w:pPr>
-        <w:pStyle w:val="Heading3"/>
-      </w:pPr>
-      <w:r>
-        <w:t xml:space="preserve">Ask the group</w:t>
-      </w:r>
-    </w:p>
-    <w:p>
-      <w:pPr>
-        <w:pStyle w:val="FirstParagraph"/>
-      </w:pPr>
-      <w:r>
-        <w:t xml:space="preserve">Which future outcome would solve a concrete problem for your club or event team?</w:t>
-      </w:r>
-    </w:p>
-    <w:bookmarkEnd w:id="273"/>
-    <w:bookmarkStart w:id="274" w:name="capability-status-5"/>
-    <w:p>
-      <w:pPr>
-        <w:pStyle w:val="Heading3"/>
-      </w:pPr>
-      <w:r>
-        <w:t xml:space="preserve">Capability status</w:t>
-      </w:r>
-    </w:p>
-    <w:p>
-      <w:pPr>
-        <w:pStyle w:val="FirstParagraph"/>
-      </w:pPr>
-      <w:r>
-        <w:t xml:space="preserve">POSSIBLE. Future scope follows the existing roadmap, decisions and event needs; no delivery dates are set.</w:t>
-      </w:r>
-    </w:p>
-    <w:bookmarkEnd w:id="274"/>
-    <w:bookmarkStart w:id="296" w:name="preparation-references--not-spoken-29"/>
-    <w:p>
-      <w:pPr>
-        <w:pStyle w:val="Heading3"/>
-      </w:pPr>
-      <w:r>
-        <w:t xml:space="preserve">Preparation references — not spoken</w:t>
-      </w:r>
-    </w:p>
-    <w:p>
-      <w:pPr>
-        <w:pStyle w:val="Compact"/>
-        <w:numPr>
-          <w:ilvl w:val="0"/>
-          <w:numId w:val="1054"/>
-        </w:numPr>
-      </w:pPr>
-      <w:hyperlink r:id="rId275">
-        <w:r>
-          <w:rPr>
-            <w:rStyle w:val="Hyperlink"/>
-          </w:rPr>
-          <w:t xml:space="preserve">docs/NEW-CLUB-APPLICATIONS.md</w:t>
-        </w:r>
-      </w:hyperlink>
-    </w:p>
-    <w:p>
-      <w:pPr>
-        <w:pStyle w:val="Compact"/>
-        <w:numPr>
-          <w:ilvl w:val="0"/>
-          <w:numId w:val="1054"/>
-        </w:numPr>
-      </w:pPr>
-      <w:hyperlink r:id="rId276">
-        <w:r>
-          <w:rPr>
-            <w:rStyle w:val="Hyperlink"/>
-          </w:rPr>
-          <w:t xml:space="preserve">docs/ATTENDEE-ACCOUNT-RELEASE.md</w:t>
-        </w:r>
-      </w:hyperlink>
-    </w:p>
-    <w:p>
-      <w:pPr>
-        <w:pStyle w:val="Compact"/>
-        <w:numPr>
-          <w:ilvl w:val="0"/>
-          <w:numId w:val="1054"/>
-        </w:numPr>
-      </w:pPr>
-      <w:hyperlink r:id="rId277">
-        <w:r>
-          <w:rPr>
-            <w:rStyle w:val="Hyperlink"/>
-          </w:rPr>
-          <w:t xml:space="preserve">docs/MERCHANDISE-LEDGER-MIGRATION.md</w:t>
-        </w:r>
-      </w:hyperlink>
-    </w:p>
-    <w:p>
-      <w:pPr>
-        <w:pStyle w:val="Compact"/>
-        <w:numPr>
-          <w:ilvl w:val="0"/>
-          <w:numId w:val="1054"/>
-        </w:numPr>
-      </w:pPr>
-      <w:hyperlink r:id="rId260">
-        <w:r>
-          <w:rPr>
-            <w:rStyle w:val="Hyperlink"/>
-          </w:rPr>
-          <w:t xml:space="preserve">docs/decisions/0011-personnel-pipeline-policy.md</w:t>
-        </w:r>
-      </w:hyperlink>
-    </w:p>
-    <w:p>
-      <w:pPr>
-        <w:pStyle w:val="Compact"/>
-        <w:numPr>
-          <w:ilvl w:val="0"/>
-          <w:numId w:val="1054"/>
-        </w:numPr>
-      </w:pPr>
-      <w:hyperlink r:id="rId226">
-        <w:r>
-          <w:rPr>
-            <w:rStyle w:val="Hyperlink"/>
-          </w:rPr>
-          <w:t xml:space="preserve">Roadmap / issue #98</w:t>
-        </w:r>
-      </w:hyperlink>
-    </w:p>
-    <w:p>
-      <w:pPr>
-        <w:pStyle w:val="Compact"/>
-        <w:numPr>
-          <w:ilvl w:val="0"/>
-          <w:numId w:val="1054"/>
-        </w:numPr>
-      </w:pPr>
-      <w:hyperlink r:id="rId278">
+          <w:numId w:val="1059"/>
+        </w:numPr>
+      </w:pPr>
+      <w:hyperlink r:id="rId299">
         <w:r>
           <w:rPr>
             <w:rStyle w:val="Hyperlink"/>
@@ -4901,10 +5382,10 @@
         <w:pStyle w:val="Compact"/>
         <w:numPr>
           <w:ilvl w:val="0"/>
-          <w:numId w:val="1054"/>
-        </w:numPr>
-      </w:pPr>
-      <w:hyperlink r:id="rId279">
+          <w:numId w:val="1059"/>
+        </w:numPr>
+      </w:pPr>
+      <w:hyperlink r:id="rId300">
         <w:r>
           <w:rPr>
             <w:rStyle w:val="Hyperlink"/>
@@ -4918,10 +5399,10 @@
         <w:pStyle w:val="Compact"/>
         <w:numPr>
           <w:ilvl w:val="0"/>
-          <w:numId w:val="1054"/>
-        </w:numPr>
-      </w:pPr>
-      <w:hyperlink r:id="rId280">
+          <w:numId w:val="1059"/>
+        </w:numPr>
+      </w:pPr>
+      <w:hyperlink r:id="rId301">
         <w:r>
           <w:rPr>
             <w:rStyle w:val="Hyperlink"/>
@@ -4935,10 +5416,10 @@
         <w:pStyle w:val="Compact"/>
         <w:numPr>
           <w:ilvl w:val="0"/>
-          <w:numId w:val="1054"/>
-        </w:numPr>
-      </w:pPr>
-      <w:hyperlink r:id="rId281">
+          <w:numId w:val="1059"/>
+        </w:numPr>
+      </w:pPr>
+      <w:hyperlink r:id="rId302">
         <w:r>
           <w:rPr>
             <w:rStyle w:val="Hyperlink"/>
@@ -4952,10 +5433,10 @@
         <w:pStyle w:val="Compact"/>
         <w:numPr>
           <w:ilvl w:val="0"/>
-          <w:numId w:val="1054"/>
-        </w:numPr>
-      </w:pPr>
-      <w:hyperlink r:id="rId282">
+          <w:numId w:val="1059"/>
+        </w:numPr>
+      </w:pPr>
+      <w:hyperlink r:id="rId303">
         <w:r>
           <w:rPr>
             <w:rStyle w:val="Hyperlink"/>
@@ -4969,10 +5450,10 @@
         <w:pStyle w:val="Compact"/>
         <w:numPr>
           <w:ilvl w:val="0"/>
-          <w:numId w:val="1054"/>
-        </w:numPr>
-      </w:pPr>
-      <w:hyperlink r:id="rId283">
+          <w:numId w:val="1059"/>
+        </w:numPr>
+      </w:pPr>
+      <w:hyperlink r:id="rId304">
         <w:r>
           <w:rPr>
             <w:rStyle w:val="Hyperlink"/>
@@ -4986,10 +5467,10 @@
         <w:pStyle w:val="Compact"/>
         <w:numPr>
           <w:ilvl w:val="0"/>
-          <w:numId w:val="1054"/>
-        </w:numPr>
-      </w:pPr>
-      <w:hyperlink r:id="rId284">
+          <w:numId w:val="1059"/>
+        </w:numPr>
+      </w:pPr>
+      <w:hyperlink r:id="rId305">
         <w:r>
           <w:rPr>
             <w:rStyle w:val="Hyperlink"/>
@@ -5003,10 +5484,10 @@
         <w:pStyle w:val="Compact"/>
         <w:numPr>
           <w:ilvl w:val="0"/>
-          <w:numId w:val="1054"/>
-        </w:numPr>
-      </w:pPr>
-      <w:hyperlink r:id="rId285">
+          <w:numId w:val="1059"/>
+        </w:numPr>
+      </w:pPr>
+      <w:hyperlink r:id="rId306">
         <w:r>
           <w:rPr>
             <w:rStyle w:val="Hyperlink"/>
@@ -5020,10 +5501,10 @@
         <w:pStyle w:val="Compact"/>
         <w:numPr>
           <w:ilvl w:val="0"/>
-          <w:numId w:val="1054"/>
-        </w:numPr>
-      </w:pPr>
-      <w:hyperlink r:id="rId286">
+          <w:numId w:val="1059"/>
+        </w:numPr>
+      </w:pPr>
+      <w:hyperlink r:id="rId307">
         <w:r>
           <w:rPr>
             <w:rStyle w:val="Hyperlink"/>
@@ -5037,10 +5518,10 @@
         <w:pStyle w:val="Compact"/>
         <w:numPr>
           <w:ilvl w:val="0"/>
-          <w:numId w:val="1054"/>
-        </w:numPr>
-      </w:pPr>
-      <w:hyperlink r:id="rId287">
+          <w:numId w:val="1059"/>
+        </w:numPr>
+      </w:pPr>
+      <w:hyperlink r:id="rId308">
         <w:r>
           <w:rPr>
             <w:rStyle w:val="Hyperlink"/>
@@ -5054,10 +5535,10 @@
         <w:pStyle w:val="Compact"/>
         <w:numPr>
           <w:ilvl w:val="0"/>
-          <w:numId w:val="1054"/>
-        </w:numPr>
-      </w:pPr>
-      <w:hyperlink r:id="rId288">
+          <w:numId w:val="1059"/>
+        </w:numPr>
+      </w:pPr>
+      <w:hyperlink r:id="rId309">
         <w:r>
           <w:rPr>
             <w:rStyle w:val="Hyperlink"/>
@@ -5071,10 +5552,10 @@
         <w:pStyle w:val="Compact"/>
         <w:numPr>
           <w:ilvl w:val="0"/>
-          <w:numId w:val="1054"/>
-        </w:numPr>
-      </w:pPr>
-      <w:hyperlink r:id="rId289">
+          <w:numId w:val="1059"/>
+        </w:numPr>
+      </w:pPr>
+      <w:hyperlink r:id="rId310">
         <w:r>
           <w:rPr>
             <w:rStyle w:val="Hyperlink"/>
@@ -5088,10 +5569,10 @@
         <w:pStyle w:val="Compact"/>
         <w:numPr>
           <w:ilvl w:val="0"/>
-          <w:numId w:val="1054"/>
-        </w:numPr>
-      </w:pPr>
-      <w:hyperlink r:id="rId290">
+          <w:numId w:val="1059"/>
+        </w:numPr>
+      </w:pPr>
+      <w:hyperlink r:id="rId311">
         <w:r>
           <w:rPr>
             <w:rStyle w:val="Hyperlink"/>
@@ -5105,10 +5586,10 @@
         <w:pStyle w:val="Compact"/>
         <w:numPr>
           <w:ilvl w:val="0"/>
-          <w:numId w:val="1054"/>
-        </w:numPr>
-      </w:pPr>
-      <w:hyperlink r:id="rId291">
+          <w:numId w:val="1059"/>
+        </w:numPr>
+      </w:pPr>
+      <w:hyperlink r:id="rId312">
         <w:r>
           <w:rPr>
             <w:rStyle w:val="Hyperlink"/>
@@ -5122,10 +5603,10 @@
         <w:pStyle w:val="Compact"/>
         <w:numPr>
           <w:ilvl w:val="0"/>
-          <w:numId w:val="1054"/>
-        </w:numPr>
-      </w:pPr>
-      <w:hyperlink r:id="rId292">
+          <w:numId w:val="1059"/>
+        </w:numPr>
+      </w:pPr>
+      <w:hyperlink r:id="rId313">
         <w:r>
           <w:rPr>
             <w:rStyle w:val="Hyperlink"/>
@@ -5139,10 +5620,10 @@
         <w:pStyle w:val="Compact"/>
         <w:numPr>
           <w:ilvl w:val="0"/>
-          <w:numId w:val="1054"/>
-        </w:numPr>
-      </w:pPr>
-      <w:hyperlink r:id="rId293">
+          <w:numId w:val="1059"/>
+        </w:numPr>
+      </w:pPr>
+      <w:hyperlink r:id="rId314">
         <w:r>
           <w:rPr>
             <w:rStyle w:val="Hyperlink"/>
@@ -5156,10 +5637,10 @@
         <w:pStyle w:val="Compact"/>
         <w:numPr>
           <w:ilvl w:val="0"/>
-          <w:numId w:val="1054"/>
-        </w:numPr>
-      </w:pPr>
-      <w:hyperlink r:id="rId294">
+          <w:numId w:val="1059"/>
+        </w:numPr>
+      </w:pPr>
+      <w:hyperlink r:id="rId315">
         <w:r>
           <w:rPr>
             <w:rStyle w:val="Hyperlink"/>
@@ -5173,10 +5654,10 @@
         <w:pStyle w:val="Compact"/>
         <w:numPr>
           <w:ilvl w:val="0"/>
-          <w:numId w:val="1054"/>
-        </w:numPr>
-      </w:pPr>
-      <w:hyperlink r:id="rId295">
+          <w:numId w:val="1059"/>
+        </w:numPr>
+      </w:pPr>
+      <w:hyperlink r:id="rId316">
         <w:r>
           <w:rPr>
             <w:rStyle w:val="Hyperlink"/>
@@ -5185,18 +5666,18 @@
         </w:r>
       </w:hyperlink>
     </w:p>
-    <w:bookmarkEnd w:id="296"/>
-    <w:bookmarkEnd w:id="297"/>
-    <w:bookmarkStart w:id="303" w:name="X0afc5c14d790d862b4f988b904827637de58660"/>
+    <w:bookmarkEnd w:id="317"/>
+    <w:bookmarkEnd w:id="318"/>
+    <w:bookmarkStart w:id="324" w:name="Xe327cbeea65536ffc75b118ce45df56a5d7e27e"/>
     <w:p>
       <w:pPr>
         <w:pStyle w:val="Heading2"/>
       </w:pPr>
       <w:r>
-        <w:t xml:space="preserve">31. Check the result. Sign out. Return to the same place.</w:t>
-      </w:r>
-    </w:p>
-    <w:bookmarkStart w:id="298" w:name="say-30"/>
+        <w:t xml:space="preserve">33. Check the result. Sign out. Return to the same place.</w:t>
+      </w:r>
+    </w:p>
+    <w:bookmarkStart w:id="319" w:name="say-32"/>
     <w:p>
       <w:pPr>
         <w:pStyle w:val="Heading3"/>
@@ -5213,8 +5694,8 @@
         <w:t xml:space="preserve">The aim is not to memorize every menu. Use your own account, choose the right club or coordinator view and check the result of the work. A saved draft, a submitted report and an event registration confirmation mean different things. Choose one realistic task to practice next: a director can find the roster or a Monthly Record; a coordinator can find a club and read one month. Then choose Sign out, especially on a shared device. Closing a tab is not the same action. Next time, return to events dot imsda dot org and sign in with the account you already have.</w:t>
       </w:r>
     </w:p>
-    <w:bookmarkEnd w:id="298"/>
-    <w:bookmarkStart w:id="299" w:name="ask-the-group-11"/>
+    <w:bookmarkEnd w:id="319"/>
+    <w:bookmarkStart w:id="320" w:name="ask-the-group-13"/>
     <w:p>
       <w:pPr>
         <w:pStyle w:val="Heading3"/>
@@ -5231,8 +5712,8 @@
         <w:t xml:space="preserve">Which one task will you practice first? Use the quick-start handout when you need the steps.</w:t>
       </w:r>
     </w:p>
-    <w:bookmarkEnd w:id="299"/>
-    <w:bookmarkStart w:id="300" w:name="visual-example-24"/>
+    <w:bookmarkEnd w:id="320"/>
+    <w:bookmarkStart w:id="321" w:name="visual-example-27"/>
     <w:p>
       <w:pPr>
         <w:pStyle w:val="Heading3"/>
@@ -5246,7 +5727,7 @@
         <w:pStyle w:val="Compact"/>
         <w:numPr>
           <w:ilvl w:val="0"/>
-          <w:numId w:val="1055"/>
+          <w:numId w:val="1060"/>
         </w:numPr>
       </w:pPr>
       <w:r>
@@ -5258,15 +5739,15 @@
         <w:pStyle w:val="Compact"/>
         <w:numPr>
           <w:ilvl w:val="0"/>
-          <w:numId w:val="1055"/>
+          <w:numId w:val="1060"/>
         </w:numPr>
       </w:pPr>
       <w:r>
         <w:t xml:space="preserve">Use Sign out before leaving: Account Profile and the actual Sign out control in the portal header.</w:t>
       </w:r>
     </w:p>
-    <w:bookmarkEnd w:id="300"/>
-    <w:bookmarkStart w:id="302" w:name="preparation-references--not-spoken-30"/>
+    <w:bookmarkEnd w:id="321"/>
+    <w:bookmarkStart w:id="323" w:name="preparation-references--not-spoken-32"/>
     <w:p>
       <w:pPr>
         <w:pStyle w:val="Heading3"/>
@@ -5280,10 +5761,10 @@
         <w:pStyle w:val="Compact"/>
         <w:numPr>
           <w:ilvl w:val="0"/>
-          <w:numId w:val="1056"/>
-        </w:numPr>
-      </w:pPr>
-      <w:hyperlink r:id="rId301">
+          <w:numId w:val="1061"/>
+        </w:numPr>
+      </w:pPr>
+      <w:hyperlink r:id="rId322">
         <w:r>
           <w:rPr>
             <w:rStyle w:val="Hyperlink"/>
@@ -5297,7 +5778,7 @@
         <w:pStyle w:val="Compact"/>
         <w:numPr>
           <w:ilvl w:val="0"/>
-          <w:numId w:val="1056"/>
+          <w:numId w:val="1061"/>
         </w:numPr>
       </w:pPr>
       <w:hyperlink r:id="rId24">
@@ -5309,9 +5790,9 @@
         </w:r>
       </w:hyperlink>
     </w:p>
-    <w:bookmarkEnd w:id="302"/>
-    <w:bookmarkEnd w:id="303"/>
-    <w:bookmarkEnd w:id="304"/>
+    <w:bookmarkEnd w:id="323"/>
+    <w:bookmarkEnd w:id="324"/>
+    <w:bookmarkEnd w:id="325"/>
     <w:sectPr>
       <w:headerReference r:id="rId9" w:type="default"/>
       <w:footerReference r:id="rId10" w:type="default"/>
@@ -5894,6 +6375,21 @@
     <w:abstractNumId w:val="991"/>
   </w:num>
   <w:num w:numId="1056">
+    <w:abstractNumId w:val="991"/>
+  </w:num>
+  <w:num w:numId="1057">
+    <w:abstractNumId w:val="991"/>
+  </w:num>
+  <w:num w:numId="1058">
+    <w:abstractNumId w:val="991"/>
+  </w:num>
+  <w:num w:numId="1059">
+    <w:abstractNumId w:val="991"/>
+  </w:num>
+  <w:num w:numId="1060">
+    <w:abstractNumId w:val="991"/>
+  </w:num>
+  <w:num w:numId="1061">
     <w:abstractNumId w:val="991"/>
   </w:num>
 </w:numbering>

</xml_diff>